<commit_message>
feat(adas): add environment and traffic ground truth
</commit_message>
<xml_diff>
--- a/docs/ATEP_Volume_VII_ADAS_Engineering_Workbook.docx
+++ b/docs/ATEP_Volume_VII_ADAS_Engineering_Workbook.docx
@@ -19,7 +19,7 @@
         <w:rPr>
           <w:b/>
         </w:rPr>
-        <w:t>Version 0.1.0   VII 1 Deterministic World Model</w:t>
+        <w:t>Version 0.2.0   VII 1 and VII 2 Implemented</w:t>
       </w:r>
     </w:p>
     <w:p>
@@ -93,7 +93,7 @@
           </w:tcPr>
           <w:p>
             <w:r>
-              <w:t>VII-1 implemented and verified</w:t>
+              <w:t>VII-1 and VII-2 implemented and verified</w:t>
             </w:r>
           </w:p>
         </w:tc>
@@ -169,7 +169,7 @@
           </w:tcPr>
           <w:p>
             <w:r>
-              <w:t>VII-2 environment conditions and actor trajectories</w:t>
+              <w:t>VII-3 camera radar and LiDAR sensor simulation</w:t>
             </w:r>
           </w:p>
         </w:tc>
@@ -883,6 +883,52 @@
           <w:p>
             <w:r>
               <w:t>Advance time</w:t>
+            </w:r>
+          </w:p>
+        </w:tc>
+      </w:tr>
+      <w:tr>
+        <w:tc>
+          <w:tcPr>
+            <w:tcW w:type="dxa" w:w="936"/>
+            <w:vAlign w:val="center"/>
+          </w:tcPr>
+          <w:p>
+            <w:r>
+              <w:t>PATCH</w:t>
+            </w:r>
+          </w:p>
+        </w:tc>
+        <w:tc>
+          <w:tcPr>
+            <w:tcW w:type="dxa" w:w="4824"/>
+            <w:vAlign w:val="center"/>
+          </w:tcPr>
+          <w:p>
+            <w:r>
+              <w:t>/vehicles/{vehicle_id}/adas/scenes/{scene_id}/context</w:t>
+            </w:r>
+          </w:p>
+        </w:tc>
+        <w:tc>
+          <w:tcPr>
+            <w:tcW w:type="dxa" w:w="1728"/>
+            <w:vAlign w:val="center"/>
+          </w:tcPr>
+          <w:p>
+            <w:r>
+              <w:t>adas:manage</w:t>
+            </w:r>
+          </w:p>
+        </w:tc>
+        <w:tc>
+          <w:tcPr>
+            <w:tcW w:type="dxa" w:w="1800"/>
+            <w:vAlign w:val="center"/>
+          </w:tcPr>
+          <w:p>
+            <w:r>
+              <w:t>Update environment and traffic controls</w:t>
             </w:r>
           </w:p>
         </w:tc>
@@ -1693,7 +1739,7 @@
         <w:pStyle w:val="ListBullet"/>
       </w:pPr>
       <w:r>
-        <w:t>Migration 0044 follows the Volume VI migration head.</w:t>
+        <w:t>Migrations 0044 and 0045 form one linear ADAS migration history.</w:t>
       </w:r>
     </w:p>
     <w:p>
@@ -1941,7 +1987,7 @@
           </w:tcPr>
           <w:p>
             <w:r>
-              <w:t>Document constant velocity baseline</w:t>
+              <w:t>Constant velocity plus deterministic waypoint trajectories</w:t>
             </w:r>
           </w:p>
         </w:tc>
@@ -1952,7 +1998,272 @@
           </w:tcPr>
           <w:p>
             <w:r>
-              <w:t>Add trajectories in VII-2</w:t>
+              <w:t>Add acceleration profiles after VII-3</w:t>
+            </w:r>
+          </w:p>
+        </w:tc>
+      </w:tr>
+    </w:tbl>
+    <w:p/>
+    <w:p>
+      <w:r>
+        <w:br w:type="page"/>
+      </w:r>
+    </w:p>
+    <w:p>
+      <w:pPr>
+        <w:pStyle w:val="Heading1"/>
+      </w:pPr>
+      <w:r>
+        <w:t>9 Environment Traffic and Trajectories</w:t>
+      </w:r>
+    </w:p>
+    <w:p>
+      <w:r>
+        <w:t>VII-2 extends scene ground truth with bounded weather, precipitation, visibility, illumination, temperature, wind, and road friction. Traffic controls reference known lanes and carry type-specific state. Actor trajectories use ordered absolute logical-time waypoints and deterministic linear interpolation.</w:t>
+      </w:r>
+    </w:p>
+    <w:tbl>
+      <w:tblPr>
+        <w:tblStyle w:val="TableGrid"/>
+        <w:tblW w:type="auto" w:w="0"/>
+        <w:tblLook w:firstColumn="1" w:firstRow="1" w:lastColumn="0" w:lastRow="0" w:noHBand="0" w:noVBand="1" w:val="04A0"/>
+      </w:tblPr>
+      <w:tblGrid>
+        <w:gridCol w:w="3312"/>
+        <w:gridCol w:w="3312"/>
+        <w:gridCol w:w="3312"/>
+      </w:tblGrid>
+      <w:tr>
+        <w:trPr>
+          <w:tblHeader/>
+        </w:trPr>
+        <w:tc>
+          <w:tcPr>
+            <w:tcW w:type="dxa" w:w="2232"/>
+            <w:shd w:fill="17365D"/>
+            <w:vAlign w:val="center"/>
+          </w:tcPr>
+          <w:p>
+            <w:r>
+              <w:rPr>
+                <w:b/>
+                <w:color w:val="FFFFFF"/>
+              </w:rPr>
+              <w:t>Contract</w:t>
+            </w:r>
+          </w:p>
+        </w:tc>
+        <w:tc>
+          <w:tcPr>
+            <w:tcW w:type="dxa" w:w="3960"/>
+            <w:shd w:fill="17365D"/>
+            <w:vAlign w:val="center"/>
+          </w:tcPr>
+          <w:p>
+            <w:r>
+              <w:rPr>
+                <w:b/>
+                <w:color w:val="FFFFFF"/>
+              </w:rPr>
+              <w:t>Control</w:t>
+            </w:r>
+          </w:p>
+        </w:tc>
+        <w:tc>
+          <w:tcPr>
+            <w:tcW w:type="dxa" w:w="3672"/>
+            <w:shd w:fill="17365D"/>
+            <w:vAlign w:val="center"/>
+          </w:tcPr>
+          <w:p>
+            <w:r>
+              <w:rPr>
+                <w:b/>
+                <w:color w:val="FFFFFF"/>
+              </w:rPr>
+              <w:t>Test objective</w:t>
+            </w:r>
+          </w:p>
+        </w:tc>
+      </w:tr>
+      <w:tr>
+        <w:tc>
+          <w:tcPr>
+            <w:tcW w:type="dxa" w:w="2232"/>
+            <w:vAlign w:val="center"/>
+          </w:tcPr>
+          <w:p>
+            <w:r>
+              <w:t>Weather</w:t>
+            </w:r>
+          </w:p>
+        </w:tc>
+        <w:tc>
+          <w:tcPr>
+            <w:tcW w:type="dxa" w:w="3960"/>
+            <w:vAlign w:val="center"/>
+          </w:tcPr>
+          <w:p>
+            <w:r>
+              <w:t>Cross-field precipitation and fog validation</w:t>
+            </w:r>
+          </w:p>
+        </w:tc>
+        <w:tc>
+          <w:tcPr>
+            <w:tcW w:type="dxa" w:w="3672"/>
+            <w:vAlign w:val="center"/>
+          </w:tcPr>
+          <w:p>
+            <w:r>
+              <w:t>Reject inconsistent conditions</w:t>
+            </w:r>
+          </w:p>
+        </w:tc>
+      </w:tr>
+      <w:tr>
+        <w:tc>
+          <w:tcPr>
+            <w:tcW w:type="dxa" w:w="2232"/>
+            <w:shd w:fill="EAF0F7"/>
+            <w:vAlign w:val="center"/>
+          </w:tcPr>
+          <w:p>
+            <w:r>
+              <w:t>Road friction</w:t>
+            </w:r>
+          </w:p>
+        </w:tc>
+        <w:tc>
+          <w:tcPr>
+            <w:tcW w:type="dxa" w:w="3960"/>
+            <w:shd w:fill="EAF0F7"/>
+            <w:vAlign w:val="center"/>
+          </w:tcPr>
+          <w:p>
+            <w:r>
+              <w:t>Coefficient from 0.05 through 1.5</w:t>
+            </w:r>
+          </w:p>
+        </w:tc>
+        <w:tc>
+          <w:tcPr>
+            <w:tcW w:type="dxa" w:w="3672"/>
+            <w:shd w:fill="EAF0F7"/>
+            <w:vAlign w:val="center"/>
+          </w:tcPr>
+          <w:p>
+            <w:r>
+              <w:t>Represent low and high grip safely</w:t>
+            </w:r>
+          </w:p>
+        </w:tc>
+      </w:tr>
+      <w:tr>
+        <w:tc>
+          <w:tcPr>
+            <w:tcW w:type="dxa" w:w="2232"/>
+            <w:vAlign w:val="center"/>
+          </w:tcPr>
+          <w:p>
+            <w:r>
+              <w:t>Traffic control</w:t>
+            </w:r>
+          </w:p>
+        </w:tc>
+        <w:tc>
+          <w:tcPr>
+            <w:tcW w:type="dxa" w:w="3960"/>
+            <w:vAlign w:val="center"/>
+          </w:tcPr>
+          <w:p>
+            <w:r>
+              <w:t>Unique ID and references to existing lanes</w:t>
+            </w:r>
+          </w:p>
+        </w:tc>
+        <w:tc>
+          <w:tcPr>
+            <w:tcW w:type="dxa" w:w="3672"/>
+            <w:vAlign w:val="center"/>
+          </w:tcPr>
+          <w:p>
+            <w:r>
+              <w:t>Prevent ambiguous map truth</w:t>
+            </w:r>
+          </w:p>
+        </w:tc>
+      </w:tr>
+      <w:tr>
+        <w:tc>
+          <w:tcPr>
+            <w:tcW w:type="dxa" w:w="2232"/>
+            <w:shd w:fill="EAF0F7"/>
+            <w:vAlign w:val="center"/>
+          </w:tcPr>
+          <w:p>
+            <w:r>
+              <w:t>Trajectory</w:t>
+            </w:r>
+          </w:p>
+        </w:tc>
+        <w:tc>
+          <w:tcPr>
+            <w:tcW w:type="dxa" w:w="3960"/>
+            <w:shd w:fill="EAF0F7"/>
+            <w:vAlign w:val="center"/>
+          </w:tcPr>
+          <w:p>
+            <w:r>
+              <w:t>Starts at zero with strictly increasing times</w:t>
+            </w:r>
+          </w:p>
+        </w:tc>
+        <w:tc>
+          <w:tcPr>
+            <w:tcW w:type="dxa" w:w="3672"/>
+            <w:shd w:fill="EAF0F7"/>
+            <w:vAlign w:val="center"/>
+          </w:tcPr>
+          <w:p>
+            <w:r>
+              <w:t>Guarantee a valid timeline</w:t>
+            </w:r>
+          </w:p>
+        </w:tc>
+      </w:tr>
+      <w:tr>
+        <w:tc>
+          <w:tcPr>
+            <w:tcW w:type="dxa" w:w="2232"/>
+            <w:vAlign w:val="center"/>
+          </w:tcPr>
+          <w:p>
+            <w:r>
+              <w:t>Context update</w:t>
+            </w:r>
+          </w:p>
+        </w:tc>
+        <w:tc>
+          <w:tcPr>
+            <w:tcW w:type="dxa" w:w="3960"/>
+            <w:vAlign w:val="center"/>
+          </w:tcPr>
+          <w:p>
+            <w:r>
+              <w:t>Expected revision and atomic evidence</w:t>
+            </w:r>
+          </w:p>
+        </w:tc>
+        <w:tc>
+          <w:tcPr>
+            <w:tcW w:type="dxa" w:w="3672"/>
+            <w:vAlign w:val="center"/>
+          </w:tcPr>
+          <w:p>
+            <w:r>
+              <w:t>Prevent lost concurrent updates</w:t>
             </w:r>
           </w:p>
         </w:tc>
@@ -1964,12 +2275,232 @@
         <w:pStyle w:val="Heading1"/>
       </w:pPr>
       <w:r>
-        <w:t>9 Next Development</w:t>
+        <w:t>10 VII 2 Verification Addendum</w:t>
+      </w:r>
+    </w:p>
+    <w:tbl>
+      <w:tblPr>
+        <w:tblStyle w:val="TableGrid"/>
+        <w:tblW w:type="auto" w:w="0"/>
+        <w:tblLook w:firstColumn="1" w:firstRow="1" w:lastColumn="0" w:lastRow="0" w:noHBand="0" w:noVBand="1" w:val="04A0"/>
+      </w:tblPr>
+      <w:tblGrid>
+        <w:gridCol w:w="3312"/>
+        <w:gridCol w:w="3312"/>
+        <w:gridCol w:w="3312"/>
+      </w:tblGrid>
+      <w:tr>
+        <w:trPr>
+          <w:tblHeader/>
+        </w:trPr>
+        <w:tc>
+          <w:tcPr>
+            <w:tcW w:type="dxa" w:w="2232"/>
+            <w:shd w:fill="17365D"/>
+            <w:vAlign w:val="center"/>
+          </w:tcPr>
+          <w:p>
+            <w:r>
+              <w:rPr>
+                <w:b/>
+                <w:color w:val="FFFFFF"/>
+              </w:rPr>
+              <w:t>ID range</w:t>
+            </w:r>
+          </w:p>
+        </w:tc>
+        <w:tc>
+          <w:tcPr>
+            <w:tcW w:type="dxa" w:w="3672"/>
+            <w:shd w:fill="17365D"/>
+            <w:vAlign w:val="center"/>
+          </w:tcPr>
+          <w:p>
+            <w:r>
+              <w:rPr>
+                <w:b/>
+                <w:color w:val="FFFFFF"/>
+              </w:rPr>
+              <w:t>Coverage</w:t>
+            </w:r>
+          </w:p>
+        </w:tc>
+        <w:tc>
+          <w:tcPr>
+            <w:tcW w:type="dxa" w:w="3960"/>
+            <w:shd w:fill="17365D"/>
+            <w:vAlign w:val="center"/>
+          </w:tcPr>
+          <w:p>
+            <w:r>
+              <w:rPr>
+                <w:b/>
+                <w:color w:val="FFFFFF"/>
+              </w:rPr>
+              <w:t>Objective</w:t>
+            </w:r>
+          </w:p>
+        </w:tc>
+      </w:tr>
+      <w:tr>
+        <w:tc>
+          <w:tcPr>
+            <w:tcW w:type="dxa" w:w="2232"/>
+            <w:vAlign w:val="center"/>
+          </w:tcPr>
+          <w:p>
+            <w:r>
+              <w:t>ADAS-T-013 to 014</w:t>
+            </w:r>
+          </w:p>
+        </w:tc>
+        <w:tc>
+          <w:tcPr>
+            <w:tcW w:type="dxa" w:w="3672"/>
+            <w:vAlign w:val="center"/>
+          </w:tcPr>
+          <w:p>
+            <w:r>
+              <w:t>Weather consistency</w:t>
+            </w:r>
+          </w:p>
+        </w:tc>
+        <w:tc>
+          <w:tcPr>
+            <w:tcW w:type="dxa" w:w="3960"/>
+            <w:vAlign w:val="center"/>
+          </w:tcPr>
+          <w:p>
+            <w:r>
+              <w:t>Validate precipitation and visibility rules</w:t>
+            </w:r>
+          </w:p>
+        </w:tc>
+      </w:tr>
+      <w:tr>
+        <w:tc>
+          <w:tcPr>
+            <w:tcW w:type="dxa" w:w="2232"/>
+            <w:shd w:fill="EAF0F7"/>
+            <w:vAlign w:val="center"/>
+          </w:tcPr>
+          <w:p>
+            <w:r>
+              <w:t>ADAS-T-015 to 017</w:t>
+            </w:r>
+          </w:p>
+        </w:tc>
+        <w:tc>
+          <w:tcPr>
+            <w:tcW w:type="dxa" w:w="3672"/>
+            <w:shd w:fill="EAF0F7"/>
+            <w:vAlign w:val="center"/>
+          </w:tcPr>
+          <w:p>
+            <w:r>
+              <w:t>Traffic control contracts</w:t>
+            </w:r>
+          </w:p>
+        </w:tc>
+        <w:tc>
+          <w:tcPr>
+            <w:tcW w:type="dxa" w:w="3960"/>
+            <w:shd w:fill="EAF0F7"/>
+            <w:vAlign w:val="center"/>
+          </w:tcPr>
+          <w:p>
+            <w:r>
+              <w:t>Validate lane references, fields, and identity</w:t>
+            </w:r>
+          </w:p>
+        </w:tc>
+      </w:tr>
+      <w:tr>
+        <w:tc>
+          <w:tcPr>
+            <w:tcW w:type="dxa" w:w="2232"/>
+            <w:vAlign w:val="center"/>
+          </w:tcPr>
+          <w:p>
+            <w:r>
+              <w:t>ADAS-T-018 to 020</w:t>
+            </w:r>
+          </w:p>
+        </w:tc>
+        <w:tc>
+          <w:tcPr>
+            <w:tcW w:type="dxa" w:w="3672"/>
+            <w:vAlign w:val="center"/>
+          </w:tcPr>
+          <w:p>
+            <w:r>
+              <w:t>Trajectory timeline</w:t>
+            </w:r>
+          </w:p>
+        </w:tc>
+        <w:tc>
+          <w:tcPr>
+            <w:tcW w:type="dxa" w:w="3960"/>
+            <w:vAlign w:val="center"/>
+          </w:tcPr>
+          <w:p>
+            <w:r>
+              <w:t>Validate ordering, interpolation, and terminal motion</w:t>
+            </w:r>
+          </w:p>
+        </w:tc>
+      </w:tr>
+      <w:tr>
+        <w:tc>
+          <w:tcPr>
+            <w:tcW w:type="dxa" w:w="2232"/>
+            <w:shd w:fill="EAF0F7"/>
+            <w:vAlign w:val="center"/>
+          </w:tcPr>
+          <w:p>
+            <w:r>
+              <w:t>ADAS-T-021 to 022</w:t>
+            </w:r>
+          </w:p>
+        </w:tc>
+        <w:tc>
+          <w:tcPr>
+            <w:tcW w:type="dxa" w:w="3672"/>
+            <w:shd w:fill="EAF0F7"/>
+            <w:vAlign w:val="center"/>
+          </w:tcPr>
+          <w:p>
+            <w:r>
+              <w:t>Context mutation</w:t>
+            </w:r>
+          </w:p>
+        </w:tc>
+        <w:tc>
+          <w:tcPr>
+            <w:tcW w:type="dxa" w:w="3960"/>
+            <w:shd w:fill="EAF0F7"/>
+            <w:vAlign w:val="center"/>
+          </w:tcPr>
+          <w:p>
+            <w:r>
+              <w:t>Validate concurrency, audit, and event evidence</w:t>
+            </w:r>
+          </w:p>
+        </w:tc>
+      </w:tr>
+    </w:tbl>
+    <w:p/>
+    <w:p>
+      <w:pPr>
+        <w:pStyle w:val="Heading1"/>
+      </w:pPr>
+      <w:r>
+        <w:t>11 Next Development</w:t>
       </w:r>
     </w:p>
     <w:p>
       <w:r>
-        <w:t>VII-2 will add deterministic weather, illumination, visibility, road friction, traffic signs, traffic lights, and actor trajectories without mixing sensor output into ground truth.</w:t>
+        <w:t>VII-3 will add camera, radar, and LiDAR observation models with deterministic noise, latency, range, field of view, and occlusion without changing scene ground truth.</w:t>
       </w:r>
     </w:p>
     <w:p>
@@ -1977,7 +2508,7 @@
         <w:pStyle w:val="Heading1"/>
       </w:pPr>
       <w:r>
-        <w:t>10 Study Exercises</w:t>
+        <w:t>12 Study Exercises</w:t>
       </w:r>
     </w:p>
     <w:p>

</xml_diff>

<commit_message>
feat(adas): add environment and traffic ground truth (#84)
</commit_message>
<xml_diff>
--- a/docs/ATEP_Volume_VII_ADAS_Engineering_Workbook.docx
+++ b/docs/ATEP_Volume_VII_ADAS_Engineering_Workbook.docx
@@ -19,7 +19,7 @@
         <w:rPr>
           <w:b/>
         </w:rPr>
-        <w:t>Version 0.1.0   VII 1 Deterministic World Model</w:t>
+        <w:t>Version 0.2.0   VII 1 and VII 2 Implemented</w:t>
       </w:r>
     </w:p>
     <w:p>
@@ -93,7 +93,7 @@
           </w:tcPr>
           <w:p>
             <w:r>
-              <w:t>VII-1 implemented and verified</w:t>
+              <w:t>VII-1 and VII-2 implemented and verified</w:t>
             </w:r>
           </w:p>
         </w:tc>
@@ -169,7 +169,7 @@
           </w:tcPr>
           <w:p>
             <w:r>
-              <w:t>VII-2 environment conditions and actor trajectories</w:t>
+              <w:t>VII-3 camera radar and LiDAR sensor simulation</w:t>
             </w:r>
           </w:p>
         </w:tc>
@@ -883,6 +883,52 @@
           <w:p>
             <w:r>
               <w:t>Advance time</w:t>
+            </w:r>
+          </w:p>
+        </w:tc>
+      </w:tr>
+      <w:tr>
+        <w:tc>
+          <w:tcPr>
+            <w:tcW w:type="dxa" w:w="936"/>
+            <w:vAlign w:val="center"/>
+          </w:tcPr>
+          <w:p>
+            <w:r>
+              <w:t>PATCH</w:t>
+            </w:r>
+          </w:p>
+        </w:tc>
+        <w:tc>
+          <w:tcPr>
+            <w:tcW w:type="dxa" w:w="4824"/>
+            <w:vAlign w:val="center"/>
+          </w:tcPr>
+          <w:p>
+            <w:r>
+              <w:t>/vehicles/{vehicle_id}/adas/scenes/{scene_id}/context</w:t>
+            </w:r>
+          </w:p>
+        </w:tc>
+        <w:tc>
+          <w:tcPr>
+            <w:tcW w:type="dxa" w:w="1728"/>
+            <w:vAlign w:val="center"/>
+          </w:tcPr>
+          <w:p>
+            <w:r>
+              <w:t>adas:manage</w:t>
+            </w:r>
+          </w:p>
+        </w:tc>
+        <w:tc>
+          <w:tcPr>
+            <w:tcW w:type="dxa" w:w="1800"/>
+            <w:vAlign w:val="center"/>
+          </w:tcPr>
+          <w:p>
+            <w:r>
+              <w:t>Update environment and traffic controls</w:t>
             </w:r>
           </w:p>
         </w:tc>
@@ -1693,7 +1739,7 @@
         <w:pStyle w:val="ListBullet"/>
       </w:pPr>
       <w:r>
-        <w:t>Migration 0044 follows the Volume VI migration head.</w:t>
+        <w:t>Migrations 0044 and 0045 form one linear ADAS migration history.</w:t>
       </w:r>
     </w:p>
     <w:p>
@@ -1941,7 +1987,7 @@
           </w:tcPr>
           <w:p>
             <w:r>
-              <w:t>Document constant velocity baseline</w:t>
+              <w:t>Constant velocity plus deterministic waypoint trajectories</w:t>
             </w:r>
           </w:p>
         </w:tc>
@@ -1952,7 +1998,272 @@
           </w:tcPr>
           <w:p>
             <w:r>
-              <w:t>Add trajectories in VII-2</w:t>
+              <w:t>Add acceleration profiles after VII-3</w:t>
+            </w:r>
+          </w:p>
+        </w:tc>
+      </w:tr>
+    </w:tbl>
+    <w:p/>
+    <w:p>
+      <w:r>
+        <w:br w:type="page"/>
+      </w:r>
+    </w:p>
+    <w:p>
+      <w:pPr>
+        <w:pStyle w:val="Heading1"/>
+      </w:pPr>
+      <w:r>
+        <w:t>9 Environment Traffic and Trajectories</w:t>
+      </w:r>
+    </w:p>
+    <w:p>
+      <w:r>
+        <w:t>VII-2 extends scene ground truth with bounded weather, precipitation, visibility, illumination, temperature, wind, and road friction. Traffic controls reference known lanes and carry type-specific state. Actor trajectories use ordered absolute logical-time waypoints and deterministic linear interpolation.</w:t>
+      </w:r>
+    </w:p>
+    <w:tbl>
+      <w:tblPr>
+        <w:tblStyle w:val="TableGrid"/>
+        <w:tblW w:type="auto" w:w="0"/>
+        <w:tblLook w:firstColumn="1" w:firstRow="1" w:lastColumn="0" w:lastRow="0" w:noHBand="0" w:noVBand="1" w:val="04A0"/>
+      </w:tblPr>
+      <w:tblGrid>
+        <w:gridCol w:w="3312"/>
+        <w:gridCol w:w="3312"/>
+        <w:gridCol w:w="3312"/>
+      </w:tblGrid>
+      <w:tr>
+        <w:trPr>
+          <w:tblHeader/>
+        </w:trPr>
+        <w:tc>
+          <w:tcPr>
+            <w:tcW w:type="dxa" w:w="2232"/>
+            <w:shd w:fill="17365D"/>
+            <w:vAlign w:val="center"/>
+          </w:tcPr>
+          <w:p>
+            <w:r>
+              <w:rPr>
+                <w:b/>
+                <w:color w:val="FFFFFF"/>
+              </w:rPr>
+              <w:t>Contract</w:t>
+            </w:r>
+          </w:p>
+        </w:tc>
+        <w:tc>
+          <w:tcPr>
+            <w:tcW w:type="dxa" w:w="3960"/>
+            <w:shd w:fill="17365D"/>
+            <w:vAlign w:val="center"/>
+          </w:tcPr>
+          <w:p>
+            <w:r>
+              <w:rPr>
+                <w:b/>
+                <w:color w:val="FFFFFF"/>
+              </w:rPr>
+              <w:t>Control</w:t>
+            </w:r>
+          </w:p>
+        </w:tc>
+        <w:tc>
+          <w:tcPr>
+            <w:tcW w:type="dxa" w:w="3672"/>
+            <w:shd w:fill="17365D"/>
+            <w:vAlign w:val="center"/>
+          </w:tcPr>
+          <w:p>
+            <w:r>
+              <w:rPr>
+                <w:b/>
+                <w:color w:val="FFFFFF"/>
+              </w:rPr>
+              <w:t>Test objective</w:t>
+            </w:r>
+          </w:p>
+        </w:tc>
+      </w:tr>
+      <w:tr>
+        <w:tc>
+          <w:tcPr>
+            <w:tcW w:type="dxa" w:w="2232"/>
+            <w:vAlign w:val="center"/>
+          </w:tcPr>
+          <w:p>
+            <w:r>
+              <w:t>Weather</w:t>
+            </w:r>
+          </w:p>
+        </w:tc>
+        <w:tc>
+          <w:tcPr>
+            <w:tcW w:type="dxa" w:w="3960"/>
+            <w:vAlign w:val="center"/>
+          </w:tcPr>
+          <w:p>
+            <w:r>
+              <w:t>Cross-field precipitation and fog validation</w:t>
+            </w:r>
+          </w:p>
+        </w:tc>
+        <w:tc>
+          <w:tcPr>
+            <w:tcW w:type="dxa" w:w="3672"/>
+            <w:vAlign w:val="center"/>
+          </w:tcPr>
+          <w:p>
+            <w:r>
+              <w:t>Reject inconsistent conditions</w:t>
+            </w:r>
+          </w:p>
+        </w:tc>
+      </w:tr>
+      <w:tr>
+        <w:tc>
+          <w:tcPr>
+            <w:tcW w:type="dxa" w:w="2232"/>
+            <w:shd w:fill="EAF0F7"/>
+            <w:vAlign w:val="center"/>
+          </w:tcPr>
+          <w:p>
+            <w:r>
+              <w:t>Road friction</w:t>
+            </w:r>
+          </w:p>
+        </w:tc>
+        <w:tc>
+          <w:tcPr>
+            <w:tcW w:type="dxa" w:w="3960"/>
+            <w:shd w:fill="EAF0F7"/>
+            <w:vAlign w:val="center"/>
+          </w:tcPr>
+          <w:p>
+            <w:r>
+              <w:t>Coefficient from 0.05 through 1.5</w:t>
+            </w:r>
+          </w:p>
+        </w:tc>
+        <w:tc>
+          <w:tcPr>
+            <w:tcW w:type="dxa" w:w="3672"/>
+            <w:shd w:fill="EAF0F7"/>
+            <w:vAlign w:val="center"/>
+          </w:tcPr>
+          <w:p>
+            <w:r>
+              <w:t>Represent low and high grip safely</w:t>
+            </w:r>
+          </w:p>
+        </w:tc>
+      </w:tr>
+      <w:tr>
+        <w:tc>
+          <w:tcPr>
+            <w:tcW w:type="dxa" w:w="2232"/>
+            <w:vAlign w:val="center"/>
+          </w:tcPr>
+          <w:p>
+            <w:r>
+              <w:t>Traffic control</w:t>
+            </w:r>
+          </w:p>
+        </w:tc>
+        <w:tc>
+          <w:tcPr>
+            <w:tcW w:type="dxa" w:w="3960"/>
+            <w:vAlign w:val="center"/>
+          </w:tcPr>
+          <w:p>
+            <w:r>
+              <w:t>Unique ID and references to existing lanes</w:t>
+            </w:r>
+          </w:p>
+        </w:tc>
+        <w:tc>
+          <w:tcPr>
+            <w:tcW w:type="dxa" w:w="3672"/>
+            <w:vAlign w:val="center"/>
+          </w:tcPr>
+          <w:p>
+            <w:r>
+              <w:t>Prevent ambiguous map truth</w:t>
+            </w:r>
+          </w:p>
+        </w:tc>
+      </w:tr>
+      <w:tr>
+        <w:tc>
+          <w:tcPr>
+            <w:tcW w:type="dxa" w:w="2232"/>
+            <w:shd w:fill="EAF0F7"/>
+            <w:vAlign w:val="center"/>
+          </w:tcPr>
+          <w:p>
+            <w:r>
+              <w:t>Trajectory</w:t>
+            </w:r>
+          </w:p>
+        </w:tc>
+        <w:tc>
+          <w:tcPr>
+            <w:tcW w:type="dxa" w:w="3960"/>
+            <w:shd w:fill="EAF0F7"/>
+            <w:vAlign w:val="center"/>
+          </w:tcPr>
+          <w:p>
+            <w:r>
+              <w:t>Starts at zero with strictly increasing times</w:t>
+            </w:r>
+          </w:p>
+        </w:tc>
+        <w:tc>
+          <w:tcPr>
+            <w:tcW w:type="dxa" w:w="3672"/>
+            <w:shd w:fill="EAF0F7"/>
+            <w:vAlign w:val="center"/>
+          </w:tcPr>
+          <w:p>
+            <w:r>
+              <w:t>Guarantee a valid timeline</w:t>
+            </w:r>
+          </w:p>
+        </w:tc>
+      </w:tr>
+      <w:tr>
+        <w:tc>
+          <w:tcPr>
+            <w:tcW w:type="dxa" w:w="2232"/>
+            <w:vAlign w:val="center"/>
+          </w:tcPr>
+          <w:p>
+            <w:r>
+              <w:t>Context update</w:t>
+            </w:r>
+          </w:p>
+        </w:tc>
+        <w:tc>
+          <w:tcPr>
+            <w:tcW w:type="dxa" w:w="3960"/>
+            <w:vAlign w:val="center"/>
+          </w:tcPr>
+          <w:p>
+            <w:r>
+              <w:t>Expected revision and atomic evidence</w:t>
+            </w:r>
+          </w:p>
+        </w:tc>
+        <w:tc>
+          <w:tcPr>
+            <w:tcW w:type="dxa" w:w="3672"/>
+            <w:vAlign w:val="center"/>
+          </w:tcPr>
+          <w:p>
+            <w:r>
+              <w:t>Prevent lost concurrent updates</w:t>
             </w:r>
           </w:p>
         </w:tc>
@@ -1964,12 +2275,232 @@
         <w:pStyle w:val="Heading1"/>
       </w:pPr>
       <w:r>
-        <w:t>9 Next Development</w:t>
+        <w:t>10 VII 2 Verification Addendum</w:t>
+      </w:r>
+    </w:p>
+    <w:tbl>
+      <w:tblPr>
+        <w:tblStyle w:val="TableGrid"/>
+        <w:tblW w:type="auto" w:w="0"/>
+        <w:tblLook w:firstColumn="1" w:firstRow="1" w:lastColumn="0" w:lastRow="0" w:noHBand="0" w:noVBand="1" w:val="04A0"/>
+      </w:tblPr>
+      <w:tblGrid>
+        <w:gridCol w:w="3312"/>
+        <w:gridCol w:w="3312"/>
+        <w:gridCol w:w="3312"/>
+      </w:tblGrid>
+      <w:tr>
+        <w:trPr>
+          <w:tblHeader/>
+        </w:trPr>
+        <w:tc>
+          <w:tcPr>
+            <w:tcW w:type="dxa" w:w="2232"/>
+            <w:shd w:fill="17365D"/>
+            <w:vAlign w:val="center"/>
+          </w:tcPr>
+          <w:p>
+            <w:r>
+              <w:rPr>
+                <w:b/>
+                <w:color w:val="FFFFFF"/>
+              </w:rPr>
+              <w:t>ID range</w:t>
+            </w:r>
+          </w:p>
+        </w:tc>
+        <w:tc>
+          <w:tcPr>
+            <w:tcW w:type="dxa" w:w="3672"/>
+            <w:shd w:fill="17365D"/>
+            <w:vAlign w:val="center"/>
+          </w:tcPr>
+          <w:p>
+            <w:r>
+              <w:rPr>
+                <w:b/>
+                <w:color w:val="FFFFFF"/>
+              </w:rPr>
+              <w:t>Coverage</w:t>
+            </w:r>
+          </w:p>
+        </w:tc>
+        <w:tc>
+          <w:tcPr>
+            <w:tcW w:type="dxa" w:w="3960"/>
+            <w:shd w:fill="17365D"/>
+            <w:vAlign w:val="center"/>
+          </w:tcPr>
+          <w:p>
+            <w:r>
+              <w:rPr>
+                <w:b/>
+                <w:color w:val="FFFFFF"/>
+              </w:rPr>
+              <w:t>Objective</w:t>
+            </w:r>
+          </w:p>
+        </w:tc>
+      </w:tr>
+      <w:tr>
+        <w:tc>
+          <w:tcPr>
+            <w:tcW w:type="dxa" w:w="2232"/>
+            <w:vAlign w:val="center"/>
+          </w:tcPr>
+          <w:p>
+            <w:r>
+              <w:t>ADAS-T-013 to 014</w:t>
+            </w:r>
+          </w:p>
+        </w:tc>
+        <w:tc>
+          <w:tcPr>
+            <w:tcW w:type="dxa" w:w="3672"/>
+            <w:vAlign w:val="center"/>
+          </w:tcPr>
+          <w:p>
+            <w:r>
+              <w:t>Weather consistency</w:t>
+            </w:r>
+          </w:p>
+        </w:tc>
+        <w:tc>
+          <w:tcPr>
+            <w:tcW w:type="dxa" w:w="3960"/>
+            <w:vAlign w:val="center"/>
+          </w:tcPr>
+          <w:p>
+            <w:r>
+              <w:t>Validate precipitation and visibility rules</w:t>
+            </w:r>
+          </w:p>
+        </w:tc>
+      </w:tr>
+      <w:tr>
+        <w:tc>
+          <w:tcPr>
+            <w:tcW w:type="dxa" w:w="2232"/>
+            <w:shd w:fill="EAF0F7"/>
+            <w:vAlign w:val="center"/>
+          </w:tcPr>
+          <w:p>
+            <w:r>
+              <w:t>ADAS-T-015 to 017</w:t>
+            </w:r>
+          </w:p>
+        </w:tc>
+        <w:tc>
+          <w:tcPr>
+            <w:tcW w:type="dxa" w:w="3672"/>
+            <w:shd w:fill="EAF0F7"/>
+            <w:vAlign w:val="center"/>
+          </w:tcPr>
+          <w:p>
+            <w:r>
+              <w:t>Traffic control contracts</w:t>
+            </w:r>
+          </w:p>
+        </w:tc>
+        <w:tc>
+          <w:tcPr>
+            <w:tcW w:type="dxa" w:w="3960"/>
+            <w:shd w:fill="EAF0F7"/>
+            <w:vAlign w:val="center"/>
+          </w:tcPr>
+          <w:p>
+            <w:r>
+              <w:t>Validate lane references, fields, and identity</w:t>
+            </w:r>
+          </w:p>
+        </w:tc>
+      </w:tr>
+      <w:tr>
+        <w:tc>
+          <w:tcPr>
+            <w:tcW w:type="dxa" w:w="2232"/>
+            <w:vAlign w:val="center"/>
+          </w:tcPr>
+          <w:p>
+            <w:r>
+              <w:t>ADAS-T-018 to 020</w:t>
+            </w:r>
+          </w:p>
+        </w:tc>
+        <w:tc>
+          <w:tcPr>
+            <w:tcW w:type="dxa" w:w="3672"/>
+            <w:vAlign w:val="center"/>
+          </w:tcPr>
+          <w:p>
+            <w:r>
+              <w:t>Trajectory timeline</w:t>
+            </w:r>
+          </w:p>
+        </w:tc>
+        <w:tc>
+          <w:tcPr>
+            <w:tcW w:type="dxa" w:w="3960"/>
+            <w:vAlign w:val="center"/>
+          </w:tcPr>
+          <w:p>
+            <w:r>
+              <w:t>Validate ordering, interpolation, and terminal motion</w:t>
+            </w:r>
+          </w:p>
+        </w:tc>
+      </w:tr>
+      <w:tr>
+        <w:tc>
+          <w:tcPr>
+            <w:tcW w:type="dxa" w:w="2232"/>
+            <w:shd w:fill="EAF0F7"/>
+            <w:vAlign w:val="center"/>
+          </w:tcPr>
+          <w:p>
+            <w:r>
+              <w:t>ADAS-T-021 to 022</w:t>
+            </w:r>
+          </w:p>
+        </w:tc>
+        <w:tc>
+          <w:tcPr>
+            <w:tcW w:type="dxa" w:w="3672"/>
+            <w:shd w:fill="EAF0F7"/>
+            <w:vAlign w:val="center"/>
+          </w:tcPr>
+          <w:p>
+            <w:r>
+              <w:t>Context mutation</w:t>
+            </w:r>
+          </w:p>
+        </w:tc>
+        <w:tc>
+          <w:tcPr>
+            <w:tcW w:type="dxa" w:w="3960"/>
+            <w:shd w:fill="EAF0F7"/>
+            <w:vAlign w:val="center"/>
+          </w:tcPr>
+          <w:p>
+            <w:r>
+              <w:t>Validate concurrency, audit, and event evidence</w:t>
+            </w:r>
+          </w:p>
+        </w:tc>
+      </w:tr>
+    </w:tbl>
+    <w:p/>
+    <w:p>
+      <w:pPr>
+        <w:pStyle w:val="Heading1"/>
+      </w:pPr>
+      <w:r>
+        <w:t>11 Next Development</w:t>
       </w:r>
     </w:p>
     <w:p>
       <w:r>
-        <w:t>VII-2 will add deterministic weather, illumination, visibility, road friction, traffic signs, traffic lights, and actor trajectories without mixing sensor output into ground truth.</w:t>
+        <w:t>VII-3 will add camera, radar, and LiDAR observation models with deterministic noise, latency, range, field of view, and occlusion without changing scene ground truth.</w:t>
       </w:r>
     </w:p>
     <w:p>
@@ -1977,7 +2508,7 @@
         <w:pStyle w:val="Heading1"/>
       </w:pPr>
       <w:r>
-        <w:t>10 Study Exercises</w:t>
+        <w:t>12 Study Exercises</w:t>
       </w:r>
     </w:p>
     <w:p>

</xml_diff>

<commit_message>
feat(adas): add deterministic sensor simulation
</commit_message>
<xml_diff>
--- a/docs/ATEP_Volume_VII_ADAS_Engineering_Workbook.docx
+++ b/docs/ATEP_Volume_VII_ADAS_Engineering_Workbook.docx
@@ -19,7 +19,7 @@
         <w:rPr>
           <w:b/>
         </w:rPr>
-        <w:t>Version 0.2.0   VII 1 and VII 2 Implemented</w:t>
+        <w:t>Version 0.3.0   VII 1 through VII 3 Implemented</w:t>
       </w:r>
     </w:p>
     <w:p>
@@ -93,7 +93,7 @@
           </w:tcPr>
           <w:p>
             <w:r>
-              <w:t>VII-1 and VII-2 implemented and verified</w:t>
+              <w:t>VII-1 through VII-3 implemented and verified</w:t>
             </w:r>
           </w:p>
         </w:tc>
@@ -169,7 +169,7 @@
           </w:tcPr>
           <w:p>
             <w:r>
-              <w:t>VII-3 camera radar and LiDAR sensor simulation</w:t>
+              <w:t>VII-4 perception and ground truth scoring</w:t>
             </w:r>
           </w:p>
         </w:tc>
@@ -1739,7 +1739,7 @@
         <w:pStyle w:val="ListBullet"/>
       </w:pPr>
       <w:r>
-        <w:t>Migrations 0044 and 0045 form one linear ADAS migration history.</w:t>
+        <w:t>Migrations 0044 through 0046 form one linear ADAS migration history.</w:t>
       </w:r>
     </w:p>
     <w:p>
@@ -2495,12 +2495,492 @@
         <w:pStyle w:val="Heading1"/>
       </w:pPr>
       <w:r>
-        <w:t>11 Next Development</w:t>
+        <w:t>11 Deterministic Sensor Simulation</w:t>
       </w:r>
     </w:p>
     <w:p>
       <w:r>
-        <w:t>VII-3 will add camera, radar, and LiDAR observation models with deterministic noise, latency, range, field of view, and occlusion without changing scene ground truth.</w:t>
+        <w:t>VII-3 adds persisted camera, radar, and LiDAR configurations and observations. Every observation identifies its scene revision, captured logical time, latency-adjusted observation time, and deterministic seed while leaving scene ground truth unchanged.</w:t>
+      </w:r>
+    </w:p>
+    <w:tbl>
+      <w:tblPr>
+        <w:tblStyle w:val="TableGrid"/>
+        <w:tblW w:type="auto" w:w="0"/>
+        <w:tblLook w:firstColumn="1" w:firstRow="1" w:lastColumn="0" w:lastRow="0" w:noHBand="0" w:noVBand="1" w:val="04A0"/>
+      </w:tblPr>
+      <w:tblGrid>
+        <w:gridCol w:w="3312"/>
+        <w:gridCol w:w="3312"/>
+        <w:gridCol w:w="3312"/>
+      </w:tblGrid>
+      <w:tr>
+        <w:trPr>
+          <w:tblHeader/>
+        </w:trPr>
+        <w:tc>
+          <w:tcPr>
+            <w:tcW w:type="dxa" w:w="2016"/>
+            <w:shd w:fill="17365D"/>
+            <w:vAlign w:val="center"/>
+          </w:tcPr>
+          <w:p>
+            <w:r>
+              <w:rPr>
+                <w:b/>
+                <w:color w:val="FFFFFF"/>
+              </w:rPr>
+              <w:t>Mechanism</w:t>
+            </w:r>
+          </w:p>
+        </w:tc>
+        <w:tc>
+          <w:tcPr>
+            <w:tcW w:type="dxa" w:w="4176"/>
+            <w:shd w:fill="17365D"/>
+            <w:vAlign w:val="center"/>
+          </w:tcPr>
+          <w:p>
+            <w:r>
+              <w:rPr>
+                <w:b/>
+                <w:color w:val="FFFFFF"/>
+              </w:rPr>
+              <w:t>Implementation</w:t>
+            </w:r>
+          </w:p>
+        </w:tc>
+        <w:tc>
+          <w:tcPr>
+            <w:tcW w:type="dxa" w:w="3672"/>
+            <w:shd w:fill="17365D"/>
+            <w:vAlign w:val="center"/>
+          </w:tcPr>
+          <w:p>
+            <w:r>
+              <w:rPr>
+                <w:b/>
+                <w:color w:val="FFFFFF"/>
+              </w:rPr>
+              <w:t>Verification objective</w:t>
+            </w:r>
+          </w:p>
+        </w:tc>
+      </w:tr>
+      <w:tr>
+        <w:tc>
+          <w:tcPr>
+            <w:tcW w:type="dxa" w:w="2016"/>
+            <w:vAlign w:val="center"/>
+          </w:tcPr>
+          <w:p>
+            <w:r>
+              <w:t>Geometry</w:t>
+            </w:r>
+          </w:p>
+        </w:tc>
+        <w:tc>
+          <w:tcPr>
+            <w:tcW w:type="dxa" w:w="4176"/>
+            <w:vAlign w:val="center"/>
+          </w:tcPr>
+          <w:p>
+            <w:r>
+              <w:t>Mount pose, yaw, range, and horizontal field of view</w:t>
+            </w:r>
+          </w:p>
+        </w:tc>
+        <w:tc>
+          <w:tcPr>
+            <w:tcW w:type="dxa" w:w="3672"/>
+            <w:vAlign w:val="center"/>
+          </w:tcPr>
+          <w:p>
+            <w:r>
+              <w:t>Exclude actors outside the sensor envelope</w:t>
+            </w:r>
+          </w:p>
+        </w:tc>
+      </w:tr>
+      <w:tr>
+        <w:tc>
+          <w:tcPr>
+            <w:tcW w:type="dxa" w:w="2016"/>
+            <w:shd w:fill="EAF0F7"/>
+            <w:vAlign w:val="center"/>
+          </w:tcPr>
+          <w:p>
+            <w:r>
+              <w:t>Occlusion</w:t>
+            </w:r>
+          </w:p>
+        </w:tc>
+        <w:tc>
+          <w:tcPr>
+            <w:tcW w:type="dxa" w:w="4176"/>
+            <w:shd w:fill="EAF0F7"/>
+            <w:vAlign w:val="center"/>
+          </w:tcPr>
+          <w:p>
+            <w:r>
+              <w:t>Near-to-far angular coverage</w:t>
+            </w:r>
+          </w:p>
+        </w:tc>
+        <w:tc>
+          <w:tcPr>
+            <w:tcW w:type="dxa" w:w="3672"/>
+            <w:shd w:fill="EAF0F7"/>
+            <w:vAlign w:val="center"/>
+          </w:tcPr>
+          <w:p>
+            <w:r>
+              <w:t>Hide aligned actors behind nearer actors</w:t>
+            </w:r>
+          </w:p>
+        </w:tc>
+      </w:tr>
+      <w:tr>
+        <w:tc>
+          <w:tcPr>
+            <w:tcW w:type="dxa" w:w="2016"/>
+            <w:vAlign w:val="center"/>
+          </w:tcPr>
+          <w:p>
+            <w:r>
+              <w:t>Noise</w:t>
+            </w:r>
+          </w:p>
+        </w:tc>
+        <w:tc>
+          <w:tcPr>
+            <w:tcW w:type="dxa" w:w="4176"/>
+            <w:vAlign w:val="center"/>
+          </w:tcPr>
+          <w:p>
+            <w:r>
+              <w:t>SHA-256 seed-derived bounded position offsets</w:t>
+            </w:r>
+          </w:p>
+        </w:tc>
+        <w:tc>
+          <w:tcPr>
+            <w:tcW w:type="dxa" w:w="3672"/>
+            <w:vAlign w:val="center"/>
+          </w:tcPr>
+          <w:p>
+            <w:r>
+              <w:t>Reproduce identical detections</w:t>
+            </w:r>
+          </w:p>
+        </w:tc>
+      </w:tr>
+      <w:tr>
+        <w:tc>
+          <w:tcPr>
+            <w:tcW w:type="dxa" w:w="2016"/>
+            <w:shd w:fill="EAF0F7"/>
+            <w:vAlign w:val="center"/>
+          </w:tcPr>
+          <w:p>
+            <w:r>
+              <w:t>Environment</w:t>
+            </w:r>
+          </w:p>
+        </w:tc>
+        <w:tc>
+          <w:tcPr>
+            <w:tcW w:type="dxa" w:w="4176"/>
+            <w:shd w:fill="EAF0F7"/>
+            <w:vAlign w:val="center"/>
+          </w:tcPr>
+          <w:p>
+            <w:r>
+              <w:t>Visibility range and sensor-sensitive confidence</w:t>
+            </w:r>
+          </w:p>
+        </w:tc>
+        <w:tc>
+          <w:tcPr>
+            <w:tcW w:type="dxa" w:w="3672"/>
+            <w:shd w:fill="EAF0F7"/>
+            <w:vAlign w:val="center"/>
+          </w:tcPr>
+          <w:p>
+            <w:r>
+              <w:t>Represent rain, fog, snow, and low light</w:t>
+            </w:r>
+          </w:p>
+        </w:tc>
+      </w:tr>
+      <w:tr>
+        <w:tc>
+          <w:tcPr>
+            <w:tcW w:type="dxa" w:w="2016"/>
+            <w:vAlign w:val="center"/>
+          </w:tcPr>
+          <w:p>
+            <w:r>
+              <w:t>Evidence</w:t>
+            </w:r>
+          </w:p>
+        </w:tc>
+        <w:tc>
+          <w:tcPr>
+            <w:tcW w:type="dxa" w:w="4176"/>
+            <w:vAlign w:val="center"/>
+          </w:tcPr>
+          <w:p>
+            <w:r>
+              <w:t>Persisted observation plus minimized audit and outbox event</w:t>
+            </w:r>
+          </w:p>
+        </w:tc>
+        <w:tc>
+          <w:tcPr>
+            <w:tcW w:type="dxa" w:w="3672"/>
+            <w:vAlign w:val="center"/>
+          </w:tcPr>
+          <w:p>
+            <w:r>
+              <w:t>Retain traceability without event bloat</w:t>
+            </w:r>
+          </w:p>
+        </w:tc>
+      </w:tr>
+    </w:tbl>
+    <w:p/>
+    <w:p>
+      <w:pPr>
+        <w:pStyle w:val="Heading1"/>
+      </w:pPr>
+      <w:r>
+        <w:t>12 VII 3 Verification Addendum</w:t>
+      </w:r>
+    </w:p>
+    <w:tbl>
+      <w:tblPr>
+        <w:tblStyle w:val="TableGrid"/>
+        <w:tblW w:type="auto" w:w="0"/>
+        <w:tblLook w:firstColumn="1" w:firstRow="1" w:lastColumn="0" w:lastRow="0" w:noHBand="0" w:noVBand="1" w:val="04A0"/>
+      </w:tblPr>
+      <w:tblGrid>
+        <w:gridCol w:w="3312"/>
+        <w:gridCol w:w="3312"/>
+        <w:gridCol w:w="3312"/>
+      </w:tblGrid>
+      <w:tr>
+        <w:trPr>
+          <w:tblHeader/>
+        </w:trPr>
+        <w:tc>
+          <w:tcPr>
+            <w:tcW w:type="dxa" w:w="2232"/>
+            <w:shd w:fill="17365D"/>
+            <w:vAlign w:val="center"/>
+          </w:tcPr>
+          <w:p>
+            <w:r>
+              <w:rPr>
+                <w:b/>
+                <w:color w:val="FFFFFF"/>
+              </w:rPr>
+              <w:t>ID range</w:t>
+            </w:r>
+          </w:p>
+        </w:tc>
+        <w:tc>
+          <w:tcPr>
+            <w:tcW w:type="dxa" w:w="3672"/>
+            <w:shd w:fill="17365D"/>
+            <w:vAlign w:val="center"/>
+          </w:tcPr>
+          <w:p>
+            <w:r>
+              <w:rPr>
+                <w:b/>
+                <w:color w:val="FFFFFF"/>
+              </w:rPr>
+              <w:t>Coverage</w:t>
+            </w:r>
+          </w:p>
+        </w:tc>
+        <w:tc>
+          <w:tcPr>
+            <w:tcW w:type="dxa" w:w="3960"/>
+            <w:shd w:fill="17365D"/>
+            <w:vAlign w:val="center"/>
+          </w:tcPr>
+          <w:p>
+            <w:r>
+              <w:rPr>
+                <w:b/>
+                <w:color w:val="FFFFFF"/>
+              </w:rPr>
+              <w:t>Objective</w:t>
+            </w:r>
+          </w:p>
+        </w:tc>
+      </w:tr>
+      <w:tr>
+        <w:tc>
+          <w:tcPr>
+            <w:tcW w:type="dxa" w:w="2232"/>
+            <w:vAlign w:val="center"/>
+          </w:tcPr>
+          <w:p>
+            <w:r>
+              <w:t>ADAS-T-023 to 025</w:t>
+            </w:r>
+          </w:p>
+        </w:tc>
+        <w:tc>
+          <w:tcPr>
+            <w:tcW w:type="dxa" w:w="3672"/>
+            <w:vAlign w:val="center"/>
+          </w:tcPr>
+          <w:p>
+            <w:r>
+              <w:t>Bounds, FOV, and range</w:t>
+            </w:r>
+          </w:p>
+        </w:tc>
+        <w:tc>
+          <w:tcPr>
+            <w:tcW w:type="dxa" w:w="3960"/>
+            <w:vAlign w:val="center"/>
+          </w:tcPr>
+          <w:p>
+            <w:r>
+              <w:t>Validate configuration and spatial filtering</w:t>
+            </w:r>
+          </w:p>
+        </w:tc>
+      </w:tr>
+      <w:tr>
+        <w:tc>
+          <w:tcPr>
+            <w:tcW w:type="dxa" w:w="2232"/>
+            <w:shd w:fill="EAF0F7"/>
+            <w:vAlign w:val="center"/>
+          </w:tcPr>
+          <w:p>
+            <w:r>
+              <w:t>ADAS-T-026 to 029</w:t>
+            </w:r>
+          </w:p>
+        </w:tc>
+        <w:tc>
+          <w:tcPr>
+            <w:tcW w:type="dxa" w:w="3672"/>
+            <w:shd w:fill="EAF0F7"/>
+            <w:vAlign w:val="center"/>
+          </w:tcPr>
+          <w:p>
+            <w:r>
+              <w:t>Occlusion, noise, and environment</w:t>
+            </w:r>
+          </w:p>
+        </w:tc>
+        <w:tc>
+          <w:tcPr>
+            <w:tcW w:type="dxa" w:w="3960"/>
+            <w:shd w:fill="EAF0F7"/>
+            <w:vAlign w:val="center"/>
+          </w:tcPr>
+          <w:p>
+            <w:r>
+              <w:t>Validate deterministic sensor effects</w:t>
+            </w:r>
+          </w:p>
+        </w:tc>
+      </w:tr>
+      <w:tr>
+        <w:tc>
+          <w:tcPr>
+            <w:tcW w:type="dxa" w:w="2232"/>
+            <w:vAlign w:val="center"/>
+          </w:tcPr>
+          <w:p>
+            <w:r>
+              <w:t>ADAS-T-030 to 032</w:t>
+            </w:r>
+          </w:p>
+        </w:tc>
+        <w:tc>
+          <w:tcPr>
+            <w:tcW w:type="dxa" w:w="3672"/>
+            <w:vAlign w:val="center"/>
+          </w:tcPr>
+          <w:p>
+            <w:r>
+              <w:t>Revision, time, and identity</w:t>
+            </w:r>
+          </w:p>
+        </w:tc>
+        <w:tc>
+          <w:tcPr>
+            <w:tcW w:type="dxa" w:w="3960"/>
+            <w:vAlign w:val="center"/>
+          </w:tcPr>
+          <w:p>
+            <w:r>
+              <w:t>Validate stable persisted evidence</w:t>
+            </w:r>
+          </w:p>
+        </w:tc>
+      </w:tr>
+      <w:tr>
+        <w:tc>
+          <w:tcPr>
+            <w:tcW w:type="dxa" w:w="2232"/>
+            <w:shd w:fill="EAF0F7"/>
+            <w:vAlign w:val="center"/>
+          </w:tcPr>
+          <w:p>
+            <w:r>
+              <w:t>ADAS-T-033 to 034</w:t>
+            </w:r>
+          </w:p>
+        </w:tc>
+        <w:tc>
+          <w:tcPr>
+            <w:tcW w:type="dxa" w:w="3672"/>
+            <w:shd w:fill="EAF0F7"/>
+            <w:vAlign w:val="center"/>
+          </w:tcPr>
+          <w:p>
+            <w:r>
+              <w:t>RBAC, audit, and events</w:t>
+            </w:r>
+          </w:p>
+        </w:tc>
+        <w:tc>
+          <w:tcPr>
+            <w:tcW w:type="dxa" w:w="3960"/>
+            <w:shd w:fill="EAF0F7"/>
+            <w:vAlign w:val="center"/>
+          </w:tcPr>
+          <w:p>
+            <w:r>
+              <w:t>Validate access and atomic traceability</w:t>
+            </w:r>
+          </w:p>
+        </w:tc>
+      </w:tr>
+    </w:tbl>
+    <w:p/>
+    <w:p>
+      <w:pPr>
+        <w:pStyle w:val="Heading1"/>
+      </w:pPr>
+      <w:r>
+        <w:t>13 Next Development</w:t>
+      </w:r>
+    </w:p>
+    <w:p>
+      <w:r>
+        <w:t>VII-4 will add perception outputs for objects, lanes, signs, signals, and pedestrians, then score them against scene truth and persisted sensor observations.</w:t>
       </w:r>
     </w:p>
     <w:p>
@@ -2508,7 +2988,7 @@
         <w:pStyle w:val="Heading1"/>
       </w:pPr>
       <w:r>
-        <w:t>12 Study Exercises</w:t>
+        <w:t>14 Study Exercises</w:t>
       </w:r>
     </w:p>
     <w:p>

</xml_diff>

<commit_message>
feat(adas): add deterministic sensor simulation (#86)
</commit_message>
<xml_diff>
--- a/docs/ATEP_Volume_VII_ADAS_Engineering_Workbook.docx
+++ b/docs/ATEP_Volume_VII_ADAS_Engineering_Workbook.docx
@@ -19,7 +19,7 @@
         <w:rPr>
           <w:b/>
         </w:rPr>
-        <w:t>Version 0.2.0   VII 1 and VII 2 Implemented</w:t>
+        <w:t>Version 0.3.0   VII 1 through VII 3 Implemented</w:t>
       </w:r>
     </w:p>
     <w:p>
@@ -93,7 +93,7 @@
           </w:tcPr>
           <w:p>
             <w:r>
-              <w:t>VII-1 and VII-2 implemented and verified</w:t>
+              <w:t>VII-1 through VII-3 implemented and verified</w:t>
             </w:r>
           </w:p>
         </w:tc>
@@ -169,7 +169,7 @@
           </w:tcPr>
           <w:p>
             <w:r>
-              <w:t>VII-3 camera radar and LiDAR sensor simulation</w:t>
+              <w:t>VII-4 perception and ground truth scoring</w:t>
             </w:r>
           </w:p>
         </w:tc>
@@ -1739,7 +1739,7 @@
         <w:pStyle w:val="ListBullet"/>
       </w:pPr>
       <w:r>
-        <w:t>Migrations 0044 and 0045 form one linear ADAS migration history.</w:t>
+        <w:t>Migrations 0044 through 0046 form one linear ADAS migration history.</w:t>
       </w:r>
     </w:p>
     <w:p>
@@ -2495,12 +2495,492 @@
         <w:pStyle w:val="Heading1"/>
       </w:pPr>
       <w:r>
-        <w:t>11 Next Development</w:t>
+        <w:t>11 Deterministic Sensor Simulation</w:t>
       </w:r>
     </w:p>
     <w:p>
       <w:r>
-        <w:t>VII-3 will add camera, radar, and LiDAR observation models with deterministic noise, latency, range, field of view, and occlusion without changing scene ground truth.</w:t>
+        <w:t>VII-3 adds persisted camera, radar, and LiDAR configurations and observations. Every observation identifies its scene revision, captured logical time, latency-adjusted observation time, and deterministic seed while leaving scene ground truth unchanged.</w:t>
+      </w:r>
+    </w:p>
+    <w:tbl>
+      <w:tblPr>
+        <w:tblStyle w:val="TableGrid"/>
+        <w:tblW w:type="auto" w:w="0"/>
+        <w:tblLook w:firstColumn="1" w:firstRow="1" w:lastColumn="0" w:lastRow="0" w:noHBand="0" w:noVBand="1" w:val="04A0"/>
+      </w:tblPr>
+      <w:tblGrid>
+        <w:gridCol w:w="3312"/>
+        <w:gridCol w:w="3312"/>
+        <w:gridCol w:w="3312"/>
+      </w:tblGrid>
+      <w:tr>
+        <w:trPr>
+          <w:tblHeader/>
+        </w:trPr>
+        <w:tc>
+          <w:tcPr>
+            <w:tcW w:type="dxa" w:w="2016"/>
+            <w:shd w:fill="17365D"/>
+            <w:vAlign w:val="center"/>
+          </w:tcPr>
+          <w:p>
+            <w:r>
+              <w:rPr>
+                <w:b/>
+                <w:color w:val="FFFFFF"/>
+              </w:rPr>
+              <w:t>Mechanism</w:t>
+            </w:r>
+          </w:p>
+        </w:tc>
+        <w:tc>
+          <w:tcPr>
+            <w:tcW w:type="dxa" w:w="4176"/>
+            <w:shd w:fill="17365D"/>
+            <w:vAlign w:val="center"/>
+          </w:tcPr>
+          <w:p>
+            <w:r>
+              <w:rPr>
+                <w:b/>
+                <w:color w:val="FFFFFF"/>
+              </w:rPr>
+              <w:t>Implementation</w:t>
+            </w:r>
+          </w:p>
+        </w:tc>
+        <w:tc>
+          <w:tcPr>
+            <w:tcW w:type="dxa" w:w="3672"/>
+            <w:shd w:fill="17365D"/>
+            <w:vAlign w:val="center"/>
+          </w:tcPr>
+          <w:p>
+            <w:r>
+              <w:rPr>
+                <w:b/>
+                <w:color w:val="FFFFFF"/>
+              </w:rPr>
+              <w:t>Verification objective</w:t>
+            </w:r>
+          </w:p>
+        </w:tc>
+      </w:tr>
+      <w:tr>
+        <w:tc>
+          <w:tcPr>
+            <w:tcW w:type="dxa" w:w="2016"/>
+            <w:vAlign w:val="center"/>
+          </w:tcPr>
+          <w:p>
+            <w:r>
+              <w:t>Geometry</w:t>
+            </w:r>
+          </w:p>
+        </w:tc>
+        <w:tc>
+          <w:tcPr>
+            <w:tcW w:type="dxa" w:w="4176"/>
+            <w:vAlign w:val="center"/>
+          </w:tcPr>
+          <w:p>
+            <w:r>
+              <w:t>Mount pose, yaw, range, and horizontal field of view</w:t>
+            </w:r>
+          </w:p>
+        </w:tc>
+        <w:tc>
+          <w:tcPr>
+            <w:tcW w:type="dxa" w:w="3672"/>
+            <w:vAlign w:val="center"/>
+          </w:tcPr>
+          <w:p>
+            <w:r>
+              <w:t>Exclude actors outside the sensor envelope</w:t>
+            </w:r>
+          </w:p>
+        </w:tc>
+      </w:tr>
+      <w:tr>
+        <w:tc>
+          <w:tcPr>
+            <w:tcW w:type="dxa" w:w="2016"/>
+            <w:shd w:fill="EAF0F7"/>
+            <w:vAlign w:val="center"/>
+          </w:tcPr>
+          <w:p>
+            <w:r>
+              <w:t>Occlusion</w:t>
+            </w:r>
+          </w:p>
+        </w:tc>
+        <w:tc>
+          <w:tcPr>
+            <w:tcW w:type="dxa" w:w="4176"/>
+            <w:shd w:fill="EAF0F7"/>
+            <w:vAlign w:val="center"/>
+          </w:tcPr>
+          <w:p>
+            <w:r>
+              <w:t>Near-to-far angular coverage</w:t>
+            </w:r>
+          </w:p>
+        </w:tc>
+        <w:tc>
+          <w:tcPr>
+            <w:tcW w:type="dxa" w:w="3672"/>
+            <w:shd w:fill="EAF0F7"/>
+            <w:vAlign w:val="center"/>
+          </w:tcPr>
+          <w:p>
+            <w:r>
+              <w:t>Hide aligned actors behind nearer actors</w:t>
+            </w:r>
+          </w:p>
+        </w:tc>
+      </w:tr>
+      <w:tr>
+        <w:tc>
+          <w:tcPr>
+            <w:tcW w:type="dxa" w:w="2016"/>
+            <w:vAlign w:val="center"/>
+          </w:tcPr>
+          <w:p>
+            <w:r>
+              <w:t>Noise</w:t>
+            </w:r>
+          </w:p>
+        </w:tc>
+        <w:tc>
+          <w:tcPr>
+            <w:tcW w:type="dxa" w:w="4176"/>
+            <w:vAlign w:val="center"/>
+          </w:tcPr>
+          <w:p>
+            <w:r>
+              <w:t>SHA-256 seed-derived bounded position offsets</w:t>
+            </w:r>
+          </w:p>
+        </w:tc>
+        <w:tc>
+          <w:tcPr>
+            <w:tcW w:type="dxa" w:w="3672"/>
+            <w:vAlign w:val="center"/>
+          </w:tcPr>
+          <w:p>
+            <w:r>
+              <w:t>Reproduce identical detections</w:t>
+            </w:r>
+          </w:p>
+        </w:tc>
+      </w:tr>
+      <w:tr>
+        <w:tc>
+          <w:tcPr>
+            <w:tcW w:type="dxa" w:w="2016"/>
+            <w:shd w:fill="EAF0F7"/>
+            <w:vAlign w:val="center"/>
+          </w:tcPr>
+          <w:p>
+            <w:r>
+              <w:t>Environment</w:t>
+            </w:r>
+          </w:p>
+        </w:tc>
+        <w:tc>
+          <w:tcPr>
+            <w:tcW w:type="dxa" w:w="4176"/>
+            <w:shd w:fill="EAF0F7"/>
+            <w:vAlign w:val="center"/>
+          </w:tcPr>
+          <w:p>
+            <w:r>
+              <w:t>Visibility range and sensor-sensitive confidence</w:t>
+            </w:r>
+          </w:p>
+        </w:tc>
+        <w:tc>
+          <w:tcPr>
+            <w:tcW w:type="dxa" w:w="3672"/>
+            <w:shd w:fill="EAF0F7"/>
+            <w:vAlign w:val="center"/>
+          </w:tcPr>
+          <w:p>
+            <w:r>
+              <w:t>Represent rain, fog, snow, and low light</w:t>
+            </w:r>
+          </w:p>
+        </w:tc>
+      </w:tr>
+      <w:tr>
+        <w:tc>
+          <w:tcPr>
+            <w:tcW w:type="dxa" w:w="2016"/>
+            <w:vAlign w:val="center"/>
+          </w:tcPr>
+          <w:p>
+            <w:r>
+              <w:t>Evidence</w:t>
+            </w:r>
+          </w:p>
+        </w:tc>
+        <w:tc>
+          <w:tcPr>
+            <w:tcW w:type="dxa" w:w="4176"/>
+            <w:vAlign w:val="center"/>
+          </w:tcPr>
+          <w:p>
+            <w:r>
+              <w:t>Persisted observation plus minimized audit and outbox event</w:t>
+            </w:r>
+          </w:p>
+        </w:tc>
+        <w:tc>
+          <w:tcPr>
+            <w:tcW w:type="dxa" w:w="3672"/>
+            <w:vAlign w:val="center"/>
+          </w:tcPr>
+          <w:p>
+            <w:r>
+              <w:t>Retain traceability without event bloat</w:t>
+            </w:r>
+          </w:p>
+        </w:tc>
+      </w:tr>
+    </w:tbl>
+    <w:p/>
+    <w:p>
+      <w:pPr>
+        <w:pStyle w:val="Heading1"/>
+      </w:pPr>
+      <w:r>
+        <w:t>12 VII 3 Verification Addendum</w:t>
+      </w:r>
+    </w:p>
+    <w:tbl>
+      <w:tblPr>
+        <w:tblStyle w:val="TableGrid"/>
+        <w:tblW w:type="auto" w:w="0"/>
+        <w:tblLook w:firstColumn="1" w:firstRow="1" w:lastColumn="0" w:lastRow="0" w:noHBand="0" w:noVBand="1" w:val="04A0"/>
+      </w:tblPr>
+      <w:tblGrid>
+        <w:gridCol w:w="3312"/>
+        <w:gridCol w:w="3312"/>
+        <w:gridCol w:w="3312"/>
+      </w:tblGrid>
+      <w:tr>
+        <w:trPr>
+          <w:tblHeader/>
+        </w:trPr>
+        <w:tc>
+          <w:tcPr>
+            <w:tcW w:type="dxa" w:w="2232"/>
+            <w:shd w:fill="17365D"/>
+            <w:vAlign w:val="center"/>
+          </w:tcPr>
+          <w:p>
+            <w:r>
+              <w:rPr>
+                <w:b/>
+                <w:color w:val="FFFFFF"/>
+              </w:rPr>
+              <w:t>ID range</w:t>
+            </w:r>
+          </w:p>
+        </w:tc>
+        <w:tc>
+          <w:tcPr>
+            <w:tcW w:type="dxa" w:w="3672"/>
+            <w:shd w:fill="17365D"/>
+            <w:vAlign w:val="center"/>
+          </w:tcPr>
+          <w:p>
+            <w:r>
+              <w:rPr>
+                <w:b/>
+                <w:color w:val="FFFFFF"/>
+              </w:rPr>
+              <w:t>Coverage</w:t>
+            </w:r>
+          </w:p>
+        </w:tc>
+        <w:tc>
+          <w:tcPr>
+            <w:tcW w:type="dxa" w:w="3960"/>
+            <w:shd w:fill="17365D"/>
+            <w:vAlign w:val="center"/>
+          </w:tcPr>
+          <w:p>
+            <w:r>
+              <w:rPr>
+                <w:b/>
+                <w:color w:val="FFFFFF"/>
+              </w:rPr>
+              <w:t>Objective</w:t>
+            </w:r>
+          </w:p>
+        </w:tc>
+      </w:tr>
+      <w:tr>
+        <w:tc>
+          <w:tcPr>
+            <w:tcW w:type="dxa" w:w="2232"/>
+            <w:vAlign w:val="center"/>
+          </w:tcPr>
+          <w:p>
+            <w:r>
+              <w:t>ADAS-T-023 to 025</w:t>
+            </w:r>
+          </w:p>
+        </w:tc>
+        <w:tc>
+          <w:tcPr>
+            <w:tcW w:type="dxa" w:w="3672"/>
+            <w:vAlign w:val="center"/>
+          </w:tcPr>
+          <w:p>
+            <w:r>
+              <w:t>Bounds, FOV, and range</w:t>
+            </w:r>
+          </w:p>
+        </w:tc>
+        <w:tc>
+          <w:tcPr>
+            <w:tcW w:type="dxa" w:w="3960"/>
+            <w:vAlign w:val="center"/>
+          </w:tcPr>
+          <w:p>
+            <w:r>
+              <w:t>Validate configuration and spatial filtering</w:t>
+            </w:r>
+          </w:p>
+        </w:tc>
+      </w:tr>
+      <w:tr>
+        <w:tc>
+          <w:tcPr>
+            <w:tcW w:type="dxa" w:w="2232"/>
+            <w:shd w:fill="EAF0F7"/>
+            <w:vAlign w:val="center"/>
+          </w:tcPr>
+          <w:p>
+            <w:r>
+              <w:t>ADAS-T-026 to 029</w:t>
+            </w:r>
+          </w:p>
+        </w:tc>
+        <w:tc>
+          <w:tcPr>
+            <w:tcW w:type="dxa" w:w="3672"/>
+            <w:shd w:fill="EAF0F7"/>
+            <w:vAlign w:val="center"/>
+          </w:tcPr>
+          <w:p>
+            <w:r>
+              <w:t>Occlusion, noise, and environment</w:t>
+            </w:r>
+          </w:p>
+        </w:tc>
+        <w:tc>
+          <w:tcPr>
+            <w:tcW w:type="dxa" w:w="3960"/>
+            <w:shd w:fill="EAF0F7"/>
+            <w:vAlign w:val="center"/>
+          </w:tcPr>
+          <w:p>
+            <w:r>
+              <w:t>Validate deterministic sensor effects</w:t>
+            </w:r>
+          </w:p>
+        </w:tc>
+      </w:tr>
+      <w:tr>
+        <w:tc>
+          <w:tcPr>
+            <w:tcW w:type="dxa" w:w="2232"/>
+            <w:vAlign w:val="center"/>
+          </w:tcPr>
+          <w:p>
+            <w:r>
+              <w:t>ADAS-T-030 to 032</w:t>
+            </w:r>
+          </w:p>
+        </w:tc>
+        <w:tc>
+          <w:tcPr>
+            <w:tcW w:type="dxa" w:w="3672"/>
+            <w:vAlign w:val="center"/>
+          </w:tcPr>
+          <w:p>
+            <w:r>
+              <w:t>Revision, time, and identity</w:t>
+            </w:r>
+          </w:p>
+        </w:tc>
+        <w:tc>
+          <w:tcPr>
+            <w:tcW w:type="dxa" w:w="3960"/>
+            <w:vAlign w:val="center"/>
+          </w:tcPr>
+          <w:p>
+            <w:r>
+              <w:t>Validate stable persisted evidence</w:t>
+            </w:r>
+          </w:p>
+        </w:tc>
+      </w:tr>
+      <w:tr>
+        <w:tc>
+          <w:tcPr>
+            <w:tcW w:type="dxa" w:w="2232"/>
+            <w:shd w:fill="EAF0F7"/>
+            <w:vAlign w:val="center"/>
+          </w:tcPr>
+          <w:p>
+            <w:r>
+              <w:t>ADAS-T-033 to 034</w:t>
+            </w:r>
+          </w:p>
+        </w:tc>
+        <w:tc>
+          <w:tcPr>
+            <w:tcW w:type="dxa" w:w="3672"/>
+            <w:shd w:fill="EAF0F7"/>
+            <w:vAlign w:val="center"/>
+          </w:tcPr>
+          <w:p>
+            <w:r>
+              <w:t>RBAC, audit, and events</w:t>
+            </w:r>
+          </w:p>
+        </w:tc>
+        <w:tc>
+          <w:tcPr>
+            <w:tcW w:type="dxa" w:w="3960"/>
+            <w:shd w:fill="EAF0F7"/>
+            <w:vAlign w:val="center"/>
+          </w:tcPr>
+          <w:p>
+            <w:r>
+              <w:t>Validate access and atomic traceability</w:t>
+            </w:r>
+          </w:p>
+        </w:tc>
+      </w:tr>
+    </w:tbl>
+    <w:p/>
+    <w:p>
+      <w:pPr>
+        <w:pStyle w:val="Heading1"/>
+      </w:pPr>
+      <w:r>
+        <w:t>13 Next Development</w:t>
+      </w:r>
+    </w:p>
+    <w:p>
+      <w:r>
+        <w:t>VII-4 will add perception outputs for objects, lanes, signs, signals, and pedestrians, then score them against scene truth and persisted sensor observations.</w:t>
       </w:r>
     </w:p>
     <w:p>
@@ -2508,7 +2988,7 @@
         <w:pStyle w:val="Heading1"/>
       </w:pPr>
       <w:r>
-        <w:t>12 Study Exercises</w:t>
+        <w:t>14 Study Exercises</w:t>
       </w:r>
     </w:p>
     <w:p>

</xml_diff>

<commit_message>
feat(adas): add perception ground truth scoring
</commit_message>
<xml_diff>
--- a/docs/ATEP_Volume_VII_ADAS_Engineering_Workbook.docx
+++ b/docs/ATEP_Volume_VII_ADAS_Engineering_Workbook.docx
@@ -19,7 +19,7 @@
         <w:rPr>
           <w:b/>
         </w:rPr>
-        <w:t>Version 0.3.0   VII 1 through VII 3 Implemented</w:t>
+        <w:t>Version 0.4.0   VII 1 through VII 4 Implemented</w:t>
       </w:r>
     </w:p>
     <w:p>
@@ -93,7 +93,7 @@
           </w:tcPr>
           <w:p>
             <w:r>
-              <w:t>VII-1 through VII-3 implemented and verified</w:t>
+              <w:t>VII-1 through VII-4 implemented and verified</w:t>
             </w:r>
           </w:p>
         </w:tc>
@@ -169,7 +169,7 @@
           </w:tcPr>
           <w:p>
             <w:r>
-              <w:t>VII-4 perception and ground truth scoring</w:t>
+              <w:t>VII-5 planning and alerts</w:t>
             </w:r>
           </w:p>
         </w:tc>
@@ -1739,7 +1739,7 @@
         <w:pStyle w:val="ListBullet"/>
       </w:pPr>
       <w:r>
-        <w:t>Migrations 0044 through 0046 form one linear ADAS migration history.</w:t>
+        <w:t>Migrations 0044 through 0047 form one linear ADAS migration history.</w:t>
       </w:r>
     </w:p>
     <w:p>
@@ -2975,12 +2975,492 @@
         <w:pStyle w:val="Heading1"/>
       </w:pPr>
       <w:r>
-        <w:t>13 Next Development</w:t>
+        <w:t>13 Perception and Ground Truth Scoring</w:t>
       </w:r>
     </w:p>
     <w:p>
       <w:r>
-        <w:t>VII-4 will add perception outputs for objects, lanes, signs, signals, and pedestrians, then score them against scene truth and persisted sensor observations.</w:t>
+        <w:t>VII-4 persists perception outputs for objects, pedestrians, lanes, signs, and signals. Predictions reference stable truth identifiers and are matched one-to-one against actors visible in the sensor observation plus lane and traffic-control truth from the unchanged scene revision.</w:t>
+      </w:r>
+    </w:p>
+    <w:tbl>
+      <w:tblPr>
+        <w:tblStyle w:val="TableGrid"/>
+        <w:tblW w:type="auto" w:w="0"/>
+        <w:tblLook w:firstColumn="1" w:firstRow="1" w:lastColumn="0" w:lastRow="0" w:noHBand="0" w:noVBand="1" w:val="04A0"/>
+      </w:tblPr>
+      <w:tblGrid>
+        <w:gridCol w:w="3312"/>
+        <w:gridCol w:w="3312"/>
+        <w:gridCol w:w="3312"/>
+      </w:tblGrid>
+      <w:tr>
+        <w:trPr>
+          <w:tblHeader/>
+        </w:trPr>
+        <w:tc>
+          <w:tcPr>
+            <w:tcW w:type="dxa" w:w="1944"/>
+            <w:shd w:fill="17365D"/>
+            <w:vAlign w:val="center"/>
+          </w:tcPr>
+          <w:p>
+            <w:r>
+              <w:rPr>
+                <w:b/>
+                <w:color w:val="FFFFFF"/>
+              </w:rPr>
+              <w:t>Metric</w:t>
+            </w:r>
+          </w:p>
+        </w:tc>
+        <w:tc>
+          <w:tcPr>
+            <w:tcW w:type="dxa" w:w="4032"/>
+            <w:shd w:fill="17365D"/>
+            <w:vAlign w:val="center"/>
+          </w:tcPr>
+          <w:p>
+            <w:r>
+              <w:rPr>
+                <w:b/>
+                <w:color w:val="FFFFFF"/>
+              </w:rPr>
+              <w:t>Definition</w:t>
+            </w:r>
+          </w:p>
+        </w:tc>
+        <w:tc>
+          <w:tcPr>
+            <w:tcW w:type="dxa" w:w="3888"/>
+            <w:shd w:fill="17365D"/>
+            <w:vAlign w:val="center"/>
+          </w:tcPr>
+          <w:p>
+            <w:r>
+              <w:rPr>
+                <w:b/>
+                <w:color w:val="FFFFFF"/>
+              </w:rPr>
+              <w:t>Engineering control</w:t>
+            </w:r>
+          </w:p>
+        </w:tc>
+      </w:tr>
+      <w:tr>
+        <w:tc>
+          <w:tcPr>
+            <w:tcW w:type="dxa" w:w="1944"/>
+            <w:vAlign w:val="center"/>
+          </w:tcPr>
+          <w:p>
+            <w:r>
+              <w:t>Precision</w:t>
+            </w:r>
+          </w:p>
+        </w:tc>
+        <w:tc>
+          <w:tcPr>
+            <w:tcW w:type="dxa" w:w="4032"/>
+            <w:vAlign w:val="center"/>
+          </w:tcPr>
+          <w:p>
+            <w:r>
+              <w:t>TP divided by TP plus FP</w:t>
+            </w:r>
+          </w:p>
+        </w:tc>
+        <w:tc>
+          <w:tcPr>
+            <w:tcW w:type="dxa" w:w="3888"/>
+            <w:vAlign w:val="center"/>
+          </w:tcPr>
+          <w:p>
+            <w:r>
+              <w:t>Measures prediction correctness</w:t>
+            </w:r>
+          </w:p>
+        </w:tc>
+      </w:tr>
+      <w:tr>
+        <w:tc>
+          <w:tcPr>
+            <w:tcW w:type="dxa" w:w="1944"/>
+            <w:shd w:fill="EAF0F7"/>
+            <w:vAlign w:val="center"/>
+          </w:tcPr>
+          <w:p>
+            <w:r>
+              <w:t>Recall</w:t>
+            </w:r>
+          </w:p>
+        </w:tc>
+        <w:tc>
+          <w:tcPr>
+            <w:tcW w:type="dxa" w:w="4032"/>
+            <w:shd w:fill="EAF0F7"/>
+            <w:vAlign w:val="center"/>
+          </w:tcPr>
+          <w:p>
+            <w:r>
+              <w:t>TP divided by TP plus FN</w:t>
+            </w:r>
+          </w:p>
+        </w:tc>
+        <w:tc>
+          <w:tcPr>
+            <w:tcW w:type="dxa" w:w="3888"/>
+            <w:shd w:fill="EAF0F7"/>
+            <w:vAlign w:val="center"/>
+          </w:tcPr>
+          <w:p>
+            <w:r>
+              <w:t>Measures ground-truth coverage</w:t>
+            </w:r>
+          </w:p>
+        </w:tc>
+      </w:tr>
+      <w:tr>
+        <w:tc>
+          <w:tcPr>
+            <w:tcW w:type="dxa" w:w="1944"/>
+            <w:vAlign w:val="center"/>
+          </w:tcPr>
+          <w:p>
+            <w:r>
+              <w:t>F1</w:t>
+            </w:r>
+          </w:p>
+        </w:tc>
+        <w:tc>
+          <w:tcPr>
+            <w:tcW w:type="dxa" w:w="4032"/>
+            <w:vAlign w:val="center"/>
+          </w:tcPr>
+          <w:p>
+            <w:r>
+              <w:t>Harmonic mean of precision and recall</w:t>
+            </w:r>
+          </w:p>
+        </w:tc>
+        <w:tc>
+          <w:tcPr>
+            <w:tcW w:type="dxa" w:w="3888"/>
+            <w:vAlign w:val="center"/>
+          </w:tcPr>
+          <w:p>
+            <w:r>
+              <w:t>Balances both failure modes</w:t>
+            </w:r>
+          </w:p>
+        </w:tc>
+      </w:tr>
+      <w:tr>
+        <w:tc>
+          <w:tcPr>
+            <w:tcW w:type="dxa" w:w="1944"/>
+            <w:shd w:fill="EAF0F7"/>
+            <w:vAlign w:val="center"/>
+          </w:tcPr>
+          <w:p>
+            <w:r>
+              <w:t>Revision gate</w:t>
+            </w:r>
+          </w:p>
+        </w:tc>
+        <w:tc>
+          <w:tcPr>
+            <w:tcW w:type="dxa" w:w="4032"/>
+            <w:shd w:fill="EAF0F7"/>
+            <w:vAlign w:val="center"/>
+          </w:tcPr>
+          <w:p>
+            <w:r>
+              <w:t>Observation revision equals current scene</w:t>
+            </w:r>
+          </w:p>
+        </w:tc>
+        <w:tc>
+          <w:tcPr>
+            <w:tcW w:type="dxa" w:w="3888"/>
+            <w:shd w:fill="EAF0F7"/>
+            <w:vAlign w:val="center"/>
+          </w:tcPr>
+          <w:p>
+            <w:r>
+              <w:t>Rejects stale truth</w:t>
+            </w:r>
+          </w:p>
+        </w:tc>
+      </w:tr>
+      <w:tr>
+        <w:tc>
+          <w:tcPr>
+            <w:tcW w:type="dxa" w:w="1944"/>
+            <w:vAlign w:val="center"/>
+          </w:tcPr>
+          <w:p>
+            <w:r>
+              <w:t>One-to-one match</w:t>
+            </w:r>
+          </w:p>
+        </w:tc>
+        <w:tc>
+          <w:tcPr>
+            <w:tcW w:type="dxa" w:w="4032"/>
+            <w:vAlign w:val="center"/>
+          </w:tcPr>
+          <w:p>
+            <w:r>
+              <w:t>Each truth target matches once</w:t>
+            </w:r>
+          </w:p>
+        </w:tc>
+        <w:tc>
+          <w:tcPr>
+            <w:tcW w:type="dxa" w:w="3888"/>
+            <w:vAlign w:val="center"/>
+          </w:tcPr>
+          <w:p>
+            <w:r>
+              <w:t>Prevents score inflation</w:t>
+            </w:r>
+          </w:p>
+        </w:tc>
+      </w:tr>
+    </w:tbl>
+    <w:p/>
+    <w:p>
+      <w:pPr>
+        <w:pStyle w:val="Heading1"/>
+      </w:pPr>
+      <w:r>
+        <w:t>14 VII 4 Verification Addendum</w:t>
+      </w:r>
+    </w:p>
+    <w:tbl>
+      <w:tblPr>
+        <w:tblStyle w:val="TableGrid"/>
+        <w:tblW w:type="auto" w:w="0"/>
+        <w:tblLook w:firstColumn="1" w:firstRow="1" w:lastColumn="0" w:lastRow="0" w:noHBand="0" w:noVBand="1" w:val="04A0"/>
+      </w:tblPr>
+      <w:tblGrid>
+        <w:gridCol w:w="3312"/>
+        <w:gridCol w:w="3312"/>
+        <w:gridCol w:w="3312"/>
+      </w:tblGrid>
+      <w:tr>
+        <w:trPr>
+          <w:tblHeader/>
+        </w:trPr>
+        <w:tc>
+          <w:tcPr>
+            <w:tcW w:type="dxa" w:w="2232"/>
+            <w:shd w:fill="17365D"/>
+            <w:vAlign w:val="center"/>
+          </w:tcPr>
+          <w:p>
+            <w:r>
+              <w:rPr>
+                <w:b/>
+                <w:color w:val="FFFFFF"/>
+              </w:rPr>
+              <w:t>ID range</w:t>
+            </w:r>
+          </w:p>
+        </w:tc>
+        <w:tc>
+          <w:tcPr>
+            <w:tcW w:type="dxa" w:w="3672"/>
+            <w:shd w:fill="17365D"/>
+            <w:vAlign w:val="center"/>
+          </w:tcPr>
+          <w:p>
+            <w:r>
+              <w:rPr>
+                <w:b/>
+                <w:color w:val="FFFFFF"/>
+              </w:rPr>
+              <w:t>Coverage</w:t>
+            </w:r>
+          </w:p>
+        </w:tc>
+        <w:tc>
+          <w:tcPr>
+            <w:tcW w:type="dxa" w:w="3960"/>
+            <w:shd w:fill="17365D"/>
+            <w:vAlign w:val="center"/>
+          </w:tcPr>
+          <w:p>
+            <w:r>
+              <w:rPr>
+                <w:b/>
+                <w:color w:val="FFFFFF"/>
+              </w:rPr>
+              <w:t>Objective</w:t>
+            </w:r>
+          </w:p>
+        </w:tc>
+      </w:tr>
+      <w:tr>
+        <w:tc>
+          <w:tcPr>
+            <w:tcW w:type="dxa" w:w="2232"/>
+            <w:vAlign w:val="center"/>
+          </w:tcPr>
+          <w:p>
+            <w:r>
+              <w:t>ADAS-T-035 to 038</w:t>
+            </w:r>
+          </w:p>
+        </w:tc>
+        <w:tc>
+          <w:tcPr>
+            <w:tcW w:type="dxa" w:w="3672"/>
+            <w:vAlign w:val="center"/>
+          </w:tcPr>
+          <w:p>
+            <w:r>
+              <w:t>Contracts and truth</w:t>
+            </w:r>
+          </w:p>
+        </w:tc>
+        <w:tc>
+          <w:tcPr>
+            <w:tcW w:type="dxa" w:w="3960"/>
+            <w:vAlign w:val="center"/>
+          </w:tcPr>
+          <w:p>
+            <w:r>
+              <w:t>Validate all perception target types</w:t>
+            </w:r>
+          </w:p>
+        </w:tc>
+      </w:tr>
+      <w:tr>
+        <w:tc>
+          <w:tcPr>
+            <w:tcW w:type="dxa" w:w="2232"/>
+            <w:shd w:fill="EAF0F7"/>
+            <w:vAlign w:val="center"/>
+          </w:tcPr>
+          <w:p>
+            <w:r>
+              <w:t>ADAS-T-039 to 041</w:t>
+            </w:r>
+          </w:p>
+        </w:tc>
+        <w:tc>
+          <w:tcPr>
+            <w:tcW w:type="dxa" w:w="3672"/>
+            <w:shd w:fill="EAF0F7"/>
+            <w:vAlign w:val="center"/>
+          </w:tcPr>
+          <w:p>
+            <w:r>
+              <w:t>Deterministic scoring</w:t>
+            </w:r>
+          </w:p>
+        </w:tc>
+        <w:tc>
+          <w:tcPr>
+            <w:tcW w:type="dxa" w:w="3960"/>
+            <w:shd w:fill="EAF0F7"/>
+            <w:vAlign w:val="center"/>
+          </w:tcPr>
+          <w:p>
+            <w:r>
+              <w:t>Validate exact one-to-one metrics</w:t>
+            </w:r>
+          </w:p>
+        </w:tc>
+      </w:tr>
+      <w:tr>
+        <w:tc>
+          <w:tcPr>
+            <w:tcW w:type="dxa" w:w="2232"/>
+            <w:vAlign w:val="center"/>
+          </w:tcPr>
+          <w:p>
+            <w:r>
+              <w:t>ADAS-T-042</w:t>
+            </w:r>
+          </w:p>
+        </w:tc>
+        <w:tc>
+          <w:tcPr>
+            <w:tcW w:type="dxa" w:w="3672"/>
+            <w:vAlign w:val="center"/>
+          </w:tcPr>
+          <w:p>
+            <w:r>
+              <w:t>Revision gate</w:t>
+            </w:r>
+          </w:p>
+        </w:tc>
+        <w:tc>
+          <w:tcPr>
+            <w:tcW w:type="dxa" w:w="3960"/>
+            <w:vAlign w:val="center"/>
+          </w:tcPr>
+          <w:p>
+            <w:r>
+              <w:t>Reject comparison against changed truth</w:t>
+            </w:r>
+          </w:p>
+        </w:tc>
+      </w:tr>
+      <w:tr>
+        <w:tc>
+          <w:tcPr>
+            <w:tcW w:type="dxa" w:w="2232"/>
+            <w:shd w:fill="EAF0F7"/>
+            <w:vAlign w:val="center"/>
+          </w:tcPr>
+          <w:p>
+            <w:r>
+              <w:t>ADAS-T-043 to 044</w:t>
+            </w:r>
+          </w:p>
+        </w:tc>
+        <w:tc>
+          <w:tcPr>
+            <w:tcW w:type="dxa" w:w="3672"/>
+            <w:shd w:fill="EAF0F7"/>
+            <w:vAlign w:val="center"/>
+          </w:tcPr>
+          <w:p>
+            <w:r>
+              <w:t>RBAC and evidence</w:t>
+            </w:r>
+          </w:p>
+        </w:tc>
+        <w:tc>
+          <w:tcPr>
+            <w:tcW w:type="dxa" w:w="3960"/>
+            <w:shd w:fill="EAF0F7"/>
+            <w:vAlign w:val="center"/>
+          </w:tcPr>
+          <w:p>
+            <w:r>
+              <w:t>Validate access and traceability</w:t>
+            </w:r>
+          </w:p>
+        </w:tc>
+      </w:tr>
+    </w:tbl>
+    <w:p/>
+    <w:p>
+      <w:pPr>
+        <w:pStyle w:val="Heading1"/>
+      </w:pPr>
+      <w:r>
+        <w:t>15 Next Development</w:t>
+      </w:r>
+    </w:p>
+    <w:p>
+      <w:r>
+        <w:t>VII-5 will add deterministic collision risk, lane departure, following-distance, maneuver, and alert evaluation using the verified scene and perception evidence.</w:t>
       </w:r>
     </w:p>
     <w:p>
@@ -2988,7 +3468,7 @@
         <w:pStyle w:val="Heading1"/>
       </w:pPr>
       <w:r>
-        <w:t>14 Study Exercises</w:t>
+        <w:t>16 Study Exercises</w:t>
       </w:r>
     </w:p>
     <w:p>
@@ -3020,7 +3500,7 @@
         <w:pStyle w:val="ListBullet"/>
       </w:pPr>
       <w:r>
-        <w:t>Compare ENU coordinates with latitude and longitude for local simulation.</w:t>
+        <w:t>Submit one duplicate and one misclassified prediction and calculate the F1 score.</w:t>
       </w:r>
     </w:p>
     <w:sectPr>

</xml_diff>

<commit_message>
feat(adas): add perception ground truth scoring (#87)
</commit_message>
<xml_diff>
--- a/docs/ATEP_Volume_VII_ADAS_Engineering_Workbook.docx
+++ b/docs/ATEP_Volume_VII_ADAS_Engineering_Workbook.docx
@@ -19,7 +19,7 @@
         <w:rPr>
           <w:b/>
         </w:rPr>
-        <w:t>Version 0.3.0   VII 1 through VII 3 Implemented</w:t>
+        <w:t>Version 0.4.0   VII 1 through VII 4 Implemented</w:t>
       </w:r>
     </w:p>
     <w:p>
@@ -93,7 +93,7 @@
           </w:tcPr>
           <w:p>
             <w:r>
-              <w:t>VII-1 through VII-3 implemented and verified</w:t>
+              <w:t>VII-1 through VII-4 implemented and verified</w:t>
             </w:r>
           </w:p>
         </w:tc>
@@ -169,7 +169,7 @@
           </w:tcPr>
           <w:p>
             <w:r>
-              <w:t>VII-4 perception and ground truth scoring</w:t>
+              <w:t>VII-5 planning and alerts</w:t>
             </w:r>
           </w:p>
         </w:tc>
@@ -1739,7 +1739,7 @@
         <w:pStyle w:val="ListBullet"/>
       </w:pPr>
       <w:r>
-        <w:t>Migrations 0044 through 0046 form one linear ADAS migration history.</w:t>
+        <w:t>Migrations 0044 through 0047 form one linear ADAS migration history.</w:t>
       </w:r>
     </w:p>
     <w:p>
@@ -2975,12 +2975,492 @@
         <w:pStyle w:val="Heading1"/>
       </w:pPr>
       <w:r>
-        <w:t>13 Next Development</w:t>
+        <w:t>13 Perception and Ground Truth Scoring</w:t>
       </w:r>
     </w:p>
     <w:p>
       <w:r>
-        <w:t>VII-4 will add perception outputs for objects, lanes, signs, signals, and pedestrians, then score them against scene truth and persisted sensor observations.</w:t>
+        <w:t>VII-4 persists perception outputs for objects, pedestrians, lanes, signs, and signals. Predictions reference stable truth identifiers and are matched one-to-one against actors visible in the sensor observation plus lane and traffic-control truth from the unchanged scene revision.</w:t>
+      </w:r>
+    </w:p>
+    <w:tbl>
+      <w:tblPr>
+        <w:tblStyle w:val="TableGrid"/>
+        <w:tblW w:type="auto" w:w="0"/>
+        <w:tblLook w:firstColumn="1" w:firstRow="1" w:lastColumn="0" w:lastRow="0" w:noHBand="0" w:noVBand="1" w:val="04A0"/>
+      </w:tblPr>
+      <w:tblGrid>
+        <w:gridCol w:w="3312"/>
+        <w:gridCol w:w="3312"/>
+        <w:gridCol w:w="3312"/>
+      </w:tblGrid>
+      <w:tr>
+        <w:trPr>
+          <w:tblHeader/>
+        </w:trPr>
+        <w:tc>
+          <w:tcPr>
+            <w:tcW w:type="dxa" w:w="1944"/>
+            <w:shd w:fill="17365D"/>
+            <w:vAlign w:val="center"/>
+          </w:tcPr>
+          <w:p>
+            <w:r>
+              <w:rPr>
+                <w:b/>
+                <w:color w:val="FFFFFF"/>
+              </w:rPr>
+              <w:t>Metric</w:t>
+            </w:r>
+          </w:p>
+        </w:tc>
+        <w:tc>
+          <w:tcPr>
+            <w:tcW w:type="dxa" w:w="4032"/>
+            <w:shd w:fill="17365D"/>
+            <w:vAlign w:val="center"/>
+          </w:tcPr>
+          <w:p>
+            <w:r>
+              <w:rPr>
+                <w:b/>
+                <w:color w:val="FFFFFF"/>
+              </w:rPr>
+              <w:t>Definition</w:t>
+            </w:r>
+          </w:p>
+        </w:tc>
+        <w:tc>
+          <w:tcPr>
+            <w:tcW w:type="dxa" w:w="3888"/>
+            <w:shd w:fill="17365D"/>
+            <w:vAlign w:val="center"/>
+          </w:tcPr>
+          <w:p>
+            <w:r>
+              <w:rPr>
+                <w:b/>
+                <w:color w:val="FFFFFF"/>
+              </w:rPr>
+              <w:t>Engineering control</w:t>
+            </w:r>
+          </w:p>
+        </w:tc>
+      </w:tr>
+      <w:tr>
+        <w:tc>
+          <w:tcPr>
+            <w:tcW w:type="dxa" w:w="1944"/>
+            <w:vAlign w:val="center"/>
+          </w:tcPr>
+          <w:p>
+            <w:r>
+              <w:t>Precision</w:t>
+            </w:r>
+          </w:p>
+        </w:tc>
+        <w:tc>
+          <w:tcPr>
+            <w:tcW w:type="dxa" w:w="4032"/>
+            <w:vAlign w:val="center"/>
+          </w:tcPr>
+          <w:p>
+            <w:r>
+              <w:t>TP divided by TP plus FP</w:t>
+            </w:r>
+          </w:p>
+        </w:tc>
+        <w:tc>
+          <w:tcPr>
+            <w:tcW w:type="dxa" w:w="3888"/>
+            <w:vAlign w:val="center"/>
+          </w:tcPr>
+          <w:p>
+            <w:r>
+              <w:t>Measures prediction correctness</w:t>
+            </w:r>
+          </w:p>
+        </w:tc>
+      </w:tr>
+      <w:tr>
+        <w:tc>
+          <w:tcPr>
+            <w:tcW w:type="dxa" w:w="1944"/>
+            <w:shd w:fill="EAF0F7"/>
+            <w:vAlign w:val="center"/>
+          </w:tcPr>
+          <w:p>
+            <w:r>
+              <w:t>Recall</w:t>
+            </w:r>
+          </w:p>
+        </w:tc>
+        <w:tc>
+          <w:tcPr>
+            <w:tcW w:type="dxa" w:w="4032"/>
+            <w:shd w:fill="EAF0F7"/>
+            <w:vAlign w:val="center"/>
+          </w:tcPr>
+          <w:p>
+            <w:r>
+              <w:t>TP divided by TP plus FN</w:t>
+            </w:r>
+          </w:p>
+        </w:tc>
+        <w:tc>
+          <w:tcPr>
+            <w:tcW w:type="dxa" w:w="3888"/>
+            <w:shd w:fill="EAF0F7"/>
+            <w:vAlign w:val="center"/>
+          </w:tcPr>
+          <w:p>
+            <w:r>
+              <w:t>Measures ground-truth coverage</w:t>
+            </w:r>
+          </w:p>
+        </w:tc>
+      </w:tr>
+      <w:tr>
+        <w:tc>
+          <w:tcPr>
+            <w:tcW w:type="dxa" w:w="1944"/>
+            <w:vAlign w:val="center"/>
+          </w:tcPr>
+          <w:p>
+            <w:r>
+              <w:t>F1</w:t>
+            </w:r>
+          </w:p>
+        </w:tc>
+        <w:tc>
+          <w:tcPr>
+            <w:tcW w:type="dxa" w:w="4032"/>
+            <w:vAlign w:val="center"/>
+          </w:tcPr>
+          <w:p>
+            <w:r>
+              <w:t>Harmonic mean of precision and recall</w:t>
+            </w:r>
+          </w:p>
+        </w:tc>
+        <w:tc>
+          <w:tcPr>
+            <w:tcW w:type="dxa" w:w="3888"/>
+            <w:vAlign w:val="center"/>
+          </w:tcPr>
+          <w:p>
+            <w:r>
+              <w:t>Balances both failure modes</w:t>
+            </w:r>
+          </w:p>
+        </w:tc>
+      </w:tr>
+      <w:tr>
+        <w:tc>
+          <w:tcPr>
+            <w:tcW w:type="dxa" w:w="1944"/>
+            <w:shd w:fill="EAF0F7"/>
+            <w:vAlign w:val="center"/>
+          </w:tcPr>
+          <w:p>
+            <w:r>
+              <w:t>Revision gate</w:t>
+            </w:r>
+          </w:p>
+        </w:tc>
+        <w:tc>
+          <w:tcPr>
+            <w:tcW w:type="dxa" w:w="4032"/>
+            <w:shd w:fill="EAF0F7"/>
+            <w:vAlign w:val="center"/>
+          </w:tcPr>
+          <w:p>
+            <w:r>
+              <w:t>Observation revision equals current scene</w:t>
+            </w:r>
+          </w:p>
+        </w:tc>
+        <w:tc>
+          <w:tcPr>
+            <w:tcW w:type="dxa" w:w="3888"/>
+            <w:shd w:fill="EAF0F7"/>
+            <w:vAlign w:val="center"/>
+          </w:tcPr>
+          <w:p>
+            <w:r>
+              <w:t>Rejects stale truth</w:t>
+            </w:r>
+          </w:p>
+        </w:tc>
+      </w:tr>
+      <w:tr>
+        <w:tc>
+          <w:tcPr>
+            <w:tcW w:type="dxa" w:w="1944"/>
+            <w:vAlign w:val="center"/>
+          </w:tcPr>
+          <w:p>
+            <w:r>
+              <w:t>One-to-one match</w:t>
+            </w:r>
+          </w:p>
+        </w:tc>
+        <w:tc>
+          <w:tcPr>
+            <w:tcW w:type="dxa" w:w="4032"/>
+            <w:vAlign w:val="center"/>
+          </w:tcPr>
+          <w:p>
+            <w:r>
+              <w:t>Each truth target matches once</w:t>
+            </w:r>
+          </w:p>
+        </w:tc>
+        <w:tc>
+          <w:tcPr>
+            <w:tcW w:type="dxa" w:w="3888"/>
+            <w:vAlign w:val="center"/>
+          </w:tcPr>
+          <w:p>
+            <w:r>
+              <w:t>Prevents score inflation</w:t>
+            </w:r>
+          </w:p>
+        </w:tc>
+      </w:tr>
+    </w:tbl>
+    <w:p/>
+    <w:p>
+      <w:pPr>
+        <w:pStyle w:val="Heading1"/>
+      </w:pPr>
+      <w:r>
+        <w:t>14 VII 4 Verification Addendum</w:t>
+      </w:r>
+    </w:p>
+    <w:tbl>
+      <w:tblPr>
+        <w:tblStyle w:val="TableGrid"/>
+        <w:tblW w:type="auto" w:w="0"/>
+        <w:tblLook w:firstColumn="1" w:firstRow="1" w:lastColumn="0" w:lastRow="0" w:noHBand="0" w:noVBand="1" w:val="04A0"/>
+      </w:tblPr>
+      <w:tblGrid>
+        <w:gridCol w:w="3312"/>
+        <w:gridCol w:w="3312"/>
+        <w:gridCol w:w="3312"/>
+      </w:tblGrid>
+      <w:tr>
+        <w:trPr>
+          <w:tblHeader/>
+        </w:trPr>
+        <w:tc>
+          <w:tcPr>
+            <w:tcW w:type="dxa" w:w="2232"/>
+            <w:shd w:fill="17365D"/>
+            <w:vAlign w:val="center"/>
+          </w:tcPr>
+          <w:p>
+            <w:r>
+              <w:rPr>
+                <w:b/>
+                <w:color w:val="FFFFFF"/>
+              </w:rPr>
+              <w:t>ID range</w:t>
+            </w:r>
+          </w:p>
+        </w:tc>
+        <w:tc>
+          <w:tcPr>
+            <w:tcW w:type="dxa" w:w="3672"/>
+            <w:shd w:fill="17365D"/>
+            <w:vAlign w:val="center"/>
+          </w:tcPr>
+          <w:p>
+            <w:r>
+              <w:rPr>
+                <w:b/>
+                <w:color w:val="FFFFFF"/>
+              </w:rPr>
+              <w:t>Coverage</w:t>
+            </w:r>
+          </w:p>
+        </w:tc>
+        <w:tc>
+          <w:tcPr>
+            <w:tcW w:type="dxa" w:w="3960"/>
+            <w:shd w:fill="17365D"/>
+            <w:vAlign w:val="center"/>
+          </w:tcPr>
+          <w:p>
+            <w:r>
+              <w:rPr>
+                <w:b/>
+                <w:color w:val="FFFFFF"/>
+              </w:rPr>
+              <w:t>Objective</w:t>
+            </w:r>
+          </w:p>
+        </w:tc>
+      </w:tr>
+      <w:tr>
+        <w:tc>
+          <w:tcPr>
+            <w:tcW w:type="dxa" w:w="2232"/>
+            <w:vAlign w:val="center"/>
+          </w:tcPr>
+          <w:p>
+            <w:r>
+              <w:t>ADAS-T-035 to 038</w:t>
+            </w:r>
+          </w:p>
+        </w:tc>
+        <w:tc>
+          <w:tcPr>
+            <w:tcW w:type="dxa" w:w="3672"/>
+            <w:vAlign w:val="center"/>
+          </w:tcPr>
+          <w:p>
+            <w:r>
+              <w:t>Contracts and truth</w:t>
+            </w:r>
+          </w:p>
+        </w:tc>
+        <w:tc>
+          <w:tcPr>
+            <w:tcW w:type="dxa" w:w="3960"/>
+            <w:vAlign w:val="center"/>
+          </w:tcPr>
+          <w:p>
+            <w:r>
+              <w:t>Validate all perception target types</w:t>
+            </w:r>
+          </w:p>
+        </w:tc>
+      </w:tr>
+      <w:tr>
+        <w:tc>
+          <w:tcPr>
+            <w:tcW w:type="dxa" w:w="2232"/>
+            <w:shd w:fill="EAF0F7"/>
+            <w:vAlign w:val="center"/>
+          </w:tcPr>
+          <w:p>
+            <w:r>
+              <w:t>ADAS-T-039 to 041</w:t>
+            </w:r>
+          </w:p>
+        </w:tc>
+        <w:tc>
+          <w:tcPr>
+            <w:tcW w:type="dxa" w:w="3672"/>
+            <w:shd w:fill="EAF0F7"/>
+            <w:vAlign w:val="center"/>
+          </w:tcPr>
+          <w:p>
+            <w:r>
+              <w:t>Deterministic scoring</w:t>
+            </w:r>
+          </w:p>
+        </w:tc>
+        <w:tc>
+          <w:tcPr>
+            <w:tcW w:type="dxa" w:w="3960"/>
+            <w:shd w:fill="EAF0F7"/>
+            <w:vAlign w:val="center"/>
+          </w:tcPr>
+          <w:p>
+            <w:r>
+              <w:t>Validate exact one-to-one metrics</w:t>
+            </w:r>
+          </w:p>
+        </w:tc>
+      </w:tr>
+      <w:tr>
+        <w:tc>
+          <w:tcPr>
+            <w:tcW w:type="dxa" w:w="2232"/>
+            <w:vAlign w:val="center"/>
+          </w:tcPr>
+          <w:p>
+            <w:r>
+              <w:t>ADAS-T-042</w:t>
+            </w:r>
+          </w:p>
+        </w:tc>
+        <w:tc>
+          <w:tcPr>
+            <w:tcW w:type="dxa" w:w="3672"/>
+            <w:vAlign w:val="center"/>
+          </w:tcPr>
+          <w:p>
+            <w:r>
+              <w:t>Revision gate</w:t>
+            </w:r>
+          </w:p>
+        </w:tc>
+        <w:tc>
+          <w:tcPr>
+            <w:tcW w:type="dxa" w:w="3960"/>
+            <w:vAlign w:val="center"/>
+          </w:tcPr>
+          <w:p>
+            <w:r>
+              <w:t>Reject comparison against changed truth</w:t>
+            </w:r>
+          </w:p>
+        </w:tc>
+      </w:tr>
+      <w:tr>
+        <w:tc>
+          <w:tcPr>
+            <w:tcW w:type="dxa" w:w="2232"/>
+            <w:shd w:fill="EAF0F7"/>
+            <w:vAlign w:val="center"/>
+          </w:tcPr>
+          <w:p>
+            <w:r>
+              <w:t>ADAS-T-043 to 044</w:t>
+            </w:r>
+          </w:p>
+        </w:tc>
+        <w:tc>
+          <w:tcPr>
+            <w:tcW w:type="dxa" w:w="3672"/>
+            <w:shd w:fill="EAF0F7"/>
+            <w:vAlign w:val="center"/>
+          </w:tcPr>
+          <w:p>
+            <w:r>
+              <w:t>RBAC and evidence</w:t>
+            </w:r>
+          </w:p>
+        </w:tc>
+        <w:tc>
+          <w:tcPr>
+            <w:tcW w:type="dxa" w:w="3960"/>
+            <w:shd w:fill="EAF0F7"/>
+            <w:vAlign w:val="center"/>
+          </w:tcPr>
+          <w:p>
+            <w:r>
+              <w:t>Validate access and traceability</w:t>
+            </w:r>
+          </w:p>
+        </w:tc>
+      </w:tr>
+    </w:tbl>
+    <w:p/>
+    <w:p>
+      <w:pPr>
+        <w:pStyle w:val="Heading1"/>
+      </w:pPr>
+      <w:r>
+        <w:t>15 Next Development</w:t>
+      </w:r>
+    </w:p>
+    <w:p>
+      <w:r>
+        <w:t>VII-5 will add deterministic collision risk, lane departure, following-distance, maneuver, and alert evaluation using the verified scene and perception evidence.</w:t>
       </w:r>
     </w:p>
     <w:p>
@@ -2988,7 +3468,7 @@
         <w:pStyle w:val="Heading1"/>
       </w:pPr>
       <w:r>
-        <w:t>14 Study Exercises</w:t>
+        <w:t>16 Study Exercises</w:t>
       </w:r>
     </w:p>
     <w:p>
@@ -3020,7 +3500,7 @@
         <w:pStyle w:val="ListBullet"/>
       </w:pPr>
       <w:r>
-        <w:t>Compare ENU coordinates with latitude and longitude for local simulation.</w:t>
+        <w:t>Submit one duplicate and one misclassified prediction and calculate the F1 score.</w:t>
       </w:r>
     </w:p>
     <w:sectPr>

</xml_diff>

<commit_message>
feat(adas): add deterministic planning and alerts
</commit_message>
<xml_diff>
--- a/docs/ATEP_Volume_VII_ADAS_Engineering_Workbook.docx
+++ b/docs/ATEP_Volume_VII_ADAS_Engineering_Workbook.docx
@@ -19,7 +19,7 @@
         <w:rPr>
           <w:b/>
         </w:rPr>
-        <w:t>Version 0.4.0   VII 1 through VII 4 Implemented</w:t>
+        <w:t>Version 0.5.0   VII 1 through VII 5 Implemented</w:t>
       </w:r>
     </w:p>
     <w:p>
@@ -93,7 +93,7 @@
           </w:tcPr>
           <w:p>
             <w:r>
-              <w:t>VII-1 through VII-4 implemented and verified</w:t>
+              <w:t>VII-1 through VII-5 implemented and verified</w:t>
             </w:r>
           </w:p>
         </w:tc>
@@ -169,7 +169,7 @@
           </w:tcPr>
           <w:p>
             <w:r>
-              <w:t>VII-5 planning and alerts</w:t>
+              <w:t>VII-6 ADAS test scenarios</w:t>
             </w:r>
           </w:p>
         </w:tc>
@@ -1739,7 +1739,7 @@
         <w:pStyle w:val="ListBullet"/>
       </w:pPr>
       <w:r>
-        <w:t>Migrations 0044 through 0047 form one linear ADAS migration history.</w:t>
+        <w:t>Migrations 0044 through 0048 form one linear ADAS migration history.</w:t>
       </w:r>
     </w:p>
     <w:p>
@@ -3451,16 +3451,8 @@
     </w:tbl>
     <w:p/>
     <w:p>
-      <w:pPr>
-        <w:pStyle w:val="Heading1"/>
-      </w:pPr>
       <w:r>
-        <w:t>15 Next Development</w:t>
-      </w:r>
-    </w:p>
-    <w:p>
-      <w:r>
-        <w:t>VII-5 will add deterministic collision risk, lane departure, following-distance, maneuver, and alert evaluation using the verified scene and perception evidence.</w:t>
+        <w:br w:type="page"/>
       </w:r>
     </w:p>
     <w:p>
@@ -3468,15 +3460,501 @@
         <w:pStyle w:val="Heading1"/>
       </w:pPr>
       <w:r>
-        <w:t>16 Study Exercises</w:t>
+        <w:t>15 Planning and Alerts</w:t>
+      </w:r>
+    </w:p>
+    <w:p>
+      <w:r>
+        <w:t>VII-5 evaluates perceived actors, the declared ego lane, and perceived signal state. Relative forward motion produces collision TTC and lead-vehicle distance, while nearest-segment geometry produces lane-center offset. Ordered risks select one deterministic maneuver and a stable alert sequence.</w:t>
+      </w:r>
+    </w:p>
+    <w:tbl>
+      <w:tblPr>
+        <w:tblStyle w:val="TableGrid"/>
+        <w:tblW w:type="auto" w:w="0"/>
+        <w:tblLook w:firstColumn="1" w:firstRow="1" w:lastColumn="0" w:lastRow="0" w:noHBand="0" w:noVBand="1" w:val="04A0"/>
+      </w:tblPr>
+      <w:tblGrid>
+        <w:gridCol w:w="3312"/>
+        <w:gridCol w:w="3312"/>
+        <w:gridCol w:w="3312"/>
+      </w:tblGrid>
+      <w:tr>
+        <w:trPr>
+          <w:tblHeader/>
+        </w:trPr>
+        <w:tc>
+          <w:tcPr>
+            <w:tcW w:type="dxa" w:w="2232"/>
+            <w:shd w:fill="17365D"/>
+            <w:vAlign w:val="center"/>
+          </w:tcPr>
+          <w:p>
+            <w:r>
+              <w:rPr>
+                <w:b/>
+                <w:color w:val="FFFFFF"/>
+              </w:rPr>
+              <w:t>Decision input</w:t>
+            </w:r>
+          </w:p>
+        </w:tc>
+        <w:tc>
+          <w:tcPr>
+            <w:tcW w:type="dxa" w:w="4032"/>
+            <w:shd w:fill="17365D"/>
+            <w:vAlign w:val="center"/>
+          </w:tcPr>
+          <w:p>
+            <w:r>
+              <w:rPr>
+                <w:b/>
+                <w:color w:val="FFFFFF"/>
+              </w:rPr>
+              <w:t>Evaluation</w:t>
+            </w:r>
+          </w:p>
+        </w:tc>
+        <w:tc>
+          <w:tcPr>
+            <w:tcW w:type="dxa" w:w="3312"/>
+            <w:shd w:fill="17365D"/>
+            <w:vAlign w:val="center"/>
+          </w:tcPr>
+          <w:p>
+            <w:r>
+              <w:rPr>
+                <w:b/>
+                <w:color w:val="FFFFFF"/>
+              </w:rPr>
+              <w:t>Possible outcome</w:t>
+            </w:r>
+          </w:p>
+        </w:tc>
+      </w:tr>
+      <w:tr>
+        <w:tc>
+          <w:tcPr>
+            <w:tcW w:type="dxa" w:w="2232"/>
+            <w:vAlign w:val="center"/>
+          </w:tcPr>
+          <w:p>
+            <w:r>
+              <w:t>Perceived actors</w:t>
+            </w:r>
+          </w:p>
+        </w:tc>
+        <w:tc>
+          <w:tcPr>
+            <w:tcW w:type="dxa" w:w="4032"/>
+            <w:vAlign w:val="center"/>
+          </w:tcPr>
+          <w:p>
+            <w:r>
+              <w:t>Forward path, relative speed, TTC</w:t>
+            </w:r>
+          </w:p>
+        </w:tc>
+        <w:tc>
+          <w:tcPr>
+            <w:tcW w:type="dxa" w:w="3312"/>
+            <w:vAlign w:val="center"/>
+          </w:tcPr>
+          <w:p>
+            <w:r>
+              <w:t>Brake or emergency brake</w:t>
+            </w:r>
+          </w:p>
+        </w:tc>
+      </w:tr>
+      <w:tr>
+        <w:tc>
+          <w:tcPr>
+            <w:tcW w:type="dxa" w:w="2232"/>
+            <w:shd w:fill="EAF0F7"/>
+            <w:vAlign w:val="center"/>
+          </w:tcPr>
+          <w:p>
+            <w:r>
+              <w:t>Lead vehicle</w:t>
+            </w:r>
+          </w:p>
+        </w:tc>
+        <w:tc>
+          <w:tcPr>
+            <w:tcW w:type="dxa" w:w="4032"/>
+            <w:shd w:fill="EAF0F7"/>
+            <w:vAlign w:val="center"/>
+          </w:tcPr>
+          <w:p>
+            <w:r>
+              <w:t>Minimum following distance</w:t>
+            </w:r>
+          </w:p>
+        </w:tc>
+        <w:tc>
+          <w:tcPr>
+            <w:tcW w:type="dxa" w:w="3312"/>
+            <w:shd w:fill="EAF0F7"/>
+            <w:vAlign w:val="center"/>
+          </w:tcPr>
+          <w:p>
+            <w:r>
+              <w:t>Unsafe following warning</w:t>
+            </w:r>
+          </w:p>
+        </w:tc>
+      </w:tr>
+      <w:tr>
+        <w:tc>
+          <w:tcPr>
+            <w:tcW w:type="dxa" w:w="2232"/>
+            <w:vAlign w:val="center"/>
+          </w:tcPr>
+          <w:p>
+            <w:r>
+              <w:t>Ego lane</w:t>
+            </w:r>
+          </w:p>
+        </w:tc>
+        <w:tc>
+          <w:tcPr>
+            <w:tcW w:type="dxa" w:w="4032"/>
+            <w:vAlign w:val="center"/>
+          </w:tcPr>
+          <w:p>
+            <w:r>
+              <w:t>Centerline offset and usable envelope</w:t>
+            </w:r>
+          </w:p>
+        </w:tc>
+        <w:tc>
+          <w:tcPr>
+            <w:tcW w:type="dxa" w:w="3312"/>
+            <w:vAlign w:val="center"/>
+          </w:tcPr>
+          <w:p>
+            <w:r>
+              <w:t>Lane centering</w:t>
+            </w:r>
+          </w:p>
+        </w:tc>
+      </w:tr>
+      <w:tr>
+        <w:tc>
+          <w:tcPr>
+            <w:tcW w:type="dxa" w:w="2232"/>
+            <w:shd w:fill="EAF0F7"/>
+            <w:vAlign w:val="center"/>
+          </w:tcPr>
+          <w:p>
+            <w:r>
+              <w:t>Perceived signal</w:t>
+            </w:r>
+          </w:p>
+        </w:tc>
+        <w:tc>
+          <w:tcPr>
+            <w:tcW w:type="dxa" w:w="4032"/>
+            <w:shd w:fill="EAF0F7"/>
+            <w:vAlign w:val="center"/>
+          </w:tcPr>
+          <w:p>
+            <w:r>
+              <w:t>Red classification</w:t>
+            </w:r>
+          </w:p>
+        </w:tc>
+        <w:tc>
+          <w:tcPr>
+            <w:tcW w:type="dxa" w:w="3312"/>
+            <w:shd w:fill="EAF0F7"/>
+            <w:vAlign w:val="center"/>
+          </w:tcPr>
+          <w:p>
+            <w:r>
+              <w:t>Stop and critical alert</w:t>
+            </w:r>
+          </w:p>
+        </w:tc>
+      </w:tr>
+      <w:tr>
+        <w:tc>
+          <w:tcPr>
+            <w:tcW w:type="dxa" w:w="2232"/>
+            <w:vAlign w:val="center"/>
+          </w:tcPr>
+          <w:p>
+            <w:r>
+              <w:t>Concurrent risks</w:t>
+            </w:r>
+          </w:p>
+        </w:tc>
+        <w:tc>
+          <w:tcPr>
+            <w:tcW w:type="dxa" w:w="4032"/>
+            <w:vAlign w:val="center"/>
+          </w:tcPr>
+          <w:p>
+            <w:r>
+              <w:t>Fixed maneuver priority</w:t>
+            </w:r>
+          </w:p>
+        </w:tc>
+        <w:tc>
+          <w:tcPr>
+            <w:tcW w:type="dxa" w:w="3312"/>
+            <w:vAlign w:val="center"/>
+          </w:tcPr>
+          <w:p>
+            <w:r>
+              <w:t>Reproducible decision</w:t>
+            </w:r>
+          </w:p>
+        </w:tc>
+      </w:tr>
+    </w:tbl>
+    <w:p/>
+    <w:p>
+      <w:pPr>
+        <w:pStyle w:val="Heading1"/>
+      </w:pPr>
+      <w:r>
+        <w:t>16 VII 5 Verification Addendum</w:t>
+      </w:r>
+    </w:p>
+    <w:tbl>
+      <w:tblPr>
+        <w:tblStyle w:val="TableGrid"/>
+        <w:tblW w:type="auto" w:w="0"/>
+        <w:tblLook w:firstColumn="1" w:firstRow="1" w:lastColumn="0" w:lastRow="0" w:noHBand="0" w:noVBand="1" w:val="04A0"/>
+      </w:tblPr>
+      <w:tblGrid>
+        <w:gridCol w:w="3312"/>
+        <w:gridCol w:w="3312"/>
+        <w:gridCol w:w="3312"/>
+      </w:tblGrid>
+      <w:tr>
+        <w:trPr>
+          <w:tblHeader/>
+        </w:trPr>
+        <w:tc>
+          <w:tcPr>
+            <w:tcW w:type="dxa" w:w="2232"/>
+            <w:shd w:fill="17365D"/>
+            <w:vAlign w:val="center"/>
+          </w:tcPr>
+          <w:p>
+            <w:r>
+              <w:rPr>
+                <w:b/>
+                <w:color w:val="FFFFFF"/>
+              </w:rPr>
+              <w:t>ID range</w:t>
+            </w:r>
+          </w:p>
+        </w:tc>
+        <w:tc>
+          <w:tcPr>
+            <w:tcW w:type="dxa" w:w="3672"/>
+            <w:shd w:fill="17365D"/>
+            <w:vAlign w:val="center"/>
+          </w:tcPr>
+          <w:p>
+            <w:r>
+              <w:rPr>
+                <w:b/>
+                <w:color w:val="FFFFFF"/>
+              </w:rPr>
+              <w:t>Coverage</w:t>
+            </w:r>
+          </w:p>
+        </w:tc>
+        <w:tc>
+          <w:tcPr>
+            <w:tcW w:type="dxa" w:w="3960"/>
+            <w:shd w:fill="17365D"/>
+            <w:vAlign w:val="center"/>
+          </w:tcPr>
+          <w:p>
+            <w:r>
+              <w:rPr>
+                <w:b/>
+                <w:color w:val="FFFFFF"/>
+              </w:rPr>
+              <w:t>Objective</w:t>
+            </w:r>
+          </w:p>
+        </w:tc>
+      </w:tr>
+      <w:tr>
+        <w:tc>
+          <w:tcPr>
+            <w:tcW w:type="dxa" w:w="2232"/>
+            <w:vAlign w:val="center"/>
+          </w:tcPr>
+          <w:p>
+            <w:r>
+              <w:t>ADAS-T-045 to 047</w:t>
+            </w:r>
+          </w:p>
+        </w:tc>
+        <w:tc>
+          <w:tcPr>
+            <w:tcW w:type="dxa" w:w="3672"/>
+            <w:vAlign w:val="center"/>
+          </w:tcPr>
+          <w:p>
+            <w:r>
+              <w:t>Thresholds and motion</w:t>
+            </w:r>
+          </w:p>
+        </w:tc>
+        <w:tc>
+          <w:tcPr>
+            <w:tcW w:type="dxa" w:w="3960"/>
+            <w:vAlign w:val="center"/>
+          </w:tcPr>
+          <w:p>
+            <w:r>
+              <w:t>Validate bounds, distance, and TTC</w:t>
+            </w:r>
+          </w:p>
+        </w:tc>
+      </w:tr>
+      <w:tr>
+        <w:tc>
+          <w:tcPr>
+            <w:tcW w:type="dxa" w:w="2232"/>
+            <w:shd w:fill="EAF0F7"/>
+            <w:vAlign w:val="center"/>
+          </w:tcPr>
+          <w:p>
+            <w:r>
+              <w:t>ADAS-T-048 to 052</w:t>
+            </w:r>
+          </w:p>
+        </w:tc>
+        <w:tc>
+          <w:tcPr>
+            <w:tcW w:type="dxa" w:w="3672"/>
+            <w:shd w:fill="EAF0F7"/>
+            <w:vAlign w:val="center"/>
+          </w:tcPr>
+          <w:p>
+            <w:r>
+              <w:t>Alerts and maneuvers</w:t>
+            </w:r>
+          </w:p>
+        </w:tc>
+        <w:tc>
+          <w:tcPr>
+            <w:tcW w:type="dxa" w:w="3960"/>
+            <w:shd w:fill="EAF0F7"/>
+            <w:vAlign w:val="center"/>
+          </w:tcPr>
+          <w:p>
+            <w:r>
+              <w:t>Validate risk decisions and priority</w:t>
+            </w:r>
+          </w:p>
+        </w:tc>
+      </w:tr>
+      <w:tr>
+        <w:tc>
+          <w:tcPr>
+            <w:tcW w:type="dxa" w:w="2232"/>
+            <w:vAlign w:val="center"/>
+          </w:tcPr>
+          <w:p>
+            <w:r>
+              <w:t>ADAS-T-053</w:t>
+            </w:r>
+          </w:p>
+        </w:tc>
+        <w:tc>
+          <w:tcPr>
+            <w:tcW w:type="dxa" w:w="3672"/>
+            <w:vAlign w:val="center"/>
+          </w:tcPr>
+          <w:p>
+            <w:r>
+              <w:t>Truth integrity</w:t>
+            </w:r>
+          </w:p>
+        </w:tc>
+        <w:tc>
+          <w:tcPr>
+            <w:tcW w:type="dxa" w:w="3960"/>
+            <w:vAlign w:val="center"/>
+          </w:tcPr>
+          <w:p>
+            <w:r>
+              <w:t>Reject unknown lanes and stale revisions</w:t>
+            </w:r>
+          </w:p>
+        </w:tc>
+      </w:tr>
+      <w:tr>
+        <w:tc>
+          <w:tcPr>
+            <w:tcW w:type="dxa" w:w="2232"/>
+            <w:shd w:fill="EAF0F7"/>
+            <w:vAlign w:val="center"/>
+          </w:tcPr>
+          <w:p>
+            <w:r>
+              <w:t>ADAS-T-054 to 055</w:t>
+            </w:r>
+          </w:p>
+        </w:tc>
+        <w:tc>
+          <w:tcPr>
+            <w:tcW w:type="dxa" w:w="3672"/>
+            <w:shd w:fill="EAF0F7"/>
+            <w:vAlign w:val="center"/>
+          </w:tcPr>
+          <w:p>
+            <w:r>
+              <w:t>RBAC and evidence</w:t>
+            </w:r>
+          </w:p>
+        </w:tc>
+        <w:tc>
+          <w:tcPr>
+            <w:tcW w:type="dxa" w:w="3960"/>
+            <w:shd w:fill="EAF0F7"/>
+            <w:vAlign w:val="center"/>
+          </w:tcPr>
+          <w:p>
+            <w:r>
+              <w:t>Validate access and traceability</w:t>
+            </w:r>
+          </w:p>
+        </w:tc>
+      </w:tr>
+    </w:tbl>
+    <w:p/>
+    <w:p>
+      <w:pPr>
+        <w:pStyle w:val="Heading1"/>
+      </w:pPr>
+      <w:r>
+        <w:t>17 Next Development</w:t>
+      </w:r>
+    </w:p>
+    <w:p/>
+    <w:p>
+      <w:r>
+        <w:t>VII-6 will add NCAP-inspired ADAS scenarios, controlled fault injection, regression evidence, and coverage measurement using the verified simulation pipeline.</w:t>
       </w:r>
     </w:p>
     <w:p>
       <w:pPr>
-        <w:pStyle w:val="ListBullet"/>
+        <w:pStyle w:val="Heading1"/>
       </w:pPr>
       <w:r>
-        <w:t>Create an urban crossing and calculate actor positions after two seconds.</w:t>
+        <w:t>18 Study Exercises</w:t>
       </w:r>
     </w:p>
     <w:p>
@@ -3501,6 +3979,14 @@
       </w:pPr>
       <w:r>
         <w:t>Submit one duplicate and one misclassified prediction and calculate the F1 score.</w:t>
+      </w:r>
+    </w:p>
+    <w:p>
+      <w:pPr>
+        <w:pStyle w:val="ListBullet"/>
+      </w:pPr>
+      <w:r>
+        <w:t>Compare braking decisions at TTC values above and below the emergency threshold.</w:t>
       </w:r>
     </w:p>
     <w:sectPr>

</xml_diff>

<commit_message>
feat(adas): add deterministic planning and alerts (#88)
</commit_message>
<xml_diff>
--- a/docs/ATEP_Volume_VII_ADAS_Engineering_Workbook.docx
+++ b/docs/ATEP_Volume_VII_ADAS_Engineering_Workbook.docx
@@ -19,7 +19,7 @@
         <w:rPr>
           <w:b/>
         </w:rPr>
-        <w:t>Version 0.4.0   VII 1 through VII 4 Implemented</w:t>
+        <w:t>Version 0.5.0   VII 1 through VII 5 Implemented</w:t>
       </w:r>
     </w:p>
     <w:p>
@@ -93,7 +93,7 @@
           </w:tcPr>
           <w:p>
             <w:r>
-              <w:t>VII-1 through VII-4 implemented and verified</w:t>
+              <w:t>VII-1 through VII-5 implemented and verified</w:t>
             </w:r>
           </w:p>
         </w:tc>
@@ -169,7 +169,7 @@
           </w:tcPr>
           <w:p>
             <w:r>
-              <w:t>VII-5 planning and alerts</w:t>
+              <w:t>VII-6 ADAS test scenarios</w:t>
             </w:r>
           </w:p>
         </w:tc>
@@ -1739,7 +1739,7 @@
         <w:pStyle w:val="ListBullet"/>
       </w:pPr>
       <w:r>
-        <w:t>Migrations 0044 through 0047 form one linear ADAS migration history.</w:t>
+        <w:t>Migrations 0044 through 0048 form one linear ADAS migration history.</w:t>
       </w:r>
     </w:p>
     <w:p>
@@ -3451,16 +3451,8 @@
     </w:tbl>
     <w:p/>
     <w:p>
-      <w:pPr>
-        <w:pStyle w:val="Heading1"/>
-      </w:pPr>
       <w:r>
-        <w:t>15 Next Development</w:t>
-      </w:r>
-    </w:p>
-    <w:p>
-      <w:r>
-        <w:t>VII-5 will add deterministic collision risk, lane departure, following-distance, maneuver, and alert evaluation using the verified scene and perception evidence.</w:t>
+        <w:br w:type="page"/>
       </w:r>
     </w:p>
     <w:p>
@@ -3468,15 +3460,501 @@
         <w:pStyle w:val="Heading1"/>
       </w:pPr>
       <w:r>
-        <w:t>16 Study Exercises</w:t>
+        <w:t>15 Planning and Alerts</w:t>
+      </w:r>
+    </w:p>
+    <w:p>
+      <w:r>
+        <w:t>VII-5 evaluates perceived actors, the declared ego lane, and perceived signal state. Relative forward motion produces collision TTC and lead-vehicle distance, while nearest-segment geometry produces lane-center offset. Ordered risks select one deterministic maneuver and a stable alert sequence.</w:t>
+      </w:r>
+    </w:p>
+    <w:tbl>
+      <w:tblPr>
+        <w:tblStyle w:val="TableGrid"/>
+        <w:tblW w:type="auto" w:w="0"/>
+        <w:tblLook w:firstColumn="1" w:firstRow="1" w:lastColumn="0" w:lastRow="0" w:noHBand="0" w:noVBand="1" w:val="04A0"/>
+      </w:tblPr>
+      <w:tblGrid>
+        <w:gridCol w:w="3312"/>
+        <w:gridCol w:w="3312"/>
+        <w:gridCol w:w="3312"/>
+      </w:tblGrid>
+      <w:tr>
+        <w:trPr>
+          <w:tblHeader/>
+        </w:trPr>
+        <w:tc>
+          <w:tcPr>
+            <w:tcW w:type="dxa" w:w="2232"/>
+            <w:shd w:fill="17365D"/>
+            <w:vAlign w:val="center"/>
+          </w:tcPr>
+          <w:p>
+            <w:r>
+              <w:rPr>
+                <w:b/>
+                <w:color w:val="FFFFFF"/>
+              </w:rPr>
+              <w:t>Decision input</w:t>
+            </w:r>
+          </w:p>
+        </w:tc>
+        <w:tc>
+          <w:tcPr>
+            <w:tcW w:type="dxa" w:w="4032"/>
+            <w:shd w:fill="17365D"/>
+            <w:vAlign w:val="center"/>
+          </w:tcPr>
+          <w:p>
+            <w:r>
+              <w:rPr>
+                <w:b/>
+                <w:color w:val="FFFFFF"/>
+              </w:rPr>
+              <w:t>Evaluation</w:t>
+            </w:r>
+          </w:p>
+        </w:tc>
+        <w:tc>
+          <w:tcPr>
+            <w:tcW w:type="dxa" w:w="3312"/>
+            <w:shd w:fill="17365D"/>
+            <w:vAlign w:val="center"/>
+          </w:tcPr>
+          <w:p>
+            <w:r>
+              <w:rPr>
+                <w:b/>
+                <w:color w:val="FFFFFF"/>
+              </w:rPr>
+              <w:t>Possible outcome</w:t>
+            </w:r>
+          </w:p>
+        </w:tc>
+      </w:tr>
+      <w:tr>
+        <w:tc>
+          <w:tcPr>
+            <w:tcW w:type="dxa" w:w="2232"/>
+            <w:vAlign w:val="center"/>
+          </w:tcPr>
+          <w:p>
+            <w:r>
+              <w:t>Perceived actors</w:t>
+            </w:r>
+          </w:p>
+        </w:tc>
+        <w:tc>
+          <w:tcPr>
+            <w:tcW w:type="dxa" w:w="4032"/>
+            <w:vAlign w:val="center"/>
+          </w:tcPr>
+          <w:p>
+            <w:r>
+              <w:t>Forward path, relative speed, TTC</w:t>
+            </w:r>
+          </w:p>
+        </w:tc>
+        <w:tc>
+          <w:tcPr>
+            <w:tcW w:type="dxa" w:w="3312"/>
+            <w:vAlign w:val="center"/>
+          </w:tcPr>
+          <w:p>
+            <w:r>
+              <w:t>Brake or emergency brake</w:t>
+            </w:r>
+          </w:p>
+        </w:tc>
+      </w:tr>
+      <w:tr>
+        <w:tc>
+          <w:tcPr>
+            <w:tcW w:type="dxa" w:w="2232"/>
+            <w:shd w:fill="EAF0F7"/>
+            <w:vAlign w:val="center"/>
+          </w:tcPr>
+          <w:p>
+            <w:r>
+              <w:t>Lead vehicle</w:t>
+            </w:r>
+          </w:p>
+        </w:tc>
+        <w:tc>
+          <w:tcPr>
+            <w:tcW w:type="dxa" w:w="4032"/>
+            <w:shd w:fill="EAF0F7"/>
+            <w:vAlign w:val="center"/>
+          </w:tcPr>
+          <w:p>
+            <w:r>
+              <w:t>Minimum following distance</w:t>
+            </w:r>
+          </w:p>
+        </w:tc>
+        <w:tc>
+          <w:tcPr>
+            <w:tcW w:type="dxa" w:w="3312"/>
+            <w:shd w:fill="EAF0F7"/>
+            <w:vAlign w:val="center"/>
+          </w:tcPr>
+          <w:p>
+            <w:r>
+              <w:t>Unsafe following warning</w:t>
+            </w:r>
+          </w:p>
+        </w:tc>
+      </w:tr>
+      <w:tr>
+        <w:tc>
+          <w:tcPr>
+            <w:tcW w:type="dxa" w:w="2232"/>
+            <w:vAlign w:val="center"/>
+          </w:tcPr>
+          <w:p>
+            <w:r>
+              <w:t>Ego lane</w:t>
+            </w:r>
+          </w:p>
+        </w:tc>
+        <w:tc>
+          <w:tcPr>
+            <w:tcW w:type="dxa" w:w="4032"/>
+            <w:vAlign w:val="center"/>
+          </w:tcPr>
+          <w:p>
+            <w:r>
+              <w:t>Centerline offset and usable envelope</w:t>
+            </w:r>
+          </w:p>
+        </w:tc>
+        <w:tc>
+          <w:tcPr>
+            <w:tcW w:type="dxa" w:w="3312"/>
+            <w:vAlign w:val="center"/>
+          </w:tcPr>
+          <w:p>
+            <w:r>
+              <w:t>Lane centering</w:t>
+            </w:r>
+          </w:p>
+        </w:tc>
+      </w:tr>
+      <w:tr>
+        <w:tc>
+          <w:tcPr>
+            <w:tcW w:type="dxa" w:w="2232"/>
+            <w:shd w:fill="EAF0F7"/>
+            <w:vAlign w:val="center"/>
+          </w:tcPr>
+          <w:p>
+            <w:r>
+              <w:t>Perceived signal</w:t>
+            </w:r>
+          </w:p>
+        </w:tc>
+        <w:tc>
+          <w:tcPr>
+            <w:tcW w:type="dxa" w:w="4032"/>
+            <w:shd w:fill="EAF0F7"/>
+            <w:vAlign w:val="center"/>
+          </w:tcPr>
+          <w:p>
+            <w:r>
+              <w:t>Red classification</w:t>
+            </w:r>
+          </w:p>
+        </w:tc>
+        <w:tc>
+          <w:tcPr>
+            <w:tcW w:type="dxa" w:w="3312"/>
+            <w:shd w:fill="EAF0F7"/>
+            <w:vAlign w:val="center"/>
+          </w:tcPr>
+          <w:p>
+            <w:r>
+              <w:t>Stop and critical alert</w:t>
+            </w:r>
+          </w:p>
+        </w:tc>
+      </w:tr>
+      <w:tr>
+        <w:tc>
+          <w:tcPr>
+            <w:tcW w:type="dxa" w:w="2232"/>
+            <w:vAlign w:val="center"/>
+          </w:tcPr>
+          <w:p>
+            <w:r>
+              <w:t>Concurrent risks</w:t>
+            </w:r>
+          </w:p>
+        </w:tc>
+        <w:tc>
+          <w:tcPr>
+            <w:tcW w:type="dxa" w:w="4032"/>
+            <w:vAlign w:val="center"/>
+          </w:tcPr>
+          <w:p>
+            <w:r>
+              <w:t>Fixed maneuver priority</w:t>
+            </w:r>
+          </w:p>
+        </w:tc>
+        <w:tc>
+          <w:tcPr>
+            <w:tcW w:type="dxa" w:w="3312"/>
+            <w:vAlign w:val="center"/>
+          </w:tcPr>
+          <w:p>
+            <w:r>
+              <w:t>Reproducible decision</w:t>
+            </w:r>
+          </w:p>
+        </w:tc>
+      </w:tr>
+    </w:tbl>
+    <w:p/>
+    <w:p>
+      <w:pPr>
+        <w:pStyle w:val="Heading1"/>
+      </w:pPr>
+      <w:r>
+        <w:t>16 VII 5 Verification Addendum</w:t>
+      </w:r>
+    </w:p>
+    <w:tbl>
+      <w:tblPr>
+        <w:tblStyle w:val="TableGrid"/>
+        <w:tblW w:type="auto" w:w="0"/>
+        <w:tblLook w:firstColumn="1" w:firstRow="1" w:lastColumn="0" w:lastRow="0" w:noHBand="0" w:noVBand="1" w:val="04A0"/>
+      </w:tblPr>
+      <w:tblGrid>
+        <w:gridCol w:w="3312"/>
+        <w:gridCol w:w="3312"/>
+        <w:gridCol w:w="3312"/>
+      </w:tblGrid>
+      <w:tr>
+        <w:trPr>
+          <w:tblHeader/>
+        </w:trPr>
+        <w:tc>
+          <w:tcPr>
+            <w:tcW w:type="dxa" w:w="2232"/>
+            <w:shd w:fill="17365D"/>
+            <w:vAlign w:val="center"/>
+          </w:tcPr>
+          <w:p>
+            <w:r>
+              <w:rPr>
+                <w:b/>
+                <w:color w:val="FFFFFF"/>
+              </w:rPr>
+              <w:t>ID range</w:t>
+            </w:r>
+          </w:p>
+        </w:tc>
+        <w:tc>
+          <w:tcPr>
+            <w:tcW w:type="dxa" w:w="3672"/>
+            <w:shd w:fill="17365D"/>
+            <w:vAlign w:val="center"/>
+          </w:tcPr>
+          <w:p>
+            <w:r>
+              <w:rPr>
+                <w:b/>
+                <w:color w:val="FFFFFF"/>
+              </w:rPr>
+              <w:t>Coverage</w:t>
+            </w:r>
+          </w:p>
+        </w:tc>
+        <w:tc>
+          <w:tcPr>
+            <w:tcW w:type="dxa" w:w="3960"/>
+            <w:shd w:fill="17365D"/>
+            <w:vAlign w:val="center"/>
+          </w:tcPr>
+          <w:p>
+            <w:r>
+              <w:rPr>
+                <w:b/>
+                <w:color w:val="FFFFFF"/>
+              </w:rPr>
+              <w:t>Objective</w:t>
+            </w:r>
+          </w:p>
+        </w:tc>
+      </w:tr>
+      <w:tr>
+        <w:tc>
+          <w:tcPr>
+            <w:tcW w:type="dxa" w:w="2232"/>
+            <w:vAlign w:val="center"/>
+          </w:tcPr>
+          <w:p>
+            <w:r>
+              <w:t>ADAS-T-045 to 047</w:t>
+            </w:r>
+          </w:p>
+        </w:tc>
+        <w:tc>
+          <w:tcPr>
+            <w:tcW w:type="dxa" w:w="3672"/>
+            <w:vAlign w:val="center"/>
+          </w:tcPr>
+          <w:p>
+            <w:r>
+              <w:t>Thresholds and motion</w:t>
+            </w:r>
+          </w:p>
+        </w:tc>
+        <w:tc>
+          <w:tcPr>
+            <w:tcW w:type="dxa" w:w="3960"/>
+            <w:vAlign w:val="center"/>
+          </w:tcPr>
+          <w:p>
+            <w:r>
+              <w:t>Validate bounds, distance, and TTC</w:t>
+            </w:r>
+          </w:p>
+        </w:tc>
+      </w:tr>
+      <w:tr>
+        <w:tc>
+          <w:tcPr>
+            <w:tcW w:type="dxa" w:w="2232"/>
+            <w:shd w:fill="EAF0F7"/>
+            <w:vAlign w:val="center"/>
+          </w:tcPr>
+          <w:p>
+            <w:r>
+              <w:t>ADAS-T-048 to 052</w:t>
+            </w:r>
+          </w:p>
+        </w:tc>
+        <w:tc>
+          <w:tcPr>
+            <w:tcW w:type="dxa" w:w="3672"/>
+            <w:shd w:fill="EAF0F7"/>
+            <w:vAlign w:val="center"/>
+          </w:tcPr>
+          <w:p>
+            <w:r>
+              <w:t>Alerts and maneuvers</w:t>
+            </w:r>
+          </w:p>
+        </w:tc>
+        <w:tc>
+          <w:tcPr>
+            <w:tcW w:type="dxa" w:w="3960"/>
+            <w:shd w:fill="EAF0F7"/>
+            <w:vAlign w:val="center"/>
+          </w:tcPr>
+          <w:p>
+            <w:r>
+              <w:t>Validate risk decisions and priority</w:t>
+            </w:r>
+          </w:p>
+        </w:tc>
+      </w:tr>
+      <w:tr>
+        <w:tc>
+          <w:tcPr>
+            <w:tcW w:type="dxa" w:w="2232"/>
+            <w:vAlign w:val="center"/>
+          </w:tcPr>
+          <w:p>
+            <w:r>
+              <w:t>ADAS-T-053</w:t>
+            </w:r>
+          </w:p>
+        </w:tc>
+        <w:tc>
+          <w:tcPr>
+            <w:tcW w:type="dxa" w:w="3672"/>
+            <w:vAlign w:val="center"/>
+          </w:tcPr>
+          <w:p>
+            <w:r>
+              <w:t>Truth integrity</w:t>
+            </w:r>
+          </w:p>
+        </w:tc>
+        <w:tc>
+          <w:tcPr>
+            <w:tcW w:type="dxa" w:w="3960"/>
+            <w:vAlign w:val="center"/>
+          </w:tcPr>
+          <w:p>
+            <w:r>
+              <w:t>Reject unknown lanes and stale revisions</w:t>
+            </w:r>
+          </w:p>
+        </w:tc>
+      </w:tr>
+      <w:tr>
+        <w:tc>
+          <w:tcPr>
+            <w:tcW w:type="dxa" w:w="2232"/>
+            <w:shd w:fill="EAF0F7"/>
+            <w:vAlign w:val="center"/>
+          </w:tcPr>
+          <w:p>
+            <w:r>
+              <w:t>ADAS-T-054 to 055</w:t>
+            </w:r>
+          </w:p>
+        </w:tc>
+        <w:tc>
+          <w:tcPr>
+            <w:tcW w:type="dxa" w:w="3672"/>
+            <w:shd w:fill="EAF0F7"/>
+            <w:vAlign w:val="center"/>
+          </w:tcPr>
+          <w:p>
+            <w:r>
+              <w:t>RBAC and evidence</w:t>
+            </w:r>
+          </w:p>
+        </w:tc>
+        <w:tc>
+          <w:tcPr>
+            <w:tcW w:type="dxa" w:w="3960"/>
+            <w:shd w:fill="EAF0F7"/>
+            <w:vAlign w:val="center"/>
+          </w:tcPr>
+          <w:p>
+            <w:r>
+              <w:t>Validate access and traceability</w:t>
+            </w:r>
+          </w:p>
+        </w:tc>
+      </w:tr>
+    </w:tbl>
+    <w:p/>
+    <w:p>
+      <w:pPr>
+        <w:pStyle w:val="Heading1"/>
+      </w:pPr>
+      <w:r>
+        <w:t>17 Next Development</w:t>
+      </w:r>
+    </w:p>
+    <w:p/>
+    <w:p>
+      <w:r>
+        <w:t>VII-6 will add NCAP-inspired ADAS scenarios, controlled fault injection, regression evidence, and coverage measurement using the verified simulation pipeline.</w:t>
       </w:r>
     </w:p>
     <w:p>
       <w:pPr>
-        <w:pStyle w:val="ListBullet"/>
+        <w:pStyle w:val="Heading1"/>
       </w:pPr>
       <w:r>
-        <w:t>Create an urban crossing and calculate actor positions after two seconds.</w:t>
+        <w:t>18 Study Exercises</w:t>
       </w:r>
     </w:p>
     <w:p>
@@ -3501,6 +3979,14 @@
       </w:pPr>
       <w:r>
         <w:t>Submit one duplicate and one misclassified prediction and calculate the F1 score.</w:t>
+      </w:r>
+    </w:p>
+    <w:p>
+      <w:pPr>
+        <w:pStyle w:val="ListBullet"/>
+      </w:pPr>
+      <w:r>
+        <w:t>Compare braking decisions at TTC values above and below the emergency threshold.</w:t>
       </w:r>
     </w:p>
     <w:sectPr>

</xml_diff>

<commit_message>
feat(adas): add deterministic test scenarios
</commit_message>
<xml_diff>
--- a/docs/ATEP_Volume_VII_ADAS_Engineering_Workbook.docx
+++ b/docs/ATEP_Volume_VII_ADAS_Engineering_Workbook.docx
@@ -19,7 +19,7 @@
         <w:rPr>
           <w:b/>
         </w:rPr>
-        <w:t>Version 0.5.0   VII 1 through VII 5 Implemented</w:t>
+        <w:t>Version 0.6.0   VII 1 through VII 6 Implemented</w:t>
       </w:r>
     </w:p>
     <w:p>
@@ -93,7 +93,7 @@
           </w:tcPr>
           <w:p>
             <w:r>
-              <w:t>VII-1 through VII-5 implemented and verified</w:t>
+              <w:t>VII-1 through VII-6 implemented and verified</w:t>
             </w:r>
           </w:p>
         </w:tc>
@@ -169,7 +169,7 @@
           </w:tcPr>
           <w:p>
             <w:r>
-              <w:t>VII-6 ADAS test scenarios</w:t>
+              <w:t>VII-7 cross-platform integration</w:t>
             </w:r>
           </w:p>
         </w:tc>
@@ -210,7 +210,15 @@
         <w:pStyle w:val="ListBullet"/>
       </w:pPr>
       <w:r>
-        <w:t>Deferred: weather, traffic controls, sensor physics, perception, planning, and alerts.</w:t>
+        <w:t>Delivered next: environment, sensors, perception, planning, alerts, and scenarios.</w:t>
+      </w:r>
+    </w:p>
+    <w:p>
+      <w:pPr>
+        <w:pStyle w:val="ListBullet"/>
+      </w:pPr>
+      <w:r>
+        <w:t>Deferred: cross-platform test-run, Vehicle Gateway, CarSystemUI, and dashboard links.</w:t>
       </w:r>
     </w:p>
     <w:p>
@@ -1739,7 +1747,7 @@
         <w:pStyle w:val="ListBullet"/>
       </w:pPr>
       <w:r>
-        <w:t>Migrations 0044 through 0048 form one linear ADAS migration history.</w:t>
+        <w:t>Migrations 0044 through 0049 form one linear ADAS migration history.</w:t>
       </w:r>
     </w:p>
     <w:p>
@@ -3936,17 +3944,8 @@
     </w:tbl>
     <w:p/>
     <w:p>
-      <w:pPr>
-        <w:pStyle w:val="Heading1"/>
-      </w:pPr>
       <w:r>
-        <w:t>17 Next Development</w:t>
-      </w:r>
-    </w:p>
-    <w:p/>
-    <w:p>
-      <w:r>
-        <w:t>VII-6 will add NCAP-inspired ADAS scenarios, controlled fault injection, regression evidence, and coverage measurement using the verified simulation pipeline.</w:t>
+        <w:br w:type="page"/>
       </w:r>
     </w:p>
     <w:p>
@@ -3954,7 +3953,682 @@
         <w:pStyle w:val="Heading1"/>
       </w:pPr>
       <w:r>
-        <w:t>18 Study Exercises</w:t>
+        <w:t>17 ADAS Test Scenarios</w:t>
+      </w:r>
+    </w:p>
+    <w:p>
+      <w:r>
+        <w:t>VII-6 executes bounded, repeatable engineering scenarios over an immutable scene and persisted perception result. The catalogue is inspired by common consumer safety assessment concerns but does not claim official NCAP certification or homologation.</w:t>
+      </w:r>
+    </w:p>
+    <w:tbl>
+      <w:tblPr>
+        <w:tblStyle w:val="TableGrid"/>
+        <w:tblW w:type="auto" w:w="0"/>
+        <w:tblLook w:firstColumn="1" w:firstRow="1" w:lastColumn="0" w:lastRow="0" w:noHBand="0" w:noVBand="1" w:val="04A0"/>
+      </w:tblPr>
+      <w:tblGrid>
+        <w:gridCol w:w="3312"/>
+        <w:gridCol w:w="3312"/>
+        <w:gridCol w:w="3312"/>
+      </w:tblGrid>
+      <w:tr>
+        <w:trPr>
+          <w:tblHeader/>
+        </w:trPr>
+        <w:tc>
+          <w:tcPr>
+            <w:tcW w:type="dxa" w:w="2232"/>
+            <w:shd w:fill="17365D"/>
+            <w:vAlign w:val="center"/>
+          </w:tcPr>
+          <w:p>
+            <w:r>
+              <w:rPr>
+                <w:b/>
+                <w:color w:val="FFFFFF"/>
+              </w:rPr>
+              <w:t>Scenario family</w:t>
+            </w:r>
+          </w:p>
+        </w:tc>
+        <w:tc>
+          <w:tcPr>
+            <w:tcW w:type="dxa" w:w="4032"/>
+            <w:shd w:fill="17365D"/>
+            <w:vAlign w:val="center"/>
+          </w:tcPr>
+          <w:p>
+            <w:r>
+              <w:rPr>
+                <w:b/>
+                <w:color w:val="FFFFFF"/>
+              </w:rPr>
+              <w:t>Primary behavior</w:t>
+            </w:r>
+          </w:p>
+        </w:tc>
+        <w:tc>
+          <w:tcPr>
+            <w:tcW w:type="dxa" w:w="3312"/>
+            <w:shd w:fill="17365D"/>
+            <w:vAlign w:val="center"/>
+          </w:tcPr>
+          <w:p>
+            <w:r>
+              <w:rPr>
+                <w:b/>
+                <w:color w:val="FFFFFF"/>
+              </w:rPr>
+              <w:t>Evidence</w:t>
+            </w:r>
+          </w:p>
+        </w:tc>
+      </w:tr>
+      <w:tr>
+        <w:tc>
+          <w:tcPr>
+            <w:tcW w:type="dxa" w:w="2232"/>
+            <w:vAlign w:val="center"/>
+          </w:tcPr>
+          <w:p>
+            <w:r>
+              <w:t>Car to car AEB</w:t>
+            </w:r>
+          </w:p>
+        </w:tc>
+        <w:tc>
+          <w:tcPr>
+            <w:tcW w:type="dxa" w:w="4032"/>
+            <w:vAlign w:val="center"/>
+          </w:tcPr>
+          <w:p>
+            <w:r>
+              <w:t>Lead vehicle collision response</w:t>
+            </w:r>
+          </w:p>
+        </w:tc>
+        <w:tc>
+          <w:tcPr>
+            <w:tcW w:type="dxa" w:w="3312"/>
+            <w:vAlign w:val="center"/>
+          </w:tcPr>
+          <w:p>
+            <w:r>
+              <w:t>TTC alert and braking</w:t>
+            </w:r>
+          </w:p>
+        </w:tc>
+      </w:tr>
+      <w:tr>
+        <w:tc>
+          <w:tcPr>
+            <w:tcW w:type="dxa" w:w="2232"/>
+            <w:shd w:fill="EAF0F7"/>
+            <w:vAlign w:val="center"/>
+          </w:tcPr>
+          <w:p>
+            <w:r>
+              <w:t>Pedestrian AEB</w:t>
+            </w:r>
+          </w:p>
+        </w:tc>
+        <w:tc>
+          <w:tcPr>
+            <w:tcW w:type="dxa" w:w="4032"/>
+            <w:shd w:fill="EAF0F7"/>
+            <w:vAlign w:val="center"/>
+          </w:tcPr>
+          <w:p>
+            <w:r>
+              <w:t>Pedestrian collision response</w:t>
+            </w:r>
+          </w:p>
+        </w:tc>
+        <w:tc>
+          <w:tcPr>
+            <w:tcW w:type="dxa" w:w="3312"/>
+            <w:shd w:fill="EAF0F7"/>
+            <w:vAlign w:val="center"/>
+          </w:tcPr>
+          <w:p>
+            <w:r>
+              <w:t>Detection and maneuver</w:t>
+            </w:r>
+          </w:p>
+        </w:tc>
+      </w:tr>
+      <w:tr>
+        <w:tc>
+          <w:tcPr>
+            <w:tcW w:type="dxa" w:w="2232"/>
+            <w:vAlign w:val="center"/>
+          </w:tcPr>
+          <w:p>
+            <w:r>
+              <w:t>Lane support</w:t>
+            </w:r>
+          </w:p>
+        </w:tc>
+        <w:tc>
+          <w:tcPr>
+            <w:tcW w:type="dxa" w:w="4032"/>
+            <w:vAlign w:val="center"/>
+          </w:tcPr>
+          <w:p>
+            <w:r>
+              <w:t>Lane envelope recovery</w:t>
+            </w:r>
+          </w:p>
+        </w:tc>
+        <w:tc>
+          <w:tcPr>
+            <w:tcW w:type="dxa" w:w="3312"/>
+            <w:vAlign w:val="center"/>
+          </w:tcPr>
+          <w:p>
+            <w:r>
+              <w:t>Departure alert and centering</w:t>
+            </w:r>
+          </w:p>
+        </w:tc>
+      </w:tr>
+      <w:tr>
+        <w:tc>
+          <w:tcPr>
+            <w:tcW w:type="dxa" w:w="2232"/>
+            <w:shd w:fill="EAF0F7"/>
+            <w:vAlign w:val="center"/>
+          </w:tcPr>
+          <w:p>
+            <w:r>
+              <w:t>Traffic signal</w:t>
+            </w:r>
+          </w:p>
+        </w:tc>
+        <w:tc>
+          <w:tcPr>
+            <w:tcW w:type="dxa" w:w="4032"/>
+            <w:shd w:fill="EAF0F7"/>
+            <w:vAlign w:val="center"/>
+          </w:tcPr>
+          <w:p>
+            <w:r>
+              <w:t>Red signal compliance</w:t>
+            </w:r>
+          </w:p>
+        </w:tc>
+        <w:tc>
+          <w:tcPr>
+            <w:tcW w:type="dxa" w:w="3312"/>
+            <w:shd w:fill="EAF0F7"/>
+            <w:vAlign w:val="center"/>
+          </w:tcPr>
+          <w:p>
+            <w:r>
+              <w:t>Critical alert and stop</w:t>
+            </w:r>
+          </w:p>
+        </w:tc>
+      </w:tr>
+    </w:tbl>
+    <w:p/>
+    <w:p>
+      <w:pPr>
+        <w:pStyle w:val="Heading1"/>
+      </w:pPr>
+      <w:r>
+        <w:t>18 Fault Regression and Coverage</w:t>
+      </w:r>
+    </w:p>
+    <w:tbl>
+      <w:tblPr>
+        <w:tblStyle w:val="TableGrid"/>
+        <w:tblW w:type="auto" w:w="0"/>
+        <w:tblLook w:firstColumn="1" w:firstRow="1" w:lastColumn="0" w:lastRow="0" w:noHBand="0" w:noVBand="1" w:val="04A0"/>
+      </w:tblPr>
+      <w:tblGrid>
+        <w:gridCol w:w="3312"/>
+        <w:gridCol w:w="3312"/>
+        <w:gridCol w:w="3312"/>
+      </w:tblGrid>
+      <w:tr>
+        <w:trPr>
+          <w:tblHeader/>
+        </w:trPr>
+        <w:tc>
+          <w:tcPr>
+            <w:tcW w:type="dxa" w:w="2016"/>
+            <w:shd w:fill="17365D"/>
+            <w:vAlign w:val="center"/>
+          </w:tcPr>
+          <w:p>
+            <w:r>
+              <w:rPr>
+                <w:b/>
+                <w:color w:val="FFFFFF"/>
+              </w:rPr>
+              <w:t>Mechanism</w:t>
+            </w:r>
+          </w:p>
+        </w:tc>
+        <w:tc>
+          <w:tcPr>
+            <w:tcW w:type="dxa" w:w="4320"/>
+            <w:shd w:fill="17365D"/>
+            <w:vAlign w:val="center"/>
+          </w:tcPr>
+          <w:p>
+            <w:r>
+              <w:rPr>
+                <w:b/>
+                <w:color w:val="FFFFFF"/>
+              </w:rPr>
+              <w:t>Engineering control</w:t>
+            </w:r>
+          </w:p>
+        </w:tc>
+        <w:tc>
+          <w:tcPr>
+            <w:tcW w:type="dxa" w:w="3240"/>
+            <w:shd w:fill="17365D"/>
+            <w:vAlign w:val="center"/>
+          </w:tcPr>
+          <w:p>
+            <w:r>
+              <w:rPr>
+                <w:b/>
+                <w:color w:val="FFFFFF"/>
+              </w:rPr>
+              <w:t>Purpose</w:t>
+            </w:r>
+          </w:p>
+        </w:tc>
+      </w:tr>
+      <w:tr>
+        <w:tc>
+          <w:tcPr>
+            <w:tcW w:type="dxa" w:w="2016"/>
+            <w:vAlign w:val="center"/>
+          </w:tcPr>
+          <w:p>
+            <w:r>
+              <w:t>Fault injection</w:t>
+            </w:r>
+          </w:p>
+        </w:tc>
+        <w:tc>
+          <w:tcPr>
+            <w:tcW w:type="dxa" w:w="4320"/>
+            <w:vAlign w:val="center"/>
+          </w:tcPr>
+          <w:p>
+            <w:r>
+              <w:t>Drop or misclassify up to twenty unique predictions</w:t>
+            </w:r>
+          </w:p>
+        </w:tc>
+        <w:tc>
+          <w:tcPr>
+            <w:tcW w:type="dxa" w:w="3240"/>
+            <w:vAlign w:val="center"/>
+          </w:tcPr>
+          <w:p>
+            <w:r>
+              <w:t>Exercise degraded perception safely</w:t>
+            </w:r>
+          </w:p>
+        </w:tc>
+      </w:tr>
+      <w:tr>
+        <w:tc>
+          <w:tcPr>
+            <w:tcW w:type="dxa" w:w="2016"/>
+            <w:shd w:fill="EAF0F7"/>
+            <w:vAlign w:val="center"/>
+          </w:tcPr>
+          <w:p>
+            <w:r>
+              <w:t>Assertions</w:t>
+            </w:r>
+          </w:p>
+        </w:tc>
+        <w:tc>
+          <w:tcPr>
+            <w:tcW w:type="dxa" w:w="4320"/>
+            <w:shd w:fill="EAF0F7"/>
+            <w:vAlign w:val="center"/>
+          </w:tcPr>
+          <w:p>
+            <w:r>
+              <w:t>Expected maneuver, required alerts, and minimum F1</w:t>
+            </w:r>
+          </w:p>
+        </w:tc>
+        <w:tc>
+          <w:tcPr>
+            <w:tcW w:type="dxa" w:w="3240"/>
+            <w:shd w:fill="EAF0F7"/>
+            <w:vAlign w:val="center"/>
+          </w:tcPr>
+          <w:p>
+            <w:r>
+              <w:t>Produce explicit pass or fail evidence</w:t>
+            </w:r>
+          </w:p>
+        </w:tc>
+      </w:tr>
+      <w:tr>
+        <w:tc>
+          <w:tcPr>
+            <w:tcW w:type="dxa" w:w="2016"/>
+            <w:vAlign w:val="center"/>
+          </w:tcPr>
+          <w:p>
+            <w:r>
+              <w:t>Coverage</w:t>
+            </w:r>
+          </w:p>
+        </w:tc>
+        <w:tc>
+          <w:tcPr>
+            <w:tcW w:type="dxa" w:w="4320"/>
+            <w:vAlign w:val="center"/>
+          </w:tcPr>
+          <w:p>
+            <w:r>
+              <w:t>Scenario, target, alert, maneuver, fault, and assertion dimensions</w:t>
+            </w:r>
+          </w:p>
+        </w:tc>
+        <w:tc>
+          <w:tcPr>
+            <w:tcW w:type="dxa" w:w="3240"/>
+            <w:vAlign w:val="center"/>
+          </w:tcPr>
+          <w:p>
+            <w:r>
+              <w:t>Show what each execution exercised</w:t>
+            </w:r>
+          </w:p>
+        </w:tc>
+      </w:tr>
+      <w:tr>
+        <w:tc>
+          <w:tcPr>
+            <w:tcW w:type="dxa" w:w="2016"/>
+            <w:shd w:fill="EAF0F7"/>
+            <w:vAlign w:val="center"/>
+          </w:tcPr>
+          <w:p>
+            <w:r>
+              <w:t>Fingerprint</w:t>
+            </w:r>
+          </w:p>
+        </w:tc>
+        <w:tc>
+          <w:tcPr>
+            <w:tcW w:type="dxa" w:w="4320"/>
+            <w:shd w:fill="EAF0F7"/>
+            <w:vAlign w:val="center"/>
+          </w:tcPr>
+          <w:p>
+            <w:r>
+              <w:t>Canonical deterministic SHA-256 evidence</w:t>
+            </w:r>
+          </w:p>
+        </w:tc>
+        <w:tc>
+          <w:tcPr>
+            <w:tcW w:type="dxa" w:w="3240"/>
+            <w:shd w:fill="EAF0F7"/>
+            <w:vAlign w:val="center"/>
+          </w:tcPr>
+          <w:p>
+            <w:r>
+              <w:t>Compare regressions across execution identities</w:t>
+            </w:r>
+          </w:p>
+        </w:tc>
+      </w:tr>
+      <w:tr>
+        <w:tc>
+          <w:tcPr>
+            <w:tcW w:type="dxa" w:w="2016"/>
+            <w:vAlign w:val="center"/>
+          </w:tcPr>
+          <w:p>
+            <w:r>
+              <w:t>Replay</w:t>
+            </w:r>
+          </w:p>
+        </w:tc>
+        <w:tc>
+          <w:tcPr>
+            <w:tcW w:type="dxa" w:w="4320"/>
+            <w:vAlign w:val="center"/>
+          </w:tcPr>
+          <w:p>
+            <w:r>
+              <w:t>Request hash and stable conflict</w:t>
+            </w:r>
+          </w:p>
+        </w:tc>
+        <w:tc>
+          <w:tcPr>
+            <w:tcW w:type="dxa" w:w="3240"/>
+            <w:vAlign w:val="center"/>
+          </w:tcPr>
+          <w:p>
+            <w:r>
+              <w:t>Prevent duplicate or ambiguous evidence</w:t>
+            </w:r>
+          </w:p>
+        </w:tc>
+      </w:tr>
+    </w:tbl>
+    <w:p/>
+    <w:p>
+      <w:pPr>
+        <w:pStyle w:val="Heading1"/>
+      </w:pPr>
+      <w:r>
+        <w:t>19 VII 6 Verification Addendum</w:t>
+      </w:r>
+    </w:p>
+    <w:tbl>
+      <w:tblPr>
+        <w:tblStyle w:val="TableGrid"/>
+        <w:tblW w:type="auto" w:w="0"/>
+        <w:tblLook w:firstColumn="1" w:firstRow="1" w:lastColumn="0" w:lastRow="0" w:noHBand="0" w:noVBand="1" w:val="04A0"/>
+      </w:tblPr>
+      <w:tblGrid>
+        <w:gridCol w:w="3312"/>
+        <w:gridCol w:w="3312"/>
+        <w:gridCol w:w="3312"/>
+      </w:tblGrid>
+      <w:tr>
+        <w:trPr>
+          <w:tblHeader/>
+        </w:trPr>
+        <w:tc>
+          <w:tcPr>
+            <w:tcW w:type="dxa" w:w="2232"/>
+            <w:shd w:fill="17365D"/>
+            <w:vAlign w:val="center"/>
+          </w:tcPr>
+          <w:p>
+            <w:r>
+              <w:rPr>
+                <w:b/>
+                <w:color w:val="FFFFFF"/>
+              </w:rPr>
+              <w:t>ID range</w:t>
+            </w:r>
+          </w:p>
+        </w:tc>
+        <w:tc>
+          <w:tcPr>
+            <w:tcW w:type="dxa" w:w="3672"/>
+            <w:shd w:fill="17365D"/>
+            <w:vAlign w:val="center"/>
+          </w:tcPr>
+          <w:p>
+            <w:r>
+              <w:rPr>
+                <w:b/>
+                <w:color w:val="FFFFFF"/>
+              </w:rPr>
+              <w:t>Coverage</w:t>
+            </w:r>
+          </w:p>
+        </w:tc>
+        <w:tc>
+          <w:tcPr>
+            <w:tcW w:type="dxa" w:w="3960"/>
+            <w:shd w:fill="17365D"/>
+            <w:vAlign w:val="center"/>
+          </w:tcPr>
+          <w:p>
+            <w:r>
+              <w:rPr>
+                <w:b/>
+                <w:color w:val="FFFFFF"/>
+              </w:rPr>
+              <w:t>Objective</w:t>
+            </w:r>
+          </w:p>
+        </w:tc>
+      </w:tr>
+      <w:tr>
+        <w:tc>
+          <w:tcPr>
+            <w:tcW w:type="dxa" w:w="2232"/>
+            <w:vAlign w:val="center"/>
+          </w:tcPr>
+          <w:p>
+            <w:r>
+              <w:t>ADAS-T-056 to 060</w:t>
+            </w:r>
+          </w:p>
+        </w:tc>
+        <w:tc>
+          <w:tcPr>
+            <w:tcW w:type="dxa" w:w="3672"/>
+            <w:vAlign w:val="center"/>
+          </w:tcPr>
+          <w:p>
+            <w:r>
+              <w:t>Contracts and faults</w:t>
+            </w:r>
+          </w:p>
+        </w:tc>
+        <w:tc>
+          <w:tcPr>
+            <w:tcW w:type="dxa" w:w="3960"/>
+            <w:vAlign w:val="center"/>
+          </w:tcPr>
+          <w:p>
+            <w:r>
+              <w:t>Validate bounded fault behavior</w:t>
+            </w:r>
+          </w:p>
+        </w:tc>
+      </w:tr>
+      <w:tr>
+        <w:tc>
+          <w:tcPr>
+            <w:tcW w:type="dxa" w:w="2232"/>
+            <w:shd w:fill="EAF0F7"/>
+            <w:vAlign w:val="center"/>
+          </w:tcPr>
+          <w:p>
+            <w:r>
+              <w:t>ADAS-T-061 to 064</w:t>
+            </w:r>
+          </w:p>
+        </w:tc>
+        <w:tc>
+          <w:tcPr>
+            <w:tcW w:type="dxa" w:w="3672"/>
+            <w:shd w:fill="EAF0F7"/>
+            <w:vAlign w:val="center"/>
+          </w:tcPr>
+          <w:p>
+            <w:r>
+              <w:t>Evidence and replay</w:t>
+            </w:r>
+          </w:p>
+        </w:tc>
+        <w:tc>
+          <w:tcPr>
+            <w:tcW w:type="dxa" w:w="3960"/>
+            <w:shd w:fill="EAF0F7"/>
+            <w:vAlign w:val="center"/>
+          </w:tcPr>
+          <w:p>
+            <w:r>
+              <w:t>Validate results and determinism</w:t>
+            </w:r>
+          </w:p>
+        </w:tc>
+      </w:tr>
+      <w:tr>
+        <w:tc>
+          <w:tcPr>
+            <w:tcW w:type="dxa" w:w="2232"/>
+            <w:vAlign w:val="center"/>
+          </w:tcPr>
+          <w:p>
+            <w:r>
+              <w:t>ADAS-T-065 to 068</w:t>
+            </w:r>
+          </w:p>
+        </w:tc>
+        <w:tc>
+          <w:tcPr>
+            <w:tcW w:type="dxa" w:w="3672"/>
+            <w:vAlign w:val="center"/>
+          </w:tcPr>
+          <w:p>
+            <w:r>
+              <w:t>API and persistence</w:t>
+            </w:r>
+          </w:p>
+        </w:tc>
+        <w:tc>
+          <w:tcPr>
+            <w:tcW w:type="dxa" w:w="3960"/>
+            <w:vAlign w:val="center"/>
+          </w:tcPr>
+          <w:p>
+            <w:r>
+              <w:t>Validate access and traceability</w:t>
+            </w:r>
+          </w:p>
+        </w:tc>
+      </w:tr>
+    </w:tbl>
+    <w:p/>
+    <w:p>
+      <w:pPr>
+        <w:pStyle w:val="Heading1"/>
+      </w:pPr>
+      <w:r>
+        <w:t>20 Next Development</w:t>
+      </w:r>
+    </w:p>
+    <w:p>
+      <w:r>
+        <w:t>VII-7 will connect ADAS scenario evidence to ATEP test runs, Vehicle Gateway, CarSystemUI presentation, and real-time dashboard streams.</w:t>
+      </w:r>
+    </w:p>
+    <w:p>
+      <w:pPr>
+        <w:pStyle w:val="Heading1"/>
+      </w:pPr>
+      <w:r>
+        <w:t>21 Study Exercises</w:t>
       </w:r>
     </w:p>
     <w:p>
@@ -3963,14 +4637,6 @@
       </w:pPr>
       <w:r>
         <w:t>Repeat an advance with a stale revision and explain the stable conflict.</w:t>
-      </w:r>
-    </w:p>
-    <w:p>
-      <w:pPr>
-        <w:pStyle w:val="ListBullet"/>
-      </w:pPr>
-      <w:r>
-        <w:t>Design a radar miss while preserving the scene truth.</w:t>
       </w:r>
     </w:p>
     <w:p>
@@ -3987,6 +4653,14 @@
       </w:pPr>
       <w:r>
         <w:t>Compare braking decisions at TTC values above and below the emergency threshold.</w:t>
+      </w:r>
+    </w:p>
+    <w:p>
+      <w:pPr>
+        <w:pStyle w:val="ListBullet"/>
+      </w:pPr>
+      <w:r>
+        <w:t>Drop the lead-vehicle prediction, compare fingerprints, and explain why these scenarios are not official certification evidence.</w:t>
       </w:r>
     </w:p>
     <w:sectPr>

</xml_diff>

<commit_message>
feat(adas): add deterministic test scenarios (#89)
</commit_message>
<xml_diff>
--- a/docs/ATEP_Volume_VII_ADAS_Engineering_Workbook.docx
+++ b/docs/ATEP_Volume_VII_ADAS_Engineering_Workbook.docx
@@ -19,7 +19,7 @@
         <w:rPr>
           <w:b/>
         </w:rPr>
-        <w:t>Version 0.5.0   VII 1 through VII 5 Implemented</w:t>
+        <w:t>Version 0.6.0   VII 1 through VII 6 Implemented</w:t>
       </w:r>
     </w:p>
     <w:p>
@@ -93,7 +93,7 @@
           </w:tcPr>
           <w:p>
             <w:r>
-              <w:t>VII-1 through VII-5 implemented and verified</w:t>
+              <w:t>VII-1 through VII-6 implemented and verified</w:t>
             </w:r>
           </w:p>
         </w:tc>
@@ -169,7 +169,7 @@
           </w:tcPr>
           <w:p>
             <w:r>
-              <w:t>VII-6 ADAS test scenarios</w:t>
+              <w:t>VII-7 cross-platform integration</w:t>
             </w:r>
           </w:p>
         </w:tc>
@@ -210,7 +210,15 @@
         <w:pStyle w:val="ListBullet"/>
       </w:pPr>
       <w:r>
-        <w:t>Deferred: weather, traffic controls, sensor physics, perception, planning, and alerts.</w:t>
+        <w:t>Delivered next: environment, sensors, perception, planning, alerts, and scenarios.</w:t>
+      </w:r>
+    </w:p>
+    <w:p>
+      <w:pPr>
+        <w:pStyle w:val="ListBullet"/>
+      </w:pPr>
+      <w:r>
+        <w:t>Deferred: cross-platform test-run, Vehicle Gateway, CarSystemUI, and dashboard links.</w:t>
       </w:r>
     </w:p>
     <w:p>
@@ -1739,7 +1747,7 @@
         <w:pStyle w:val="ListBullet"/>
       </w:pPr>
       <w:r>
-        <w:t>Migrations 0044 through 0048 form one linear ADAS migration history.</w:t>
+        <w:t>Migrations 0044 through 0049 form one linear ADAS migration history.</w:t>
       </w:r>
     </w:p>
     <w:p>
@@ -3936,17 +3944,8 @@
     </w:tbl>
     <w:p/>
     <w:p>
-      <w:pPr>
-        <w:pStyle w:val="Heading1"/>
-      </w:pPr>
       <w:r>
-        <w:t>17 Next Development</w:t>
-      </w:r>
-    </w:p>
-    <w:p/>
-    <w:p>
-      <w:r>
-        <w:t>VII-6 will add NCAP-inspired ADAS scenarios, controlled fault injection, regression evidence, and coverage measurement using the verified simulation pipeline.</w:t>
+        <w:br w:type="page"/>
       </w:r>
     </w:p>
     <w:p>
@@ -3954,7 +3953,682 @@
         <w:pStyle w:val="Heading1"/>
       </w:pPr>
       <w:r>
-        <w:t>18 Study Exercises</w:t>
+        <w:t>17 ADAS Test Scenarios</w:t>
+      </w:r>
+    </w:p>
+    <w:p>
+      <w:r>
+        <w:t>VII-6 executes bounded, repeatable engineering scenarios over an immutable scene and persisted perception result. The catalogue is inspired by common consumer safety assessment concerns but does not claim official NCAP certification or homologation.</w:t>
+      </w:r>
+    </w:p>
+    <w:tbl>
+      <w:tblPr>
+        <w:tblStyle w:val="TableGrid"/>
+        <w:tblW w:type="auto" w:w="0"/>
+        <w:tblLook w:firstColumn="1" w:firstRow="1" w:lastColumn="0" w:lastRow="0" w:noHBand="0" w:noVBand="1" w:val="04A0"/>
+      </w:tblPr>
+      <w:tblGrid>
+        <w:gridCol w:w="3312"/>
+        <w:gridCol w:w="3312"/>
+        <w:gridCol w:w="3312"/>
+      </w:tblGrid>
+      <w:tr>
+        <w:trPr>
+          <w:tblHeader/>
+        </w:trPr>
+        <w:tc>
+          <w:tcPr>
+            <w:tcW w:type="dxa" w:w="2232"/>
+            <w:shd w:fill="17365D"/>
+            <w:vAlign w:val="center"/>
+          </w:tcPr>
+          <w:p>
+            <w:r>
+              <w:rPr>
+                <w:b/>
+                <w:color w:val="FFFFFF"/>
+              </w:rPr>
+              <w:t>Scenario family</w:t>
+            </w:r>
+          </w:p>
+        </w:tc>
+        <w:tc>
+          <w:tcPr>
+            <w:tcW w:type="dxa" w:w="4032"/>
+            <w:shd w:fill="17365D"/>
+            <w:vAlign w:val="center"/>
+          </w:tcPr>
+          <w:p>
+            <w:r>
+              <w:rPr>
+                <w:b/>
+                <w:color w:val="FFFFFF"/>
+              </w:rPr>
+              <w:t>Primary behavior</w:t>
+            </w:r>
+          </w:p>
+        </w:tc>
+        <w:tc>
+          <w:tcPr>
+            <w:tcW w:type="dxa" w:w="3312"/>
+            <w:shd w:fill="17365D"/>
+            <w:vAlign w:val="center"/>
+          </w:tcPr>
+          <w:p>
+            <w:r>
+              <w:rPr>
+                <w:b/>
+                <w:color w:val="FFFFFF"/>
+              </w:rPr>
+              <w:t>Evidence</w:t>
+            </w:r>
+          </w:p>
+        </w:tc>
+      </w:tr>
+      <w:tr>
+        <w:tc>
+          <w:tcPr>
+            <w:tcW w:type="dxa" w:w="2232"/>
+            <w:vAlign w:val="center"/>
+          </w:tcPr>
+          <w:p>
+            <w:r>
+              <w:t>Car to car AEB</w:t>
+            </w:r>
+          </w:p>
+        </w:tc>
+        <w:tc>
+          <w:tcPr>
+            <w:tcW w:type="dxa" w:w="4032"/>
+            <w:vAlign w:val="center"/>
+          </w:tcPr>
+          <w:p>
+            <w:r>
+              <w:t>Lead vehicle collision response</w:t>
+            </w:r>
+          </w:p>
+        </w:tc>
+        <w:tc>
+          <w:tcPr>
+            <w:tcW w:type="dxa" w:w="3312"/>
+            <w:vAlign w:val="center"/>
+          </w:tcPr>
+          <w:p>
+            <w:r>
+              <w:t>TTC alert and braking</w:t>
+            </w:r>
+          </w:p>
+        </w:tc>
+      </w:tr>
+      <w:tr>
+        <w:tc>
+          <w:tcPr>
+            <w:tcW w:type="dxa" w:w="2232"/>
+            <w:shd w:fill="EAF0F7"/>
+            <w:vAlign w:val="center"/>
+          </w:tcPr>
+          <w:p>
+            <w:r>
+              <w:t>Pedestrian AEB</w:t>
+            </w:r>
+          </w:p>
+        </w:tc>
+        <w:tc>
+          <w:tcPr>
+            <w:tcW w:type="dxa" w:w="4032"/>
+            <w:shd w:fill="EAF0F7"/>
+            <w:vAlign w:val="center"/>
+          </w:tcPr>
+          <w:p>
+            <w:r>
+              <w:t>Pedestrian collision response</w:t>
+            </w:r>
+          </w:p>
+        </w:tc>
+        <w:tc>
+          <w:tcPr>
+            <w:tcW w:type="dxa" w:w="3312"/>
+            <w:shd w:fill="EAF0F7"/>
+            <w:vAlign w:val="center"/>
+          </w:tcPr>
+          <w:p>
+            <w:r>
+              <w:t>Detection and maneuver</w:t>
+            </w:r>
+          </w:p>
+        </w:tc>
+      </w:tr>
+      <w:tr>
+        <w:tc>
+          <w:tcPr>
+            <w:tcW w:type="dxa" w:w="2232"/>
+            <w:vAlign w:val="center"/>
+          </w:tcPr>
+          <w:p>
+            <w:r>
+              <w:t>Lane support</w:t>
+            </w:r>
+          </w:p>
+        </w:tc>
+        <w:tc>
+          <w:tcPr>
+            <w:tcW w:type="dxa" w:w="4032"/>
+            <w:vAlign w:val="center"/>
+          </w:tcPr>
+          <w:p>
+            <w:r>
+              <w:t>Lane envelope recovery</w:t>
+            </w:r>
+          </w:p>
+        </w:tc>
+        <w:tc>
+          <w:tcPr>
+            <w:tcW w:type="dxa" w:w="3312"/>
+            <w:vAlign w:val="center"/>
+          </w:tcPr>
+          <w:p>
+            <w:r>
+              <w:t>Departure alert and centering</w:t>
+            </w:r>
+          </w:p>
+        </w:tc>
+      </w:tr>
+      <w:tr>
+        <w:tc>
+          <w:tcPr>
+            <w:tcW w:type="dxa" w:w="2232"/>
+            <w:shd w:fill="EAF0F7"/>
+            <w:vAlign w:val="center"/>
+          </w:tcPr>
+          <w:p>
+            <w:r>
+              <w:t>Traffic signal</w:t>
+            </w:r>
+          </w:p>
+        </w:tc>
+        <w:tc>
+          <w:tcPr>
+            <w:tcW w:type="dxa" w:w="4032"/>
+            <w:shd w:fill="EAF0F7"/>
+            <w:vAlign w:val="center"/>
+          </w:tcPr>
+          <w:p>
+            <w:r>
+              <w:t>Red signal compliance</w:t>
+            </w:r>
+          </w:p>
+        </w:tc>
+        <w:tc>
+          <w:tcPr>
+            <w:tcW w:type="dxa" w:w="3312"/>
+            <w:shd w:fill="EAF0F7"/>
+            <w:vAlign w:val="center"/>
+          </w:tcPr>
+          <w:p>
+            <w:r>
+              <w:t>Critical alert and stop</w:t>
+            </w:r>
+          </w:p>
+        </w:tc>
+      </w:tr>
+    </w:tbl>
+    <w:p/>
+    <w:p>
+      <w:pPr>
+        <w:pStyle w:val="Heading1"/>
+      </w:pPr>
+      <w:r>
+        <w:t>18 Fault Regression and Coverage</w:t>
+      </w:r>
+    </w:p>
+    <w:tbl>
+      <w:tblPr>
+        <w:tblStyle w:val="TableGrid"/>
+        <w:tblW w:type="auto" w:w="0"/>
+        <w:tblLook w:firstColumn="1" w:firstRow="1" w:lastColumn="0" w:lastRow="0" w:noHBand="0" w:noVBand="1" w:val="04A0"/>
+      </w:tblPr>
+      <w:tblGrid>
+        <w:gridCol w:w="3312"/>
+        <w:gridCol w:w="3312"/>
+        <w:gridCol w:w="3312"/>
+      </w:tblGrid>
+      <w:tr>
+        <w:trPr>
+          <w:tblHeader/>
+        </w:trPr>
+        <w:tc>
+          <w:tcPr>
+            <w:tcW w:type="dxa" w:w="2016"/>
+            <w:shd w:fill="17365D"/>
+            <w:vAlign w:val="center"/>
+          </w:tcPr>
+          <w:p>
+            <w:r>
+              <w:rPr>
+                <w:b/>
+                <w:color w:val="FFFFFF"/>
+              </w:rPr>
+              <w:t>Mechanism</w:t>
+            </w:r>
+          </w:p>
+        </w:tc>
+        <w:tc>
+          <w:tcPr>
+            <w:tcW w:type="dxa" w:w="4320"/>
+            <w:shd w:fill="17365D"/>
+            <w:vAlign w:val="center"/>
+          </w:tcPr>
+          <w:p>
+            <w:r>
+              <w:rPr>
+                <w:b/>
+                <w:color w:val="FFFFFF"/>
+              </w:rPr>
+              <w:t>Engineering control</w:t>
+            </w:r>
+          </w:p>
+        </w:tc>
+        <w:tc>
+          <w:tcPr>
+            <w:tcW w:type="dxa" w:w="3240"/>
+            <w:shd w:fill="17365D"/>
+            <w:vAlign w:val="center"/>
+          </w:tcPr>
+          <w:p>
+            <w:r>
+              <w:rPr>
+                <w:b/>
+                <w:color w:val="FFFFFF"/>
+              </w:rPr>
+              <w:t>Purpose</w:t>
+            </w:r>
+          </w:p>
+        </w:tc>
+      </w:tr>
+      <w:tr>
+        <w:tc>
+          <w:tcPr>
+            <w:tcW w:type="dxa" w:w="2016"/>
+            <w:vAlign w:val="center"/>
+          </w:tcPr>
+          <w:p>
+            <w:r>
+              <w:t>Fault injection</w:t>
+            </w:r>
+          </w:p>
+        </w:tc>
+        <w:tc>
+          <w:tcPr>
+            <w:tcW w:type="dxa" w:w="4320"/>
+            <w:vAlign w:val="center"/>
+          </w:tcPr>
+          <w:p>
+            <w:r>
+              <w:t>Drop or misclassify up to twenty unique predictions</w:t>
+            </w:r>
+          </w:p>
+        </w:tc>
+        <w:tc>
+          <w:tcPr>
+            <w:tcW w:type="dxa" w:w="3240"/>
+            <w:vAlign w:val="center"/>
+          </w:tcPr>
+          <w:p>
+            <w:r>
+              <w:t>Exercise degraded perception safely</w:t>
+            </w:r>
+          </w:p>
+        </w:tc>
+      </w:tr>
+      <w:tr>
+        <w:tc>
+          <w:tcPr>
+            <w:tcW w:type="dxa" w:w="2016"/>
+            <w:shd w:fill="EAF0F7"/>
+            <w:vAlign w:val="center"/>
+          </w:tcPr>
+          <w:p>
+            <w:r>
+              <w:t>Assertions</w:t>
+            </w:r>
+          </w:p>
+        </w:tc>
+        <w:tc>
+          <w:tcPr>
+            <w:tcW w:type="dxa" w:w="4320"/>
+            <w:shd w:fill="EAF0F7"/>
+            <w:vAlign w:val="center"/>
+          </w:tcPr>
+          <w:p>
+            <w:r>
+              <w:t>Expected maneuver, required alerts, and minimum F1</w:t>
+            </w:r>
+          </w:p>
+        </w:tc>
+        <w:tc>
+          <w:tcPr>
+            <w:tcW w:type="dxa" w:w="3240"/>
+            <w:shd w:fill="EAF0F7"/>
+            <w:vAlign w:val="center"/>
+          </w:tcPr>
+          <w:p>
+            <w:r>
+              <w:t>Produce explicit pass or fail evidence</w:t>
+            </w:r>
+          </w:p>
+        </w:tc>
+      </w:tr>
+      <w:tr>
+        <w:tc>
+          <w:tcPr>
+            <w:tcW w:type="dxa" w:w="2016"/>
+            <w:vAlign w:val="center"/>
+          </w:tcPr>
+          <w:p>
+            <w:r>
+              <w:t>Coverage</w:t>
+            </w:r>
+          </w:p>
+        </w:tc>
+        <w:tc>
+          <w:tcPr>
+            <w:tcW w:type="dxa" w:w="4320"/>
+            <w:vAlign w:val="center"/>
+          </w:tcPr>
+          <w:p>
+            <w:r>
+              <w:t>Scenario, target, alert, maneuver, fault, and assertion dimensions</w:t>
+            </w:r>
+          </w:p>
+        </w:tc>
+        <w:tc>
+          <w:tcPr>
+            <w:tcW w:type="dxa" w:w="3240"/>
+            <w:vAlign w:val="center"/>
+          </w:tcPr>
+          <w:p>
+            <w:r>
+              <w:t>Show what each execution exercised</w:t>
+            </w:r>
+          </w:p>
+        </w:tc>
+      </w:tr>
+      <w:tr>
+        <w:tc>
+          <w:tcPr>
+            <w:tcW w:type="dxa" w:w="2016"/>
+            <w:shd w:fill="EAF0F7"/>
+            <w:vAlign w:val="center"/>
+          </w:tcPr>
+          <w:p>
+            <w:r>
+              <w:t>Fingerprint</w:t>
+            </w:r>
+          </w:p>
+        </w:tc>
+        <w:tc>
+          <w:tcPr>
+            <w:tcW w:type="dxa" w:w="4320"/>
+            <w:shd w:fill="EAF0F7"/>
+            <w:vAlign w:val="center"/>
+          </w:tcPr>
+          <w:p>
+            <w:r>
+              <w:t>Canonical deterministic SHA-256 evidence</w:t>
+            </w:r>
+          </w:p>
+        </w:tc>
+        <w:tc>
+          <w:tcPr>
+            <w:tcW w:type="dxa" w:w="3240"/>
+            <w:shd w:fill="EAF0F7"/>
+            <w:vAlign w:val="center"/>
+          </w:tcPr>
+          <w:p>
+            <w:r>
+              <w:t>Compare regressions across execution identities</w:t>
+            </w:r>
+          </w:p>
+        </w:tc>
+      </w:tr>
+      <w:tr>
+        <w:tc>
+          <w:tcPr>
+            <w:tcW w:type="dxa" w:w="2016"/>
+            <w:vAlign w:val="center"/>
+          </w:tcPr>
+          <w:p>
+            <w:r>
+              <w:t>Replay</w:t>
+            </w:r>
+          </w:p>
+        </w:tc>
+        <w:tc>
+          <w:tcPr>
+            <w:tcW w:type="dxa" w:w="4320"/>
+            <w:vAlign w:val="center"/>
+          </w:tcPr>
+          <w:p>
+            <w:r>
+              <w:t>Request hash and stable conflict</w:t>
+            </w:r>
+          </w:p>
+        </w:tc>
+        <w:tc>
+          <w:tcPr>
+            <w:tcW w:type="dxa" w:w="3240"/>
+            <w:vAlign w:val="center"/>
+          </w:tcPr>
+          <w:p>
+            <w:r>
+              <w:t>Prevent duplicate or ambiguous evidence</w:t>
+            </w:r>
+          </w:p>
+        </w:tc>
+      </w:tr>
+    </w:tbl>
+    <w:p/>
+    <w:p>
+      <w:pPr>
+        <w:pStyle w:val="Heading1"/>
+      </w:pPr>
+      <w:r>
+        <w:t>19 VII 6 Verification Addendum</w:t>
+      </w:r>
+    </w:p>
+    <w:tbl>
+      <w:tblPr>
+        <w:tblStyle w:val="TableGrid"/>
+        <w:tblW w:type="auto" w:w="0"/>
+        <w:tblLook w:firstColumn="1" w:firstRow="1" w:lastColumn="0" w:lastRow="0" w:noHBand="0" w:noVBand="1" w:val="04A0"/>
+      </w:tblPr>
+      <w:tblGrid>
+        <w:gridCol w:w="3312"/>
+        <w:gridCol w:w="3312"/>
+        <w:gridCol w:w="3312"/>
+      </w:tblGrid>
+      <w:tr>
+        <w:trPr>
+          <w:tblHeader/>
+        </w:trPr>
+        <w:tc>
+          <w:tcPr>
+            <w:tcW w:type="dxa" w:w="2232"/>
+            <w:shd w:fill="17365D"/>
+            <w:vAlign w:val="center"/>
+          </w:tcPr>
+          <w:p>
+            <w:r>
+              <w:rPr>
+                <w:b/>
+                <w:color w:val="FFFFFF"/>
+              </w:rPr>
+              <w:t>ID range</w:t>
+            </w:r>
+          </w:p>
+        </w:tc>
+        <w:tc>
+          <w:tcPr>
+            <w:tcW w:type="dxa" w:w="3672"/>
+            <w:shd w:fill="17365D"/>
+            <w:vAlign w:val="center"/>
+          </w:tcPr>
+          <w:p>
+            <w:r>
+              <w:rPr>
+                <w:b/>
+                <w:color w:val="FFFFFF"/>
+              </w:rPr>
+              <w:t>Coverage</w:t>
+            </w:r>
+          </w:p>
+        </w:tc>
+        <w:tc>
+          <w:tcPr>
+            <w:tcW w:type="dxa" w:w="3960"/>
+            <w:shd w:fill="17365D"/>
+            <w:vAlign w:val="center"/>
+          </w:tcPr>
+          <w:p>
+            <w:r>
+              <w:rPr>
+                <w:b/>
+                <w:color w:val="FFFFFF"/>
+              </w:rPr>
+              <w:t>Objective</w:t>
+            </w:r>
+          </w:p>
+        </w:tc>
+      </w:tr>
+      <w:tr>
+        <w:tc>
+          <w:tcPr>
+            <w:tcW w:type="dxa" w:w="2232"/>
+            <w:vAlign w:val="center"/>
+          </w:tcPr>
+          <w:p>
+            <w:r>
+              <w:t>ADAS-T-056 to 060</w:t>
+            </w:r>
+          </w:p>
+        </w:tc>
+        <w:tc>
+          <w:tcPr>
+            <w:tcW w:type="dxa" w:w="3672"/>
+            <w:vAlign w:val="center"/>
+          </w:tcPr>
+          <w:p>
+            <w:r>
+              <w:t>Contracts and faults</w:t>
+            </w:r>
+          </w:p>
+        </w:tc>
+        <w:tc>
+          <w:tcPr>
+            <w:tcW w:type="dxa" w:w="3960"/>
+            <w:vAlign w:val="center"/>
+          </w:tcPr>
+          <w:p>
+            <w:r>
+              <w:t>Validate bounded fault behavior</w:t>
+            </w:r>
+          </w:p>
+        </w:tc>
+      </w:tr>
+      <w:tr>
+        <w:tc>
+          <w:tcPr>
+            <w:tcW w:type="dxa" w:w="2232"/>
+            <w:shd w:fill="EAF0F7"/>
+            <w:vAlign w:val="center"/>
+          </w:tcPr>
+          <w:p>
+            <w:r>
+              <w:t>ADAS-T-061 to 064</w:t>
+            </w:r>
+          </w:p>
+        </w:tc>
+        <w:tc>
+          <w:tcPr>
+            <w:tcW w:type="dxa" w:w="3672"/>
+            <w:shd w:fill="EAF0F7"/>
+            <w:vAlign w:val="center"/>
+          </w:tcPr>
+          <w:p>
+            <w:r>
+              <w:t>Evidence and replay</w:t>
+            </w:r>
+          </w:p>
+        </w:tc>
+        <w:tc>
+          <w:tcPr>
+            <w:tcW w:type="dxa" w:w="3960"/>
+            <w:shd w:fill="EAF0F7"/>
+            <w:vAlign w:val="center"/>
+          </w:tcPr>
+          <w:p>
+            <w:r>
+              <w:t>Validate results and determinism</w:t>
+            </w:r>
+          </w:p>
+        </w:tc>
+      </w:tr>
+      <w:tr>
+        <w:tc>
+          <w:tcPr>
+            <w:tcW w:type="dxa" w:w="2232"/>
+            <w:vAlign w:val="center"/>
+          </w:tcPr>
+          <w:p>
+            <w:r>
+              <w:t>ADAS-T-065 to 068</w:t>
+            </w:r>
+          </w:p>
+        </w:tc>
+        <w:tc>
+          <w:tcPr>
+            <w:tcW w:type="dxa" w:w="3672"/>
+            <w:vAlign w:val="center"/>
+          </w:tcPr>
+          <w:p>
+            <w:r>
+              <w:t>API and persistence</w:t>
+            </w:r>
+          </w:p>
+        </w:tc>
+        <w:tc>
+          <w:tcPr>
+            <w:tcW w:type="dxa" w:w="3960"/>
+            <w:vAlign w:val="center"/>
+          </w:tcPr>
+          <w:p>
+            <w:r>
+              <w:t>Validate access and traceability</w:t>
+            </w:r>
+          </w:p>
+        </w:tc>
+      </w:tr>
+    </w:tbl>
+    <w:p/>
+    <w:p>
+      <w:pPr>
+        <w:pStyle w:val="Heading1"/>
+      </w:pPr>
+      <w:r>
+        <w:t>20 Next Development</w:t>
+      </w:r>
+    </w:p>
+    <w:p>
+      <w:r>
+        <w:t>VII-7 will connect ADAS scenario evidence to ATEP test runs, Vehicle Gateway, CarSystemUI presentation, and real-time dashboard streams.</w:t>
+      </w:r>
+    </w:p>
+    <w:p>
+      <w:pPr>
+        <w:pStyle w:val="Heading1"/>
+      </w:pPr>
+      <w:r>
+        <w:t>21 Study Exercises</w:t>
       </w:r>
     </w:p>
     <w:p>
@@ -3963,14 +4637,6 @@
       </w:pPr>
       <w:r>
         <w:t>Repeat an advance with a stale revision and explain the stable conflict.</w:t>
-      </w:r>
-    </w:p>
-    <w:p>
-      <w:pPr>
-        <w:pStyle w:val="ListBullet"/>
-      </w:pPr>
-      <w:r>
-        <w:t>Design a radar miss while preserving the scene truth.</w:t>
       </w:r>
     </w:p>
     <w:p>
@@ -3987,6 +4653,14 @@
       </w:pPr>
       <w:r>
         <w:t>Compare braking decisions at TTC values above and below the emergency threshold.</w:t>
+      </w:r>
+    </w:p>
+    <w:p>
+      <w:pPr>
+        <w:pStyle w:val="ListBullet"/>
+      </w:pPr>
+      <w:r>
+        <w:t>Drop the lead-vehicle prediction, compare fingerprints, and explain why these scenarios are not official certification evidence.</w:t>
       </w:r>
     </w:p>
     <w:sectPr>

</xml_diff>

<commit_message>
feat(adas): correlate cross-platform evidence
</commit_message>
<xml_diff>
--- a/docs/ATEP_Volume_VII_ADAS_Engineering_Workbook.docx
+++ b/docs/ATEP_Volume_VII_ADAS_Engineering_Workbook.docx
@@ -19,7 +19,7 @@
         <w:rPr>
           <w:b/>
         </w:rPr>
-        <w:t>Version 0.6.0   VII 1 through VII 6 Implemented</w:t>
+        <w:t>Version 0.7.0   Volume VII Baseline Complete</w:t>
       </w:r>
     </w:p>
     <w:p>
@@ -93,7 +93,7 @@
           </w:tcPr>
           <w:p>
             <w:r>
-              <w:t>VII-1 through VII-6 implemented and verified</w:t>
+              <w:t>VII-1 through VII-7 implemented and verified</w:t>
             </w:r>
           </w:p>
         </w:tc>
@@ -169,7 +169,7 @@
           </w:tcPr>
           <w:p>
             <w:r>
-              <w:t>VII-7 cross-platform integration</w:t>
+              <w:t>Volume VIII-1 test definitions and suite composition</w:t>
             </w:r>
           </w:p>
         </w:tc>
@@ -210,7 +210,7 @@
         <w:pStyle w:val="ListBullet"/>
       </w:pPr>
       <w:r>
-        <w:t>Delivered next: environment, sensors, perception, planning, alerts, and scenarios.</w:t>
+        <w:t>Delivered: environment, sensors, perception, planning, alerts, and scenarios.</w:t>
       </w:r>
     </w:p>
     <w:p>
@@ -218,7 +218,7 @@
         <w:pStyle w:val="ListBullet"/>
       </w:pPr>
       <w:r>
-        <w:t>Deferred: cross-platform test-run, Vehicle Gateway, CarSystemUI, and dashboard links.</w:t>
+        <w:t>Delivered: cross-platform test-run, Gateway, CarSystemUI, and dashboard evidence.</w:t>
       </w:r>
     </w:p>
     <w:p>
@@ -1747,7 +1747,7 @@
         <w:pStyle w:val="ListBullet"/>
       </w:pPr>
       <w:r>
-        <w:t>Migrations 0044 through 0049 form one linear ADAS migration history.</w:t>
+        <w:t>Migrations 0044 through 0050 form one linear ADAS migration history.</w:t>
       </w:r>
     </w:p>
     <w:p>
@@ -4611,16 +4611,8 @@
     </w:tbl>
     <w:p/>
     <w:p>
-      <w:pPr>
-        <w:pStyle w:val="Heading1"/>
-      </w:pPr>
       <w:r>
-        <w:t>20 Next Development</w:t>
-      </w:r>
-    </w:p>
-    <w:p>
-      <w:r>
-        <w:t>VII-7 will connect ADAS scenario evidence to ATEP test runs, Vehicle Gateway, CarSystemUI presentation, and real-time dashboard streams.</w:t>
+        <w:br w:type="page"/>
       </w:r>
     </w:p>
     <w:p>
@@ -4628,7 +4620,462 @@
         <w:pStyle w:val="Heading1"/>
       </w:pPr>
       <w:r>
-        <w:t>21 Study Exercises</w:t>
+        <w:t>20 Cross-Platform Evidence</w:t>
+      </w:r>
+    </w:p>
+    <w:p>
+      <w:r>
+        <w:t>VII-7 closes the ADAS baseline by correlating one persisted scenario execution with an ATEP test run, Vehicle Gateway observations and commands, CarSystemUI presentation evidence, and a minimized live dashboard update. Referential checks prevent evidence from crossing vehicle or test-run boundaries.</w:t>
+      </w:r>
+    </w:p>
+    <w:tbl>
+      <w:tblPr>
+        <w:tblStyle w:val="TableGrid"/>
+        <w:tblW w:type="auto" w:w="0"/>
+        <w:tblLook w:firstColumn="1" w:firstRow="1" w:lastColumn="0" w:lastRow="0" w:noHBand="0" w:noVBand="1" w:val="04A0"/>
+      </w:tblPr>
+      <w:tblGrid>
+        <w:gridCol w:w="3312"/>
+        <w:gridCol w:w="3312"/>
+        <w:gridCol w:w="3312"/>
+      </w:tblGrid>
+      <w:tr>
+        <w:trPr>
+          <w:tblHeader/>
+        </w:trPr>
+        <w:tc>
+          <w:tcPr>
+            <w:tcW w:type="dxa" w:w="2088"/>
+            <w:shd w:fill="17365D"/>
+            <w:vAlign w:val="center"/>
+          </w:tcPr>
+          <w:p>
+            <w:r>
+              <w:rPr>
+                <w:b/>
+                <w:color w:val="FFFFFF"/>
+              </w:rPr>
+              <w:t>Boundary</w:t>
+            </w:r>
+          </w:p>
+        </w:tc>
+        <w:tc>
+          <w:tcPr>
+            <w:tcW w:type="dxa" w:w="4464"/>
+            <w:shd w:fill="17365D"/>
+            <w:vAlign w:val="center"/>
+          </w:tcPr>
+          <w:p>
+            <w:r>
+              <w:rPr>
+                <w:b/>
+                <w:color w:val="FFFFFF"/>
+              </w:rPr>
+              <w:t>Engineering control</w:t>
+            </w:r>
+          </w:p>
+        </w:tc>
+        <w:tc>
+          <w:tcPr>
+            <w:tcW w:type="dxa" w:w="3024"/>
+            <w:shd w:fill="17365D"/>
+            <w:vAlign w:val="center"/>
+          </w:tcPr>
+          <w:p>
+            <w:r>
+              <w:rPr>
+                <w:b/>
+                <w:color w:val="FFFFFF"/>
+              </w:rPr>
+              <w:t>Purpose</w:t>
+            </w:r>
+          </w:p>
+        </w:tc>
+      </w:tr>
+      <w:tr>
+        <w:tc>
+          <w:tcPr>
+            <w:tcW w:type="dxa" w:w="2088"/>
+            <w:vAlign w:val="center"/>
+          </w:tcPr>
+          <w:p>
+            <w:r>
+              <w:t>ATEP test run</w:t>
+            </w:r>
+          </w:p>
+        </w:tc>
+        <w:tc>
+          <w:tcPr>
+            <w:tcW w:type="dxa" w:w="4464"/>
+            <w:vAlign w:val="center"/>
+          </w:tcPr>
+          <w:p>
+            <w:r>
+              <w:t>Same vehicle and explicit run identity</w:t>
+            </w:r>
+          </w:p>
+        </w:tc>
+        <w:tc>
+          <w:tcPr>
+            <w:tcW w:type="dxa" w:w="3024"/>
+            <w:vAlign w:val="center"/>
+          </w:tcPr>
+          <w:p>
+            <w:r>
+              <w:t>Own the orchestration context</w:t>
+            </w:r>
+          </w:p>
+        </w:tc>
+      </w:tr>
+      <w:tr>
+        <w:tc>
+          <w:tcPr>
+            <w:tcW w:type="dxa" w:w="2088"/>
+            <w:shd w:fill="EAF0F7"/>
+            <w:vAlign w:val="center"/>
+          </w:tcPr>
+          <w:p>
+            <w:r>
+              <w:t>Gateway telemetry</w:t>
+            </w:r>
+          </w:p>
+        </w:tc>
+        <w:tc>
+          <w:tcPr>
+            <w:tcW w:type="dxa" w:w="4464"/>
+            <w:shd w:fill="EAF0F7"/>
+            <w:vAlign w:val="center"/>
+          </w:tcPr>
+          <w:p>
+            <w:r>
+              <w:t>Existing event IDs from the same vehicle</w:t>
+            </w:r>
+          </w:p>
+        </w:tc>
+        <w:tc>
+          <w:tcPr>
+            <w:tcW w:type="dxa" w:w="3024"/>
+            <w:shd w:fill="EAF0F7"/>
+            <w:vAlign w:val="center"/>
+          </w:tcPr>
+          <w:p>
+            <w:r>
+              <w:t>Correlate observations</w:t>
+            </w:r>
+          </w:p>
+        </w:tc>
+      </w:tr>
+      <w:tr>
+        <w:tc>
+          <w:tcPr>
+            <w:tcW w:type="dxa" w:w="2088"/>
+            <w:vAlign w:val="center"/>
+          </w:tcPr>
+          <w:p>
+            <w:r>
+              <w:t>Gateway commands</w:t>
+            </w:r>
+          </w:p>
+        </w:tc>
+        <w:tc>
+          <w:tcPr>
+            <w:tcW w:type="dxa" w:w="4464"/>
+            <w:vAlign w:val="center"/>
+          </w:tcPr>
+          <w:p>
+            <w:r>
+              <w:t>Existing command IDs from the same vehicle and run</w:t>
+            </w:r>
+          </w:p>
+        </w:tc>
+        <w:tc>
+          <w:tcPr>
+            <w:tcW w:type="dxa" w:w="3024"/>
+            <w:vAlign w:val="center"/>
+          </w:tcPr>
+          <w:p>
+            <w:r>
+              <w:t>Correlate actuation</w:t>
+            </w:r>
+          </w:p>
+        </w:tc>
+      </w:tr>
+      <w:tr>
+        <w:tc>
+          <w:tcPr>
+            <w:tcW w:type="dxa" w:w="2088"/>
+            <w:shd w:fill="EAF0F7"/>
+            <w:vAlign w:val="center"/>
+          </w:tcPr>
+          <w:p>
+            <w:r>
+              <w:t>CarSystemUI</w:t>
+            </w:r>
+          </w:p>
+        </w:tc>
+        <w:tc>
+          <w:tcPr>
+            <w:tcW w:type="dxa" w:w="4464"/>
+            <w:shd w:fill="EAF0F7"/>
+            <w:vAlign w:val="center"/>
+          </w:tcPr>
+          <w:p>
+            <w:r>
+              <w:t>Surface, connection, status, version, and timestamp</w:t>
+            </w:r>
+          </w:p>
+        </w:tc>
+        <w:tc>
+          <w:tcPr>
+            <w:tcW w:type="dxa" w:w="3024"/>
+            <w:shd w:fill="EAF0F7"/>
+            <w:vAlign w:val="center"/>
+          </w:tcPr>
+          <w:p>
+            <w:r>
+              <w:t>Capture cockpit evidence</w:t>
+            </w:r>
+          </w:p>
+        </w:tc>
+      </w:tr>
+      <w:tr>
+        <w:tc>
+          <w:tcPr>
+            <w:tcW w:type="dxa" w:w="2088"/>
+            <w:vAlign w:val="center"/>
+          </w:tcPr>
+          <w:p>
+            <w:r>
+              <w:t>Dashboard stream</w:t>
+            </w:r>
+          </w:p>
+        </w:tc>
+        <w:tc>
+          <w:tcPr>
+            <w:tcW w:type="dxa" w:w="4464"/>
+            <w:vAlign w:val="center"/>
+          </w:tcPr>
+          <w:p>
+            <w:r>
+              <w:t>Minimized summary published only after commit</w:t>
+            </w:r>
+          </w:p>
+        </w:tc>
+        <w:tc>
+          <w:tcPr>
+            <w:tcW w:type="dxa" w:w="3024"/>
+            <w:vAlign w:val="center"/>
+          </w:tcPr>
+          <w:p>
+            <w:r>
+              <w:t>Provide safe live feedback</w:t>
+            </w:r>
+          </w:p>
+        </w:tc>
+      </w:tr>
+    </w:tbl>
+    <w:p/>
+    <w:p>
+      <w:pPr>
+        <w:pStyle w:val="Heading1"/>
+      </w:pPr>
+      <w:r>
+        <w:t>21 VII 7 Verification Addendum</w:t>
+      </w:r>
+    </w:p>
+    <w:tbl>
+      <w:tblPr>
+        <w:tblStyle w:val="TableGrid"/>
+        <w:tblW w:type="auto" w:w="0"/>
+        <w:tblLook w:firstColumn="1" w:firstRow="1" w:lastColumn="0" w:lastRow="0" w:noHBand="0" w:noVBand="1" w:val="04A0"/>
+      </w:tblPr>
+      <w:tblGrid>
+        <w:gridCol w:w="3312"/>
+        <w:gridCol w:w="3312"/>
+        <w:gridCol w:w="3312"/>
+      </w:tblGrid>
+      <w:tr>
+        <w:trPr>
+          <w:tblHeader/>
+        </w:trPr>
+        <w:tc>
+          <w:tcPr>
+            <w:tcW w:type="dxa" w:w="2232"/>
+            <w:shd w:fill="17365D"/>
+            <w:vAlign w:val="center"/>
+          </w:tcPr>
+          <w:p>
+            <w:r>
+              <w:rPr>
+                <w:b/>
+                <w:color w:val="FFFFFF"/>
+              </w:rPr>
+              <w:t>ID range</w:t>
+            </w:r>
+          </w:p>
+        </w:tc>
+        <w:tc>
+          <w:tcPr>
+            <w:tcW w:type="dxa" w:w="3672"/>
+            <w:shd w:fill="17365D"/>
+            <w:vAlign w:val="center"/>
+          </w:tcPr>
+          <w:p>
+            <w:r>
+              <w:rPr>
+                <w:b/>
+                <w:color w:val="FFFFFF"/>
+              </w:rPr>
+              <w:t>Coverage</w:t>
+            </w:r>
+          </w:p>
+        </w:tc>
+        <w:tc>
+          <w:tcPr>
+            <w:tcW w:type="dxa" w:w="3960"/>
+            <w:shd w:fill="17365D"/>
+            <w:vAlign w:val="center"/>
+          </w:tcPr>
+          <w:p>
+            <w:r>
+              <w:rPr>
+                <w:b/>
+                <w:color w:val="FFFFFF"/>
+              </w:rPr>
+              <w:t>Objective</w:t>
+            </w:r>
+          </w:p>
+        </w:tc>
+      </w:tr>
+      <w:tr>
+        <w:tc>
+          <w:tcPr>
+            <w:tcW w:type="dxa" w:w="2232"/>
+            <w:vAlign w:val="center"/>
+          </w:tcPr>
+          <w:p>
+            <w:r>
+              <w:t>ADAS-T-069 to 074</w:t>
+            </w:r>
+          </w:p>
+        </w:tc>
+        <w:tc>
+          <w:tcPr>
+            <w:tcW w:type="dxa" w:w="3672"/>
+            <w:vAlign w:val="center"/>
+          </w:tcPr>
+          <w:p>
+            <w:r>
+              <w:t>Contracts and correlation</w:t>
+            </w:r>
+          </w:p>
+        </w:tc>
+        <w:tc>
+          <w:tcPr>
+            <w:tcW w:type="dxa" w:w="3960"/>
+            <w:vAlign w:val="center"/>
+          </w:tcPr>
+          <w:p>
+            <w:r>
+              <w:t>Validate bounded cross-platform evidence</w:t>
+            </w:r>
+          </w:p>
+        </w:tc>
+      </w:tr>
+      <w:tr>
+        <w:tc>
+          <w:tcPr>
+            <w:tcW w:type="dxa" w:w="2232"/>
+            <w:shd w:fill="EAF0F7"/>
+            <w:vAlign w:val="center"/>
+          </w:tcPr>
+          <w:p>
+            <w:r>
+              <w:t>ADAS-T-075 to 080</w:t>
+            </w:r>
+          </w:p>
+        </w:tc>
+        <w:tc>
+          <w:tcPr>
+            <w:tcW w:type="dxa" w:w="3672"/>
+            <w:shd w:fill="EAF0F7"/>
+            <w:vAlign w:val="center"/>
+          </w:tcPr>
+          <w:p>
+            <w:r>
+              <w:t>Replay, access, and live stream</w:t>
+            </w:r>
+          </w:p>
+        </w:tc>
+        <w:tc>
+          <w:tcPr>
+            <w:tcW w:type="dxa" w:w="3960"/>
+            <w:shd w:fill="EAF0F7"/>
+            <w:vAlign w:val="center"/>
+          </w:tcPr>
+          <w:p>
+            <w:r>
+              <w:t>Validate safety and observability</w:t>
+            </w:r>
+          </w:p>
+        </w:tc>
+      </w:tr>
+      <w:tr>
+        <w:tc>
+          <w:tcPr>
+            <w:tcW w:type="dxa" w:w="2232"/>
+            <w:vAlign w:val="center"/>
+          </w:tcPr>
+          <w:p>
+            <w:r>
+              <w:t>ADAS-T-081</w:t>
+            </w:r>
+          </w:p>
+        </w:tc>
+        <w:tc>
+          <w:tcPr>
+            <w:tcW w:type="dxa" w:w="3672"/>
+            <w:vAlign w:val="center"/>
+          </w:tcPr>
+          <w:p>
+            <w:r>
+              <w:t>Migration</w:t>
+            </w:r>
+          </w:p>
+        </w:tc>
+        <w:tc>
+          <w:tcPr>
+            <w:tcW w:type="dxa" w:w="3960"/>
+            <w:vAlign w:val="center"/>
+          </w:tcPr>
+          <w:p>
+            <w:r>
+              <w:t>Validate the evidence persistence schema</w:t>
+            </w:r>
+          </w:p>
+        </w:tc>
+      </w:tr>
+    </w:tbl>
+    <w:p/>
+    <w:p>
+      <w:pPr>
+        <w:pStyle w:val="Heading1"/>
+      </w:pPr>
+      <w:r>
+        <w:t>22 Baseline Outcome and Next Development</w:t>
+      </w:r>
+    </w:p>
+    <w:p>
+      <w:r>
+        <w:t>Volume VII now provides a complete deterministic ADAS engineering baseline from world truth through cross-platform evidence. The next increment is Volume VIII-1: reusable test definitions, test cases, and suite composition.</w:t>
+      </w:r>
+    </w:p>
+    <w:p>
+      <w:pPr>
+        <w:pStyle w:val="Heading1"/>
+      </w:pPr>
+      <w:r>
+        <w:t>23 Study Exercises</w:t>
       </w:r>
     </w:p>
     <w:p>
@@ -4644,14 +5091,6 @@
         <w:pStyle w:val="ListBullet"/>
       </w:pPr>
       <w:r>
-        <w:t>Submit one duplicate and one misclassified prediction and calculate the F1 score.</w:t>
-      </w:r>
-    </w:p>
-    <w:p>
-      <w:pPr>
-        <w:pStyle w:val="ListBullet"/>
-      </w:pPr>
-      <w:r>
         <w:t>Compare braking decisions at TTC values above and below the emergency threshold.</w:t>
       </w:r>
     </w:p>
@@ -4660,7 +5099,7 @@
         <w:pStyle w:val="ListBullet"/>
       </w:pPr>
       <w:r>
-        <w:t>Drop the lead-vehicle prediction, compare fingerprints, and explain why these scenarios are not official certification evidence.</w:t>
+        <w:t>Correlate one scenario with gateway and CarSystemUI evidence, then explain which referential checks prevent cross-vehicle contamination.</w:t>
       </w:r>
     </w:p>
     <w:sectPr>

</xml_diff>

<commit_message>
feat(adas): correlate cross-platform evidence (#90)
</commit_message>
<xml_diff>
--- a/docs/ATEP_Volume_VII_ADAS_Engineering_Workbook.docx
+++ b/docs/ATEP_Volume_VII_ADAS_Engineering_Workbook.docx
@@ -19,7 +19,7 @@
         <w:rPr>
           <w:b/>
         </w:rPr>
-        <w:t>Version 0.6.0   VII 1 through VII 6 Implemented</w:t>
+        <w:t>Version 0.7.0   Volume VII Baseline Complete</w:t>
       </w:r>
     </w:p>
     <w:p>
@@ -93,7 +93,7 @@
           </w:tcPr>
           <w:p>
             <w:r>
-              <w:t>VII-1 through VII-6 implemented and verified</w:t>
+              <w:t>VII-1 through VII-7 implemented and verified</w:t>
             </w:r>
           </w:p>
         </w:tc>
@@ -169,7 +169,7 @@
           </w:tcPr>
           <w:p>
             <w:r>
-              <w:t>VII-7 cross-platform integration</w:t>
+              <w:t>Volume VIII-1 test definitions and suite composition</w:t>
             </w:r>
           </w:p>
         </w:tc>
@@ -210,7 +210,7 @@
         <w:pStyle w:val="ListBullet"/>
       </w:pPr>
       <w:r>
-        <w:t>Delivered next: environment, sensors, perception, planning, alerts, and scenarios.</w:t>
+        <w:t>Delivered: environment, sensors, perception, planning, alerts, and scenarios.</w:t>
       </w:r>
     </w:p>
     <w:p>
@@ -218,7 +218,7 @@
         <w:pStyle w:val="ListBullet"/>
       </w:pPr>
       <w:r>
-        <w:t>Deferred: cross-platform test-run, Vehicle Gateway, CarSystemUI, and dashboard links.</w:t>
+        <w:t>Delivered: cross-platform test-run, Gateway, CarSystemUI, and dashboard evidence.</w:t>
       </w:r>
     </w:p>
     <w:p>
@@ -1747,7 +1747,7 @@
         <w:pStyle w:val="ListBullet"/>
       </w:pPr>
       <w:r>
-        <w:t>Migrations 0044 through 0049 form one linear ADAS migration history.</w:t>
+        <w:t>Migrations 0044 through 0050 form one linear ADAS migration history.</w:t>
       </w:r>
     </w:p>
     <w:p>
@@ -4611,16 +4611,8 @@
     </w:tbl>
     <w:p/>
     <w:p>
-      <w:pPr>
-        <w:pStyle w:val="Heading1"/>
-      </w:pPr>
       <w:r>
-        <w:t>20 Next Development</w:t>
-      </w:r>
-    </w:p>
-    <w:p>
-      <w:r>
-        <w:t>VII-7 will connect ADAS scenario evidence to ATEP test runs, Vehicle Gateway, CarSystemUI presentation, and real-time dashboard streams.</w:t>
+        <w:br w:type="page"/>
       </w:r>
     </w:p>
     <w:p>
@@ -4628,7 +4620,462 @@
         <w:pStyle w:val="Heading1"/>
       </w:pPr>
       <w:r>
-        <w:t>21 Study Exercises</w:t>
+        <w:t>20 Cross-Platform Evidence</w:t>
+      </w:r>
+    </w:p>
+    <w:p>
+      <w:r>
+        <w:t>VII-7 closes the ADAS baseline by correlating one persisted scenario execution with an ATEP test run, Vehicle Gateway observations and commands, CarSystemUI presentation evidence, and a minimized live dashboard update. Referential checks prevent evidence from crossing vehicle or test-run boundaries.</w:t>
+      </w:r>
+    </w:p>
+    <w:tbl>
+      <w:tblPr>
+        <w:tblStyle w:val="TableGrid"/>
+        <w:tblW w:type="auto" w:w="0"/>
+        <w:tblLook w:firstColumn="1" w:firstRow="1" w:lastColumn="0" w:lastRow="0" w:noHBand="0" w:noVBand="1" w:val="04A0"/>
+      </w:tblPr>
+      <w:tblGrid>
+        <w:gridCol w:w="3312"/>
+        <w:gridCol w:w="3312"/>
+        <w:gridCol w:w="3312"/>
+      </w:tblGrid>
+      <w:tr>
+        <w:trPr>
+          <w:tblHeader/>
+        </w:trPr>
+        <w:tc>
+          <w:tcPr>
+            <w:tcW w:type="dxa" w:w="2088"/>
+            <w:shd w:fill="17365D"/>
+            <w:vAlign w:val="center"/>
+          </w:tcPr>
+          <w:p>
+            <w:r>
+              <w:rPr>
+                <w:b/>
+                <w:color w:val="FFFFFF"/>
+              </w:rPr>
+              <w:t>Boundary</w:t>
+            </w:r>
+          </w:p>
+        </w:tc>
+        <w:tc>
+          <w:tcPr>
+            <w:tcW w:type="dxa" w:w="4464"/>
+            <w:shd w:fill="17365D"/>
+            <w:vAlign w:val="center"/>
+          </w:tcPr>
+          <w:p>
+            <w:r>
+              <w:rPr>
+                <w:b/>
+                <w:color w:val="FFFFFF"/>
+              </w:rPr>
+              <w:t>Engineering control</w:t>
+            </w:r>
+          </w:p>
+        </w:tc>
+        <w:tc>
+          <w:tcPr>
+            <w:tcW w:type="dxa" w:w="3024"/>
+            <w:shd w:fill="17365D"/>
+            <w:vAlign w:val="center"/>
+          </w:tcPr>
+          <w:p>
+            <w:r>
+              <w:rPr>
+                <w:b/>
+                <w:color w:val="FFFFFF"/>
+              </w:rPr>
+              <w:t>Purpose</w:t>
+            </w:r>
+          </w:p>
+        </w:tc>
+      </w:tr>
+      <w:tr>
+        <w:tc>
+          <w:tcPr>
+            <w:tcW w:type="dxa" w:w="2088"/>
+            <w:vAlign w:val="center"/>
+          </w:tcPr>
+          <w:p>
+            <w:r>
+              <w:t>ATEP test run</w:t>
+            </w:r>
+          </w:p>
+        </w:tc>
+        <w:tc>
+          <w:tcPr>
+            <w:tcW w:type="dxa" w:w="4464"/>
+            <w:vAlign w:val="center"/>
+          </w:tcPr>
+          <w:p>
+            <w:r>
+              <w:t>Same vehicle and explicit run identity</w:t>
+            </w:r>
+          </w:p>
+        </w:tc>
+        <w:tc>
+          <w:tcPr>
+            <w:tcW w:type="dxa" w:w="3024"/>
+            <w:vAlign w:val="center"/>
+          </w:tcPr>
+          <w:p>
+            <w:r>
+              <w:t>Own the orchestration context</w:t>
+            </w:r>
+          </w:p>
+        </w:tc>
+      </w:tr>
+      <w:tr>
+        <w:tc>
+          <w:tcPr>
+            <w:tcW w:type="dxa" w:w="2088"/>
+            <w:shd w:fill="EAF0F7"/>
+            <w:vAlign w:val="center"/>
+          </w:tcPr>
+          <w:p>
+            <w:r>
+              <w:t>Gateway telemetry</w:t>
+            </w:r>
+          </w:p>
+        </w:tc>
+        <w:tc>
+          <w:tcPr>
+            <w:tcW w:type="dxa" w:w="4464"/>
+            <w:shd w:fill="EAF0F7"/>
+            <w:vAlign w:val="center"/>
+          </w:tcPr>
+          <w:p>
+            <w:r>
+              <w:t>Existing event IDs from the same vehicle</w:t>
+            </w:r>
+          </w:p>
+        </w:tc>
+        <w:tc>
+          <w:tcPr>
+            <w:tcW w:type="dxa" w:w="3024"/>
+            <w:shd w:fill="EAF0F7"/>
+            <w:vAlign w:val="center"/>
+          </w:tcPr>
+          <w:p>
+            <w:r>
+              <w:t>Correlate observations</w:t>
+            </w:r>
+          </w:p>
+        </w:tc>
+      </w:tr>
+      <w:tr>
+        <w:tc>
+          <w:tcPr>
+            <w:tcW w:type="dxa" w:w="2088"/>
+            <w:vAlign w:val="center"/>
+          </w:tcPr>
+          <w:p>
+            <w:r>
+              <w:t>Gateway commands</w:t>
+            </w:r>
+          </w:p>
+        </w:tc>
+        <w:tc>
+          <w:tcPr>
+            <w:tcW w:type="dxa" w:w="4464"/>
+            <w:vAlign w:val="center"/>
+          </w:tcPr>
+          <w:p>
+            <w:r>
+              <w:t>Existing command IDs from the same vehicle and run</w:t>
+            </w:r>
+          </w:p>
+        </w:tc>
+        <w:tc>
+          <w:tcPr>
+            <w:tcW w:type="dxa" w:w="3024"/>
+            <w:vAlign w:val="center"/>
+          </w:tcPr>
+          <w:p>
+            <w:r>
+              <w:t>Correlate actuation</w:t>
+            </w:r>
+          </w:p>
+        </w:tc>
+      </w:tr>
+      <w:tr>
+        <w:tc>
+          <w:tcPr>
+            <w:tcW w:type="dxa" w:w="2088"/>
+            <w:shd w:fill="EAF0F7"/>
+            <w:vAlign w:val="center"/>
+          </w:tcPr>
+          <w:p>
+            <w:r>
+              <w:t>CarSystemUI</w:t>
+            </w:r>
+          </w:p>
+        </w:tc>
+        <w:tc>
+          <w:tcPr>
+            <w:tcW w:type="dxa" w:w="4464"/>
+            <w:shd w:fill="EAF0F7"/>
+            <w:vAlign w:val="center"/>
+          </w:tcPr>
+          <w:p>
+            <w:r>
+              <w:t>Surface, connection, status, version, and timestamp</w:t>
+            </w:r>
+          </w:p>
+        </w:tc>
+        <w:tc>
+          <w:tcPr>
+            <w:tcW w:type="dxa" w:w="3024"/>
+            <w:shd w:fill="EAF0F7"/>
+            <w:vAlign w:val="center"/>
+          </w:tcPr>
+          <w:p>
+            <w:r>
+              <w:t>Capture cockpit evidence</w:t>
+            </w:r>
+          </w:p>
+        </w:tc>
+      </w:tr>
+      <w:tr>
+        <w:tc>
+          <w:tcPr>
+            <w:tcW w:type="dxa" w:w="2088"/>
+            <w:vAlign w:val="center"/>
+          </w:tcPr>
+          <w:p>
+            <w:r>
+              <w:t>Dashboard stream</w:t>
+            </w:r>
+          </w:p>
+        </w:tc>
+        <w:tc>
+          <w:tcPr>
+            <w:tcW w:type="dxa" w:w="4464"/>
+            <w:vAlign w:val="center"/>
+          </w:tcPr>
+          <w:p>
+            <w:r>
+              <w:t>Minimized summary published only after commit</w:t>
+            </w:r>
+          </w:p>
+        </w:tc>
+        <w:tc>
+          <w:tcPr>
+            <w:tcW w:type="dxa" w:w="3024"/>
+            <w:vAlign w:val="center"/>
+          </w:tcPr>
+          <w:p>
+            <w:r>
+              <w:t>Provide safe live feedback</w:t>
+            </w:r>
+          </w:p>
+        </w:tc>
+      </w:tr>
+    </w:tbl>
+    <w:p/>
+    <w:p>
+      <w:pPr>
+        <w:pStyle w:val="Heading1"/>
+      </w:pPr>
+      <w:r>
+        <w:t>21 VII 7 Verification Addendum</w:t>
+      </w:r>
+    </w:p>
+    <w:tbl>
+      <w:tblPr>
+        <w:tblStyle w:val="TableGrid"/>
+        <w:tblW w:type="auto" w:w="0"/>
+        <w:tblLook w:firstColumn="1" w:firstRow="1" w:lastColumn="0" w:lastRow="0" w:noHBand="0" w:noVBand="1" w:val="04A0"/>
+      </w:tblPr>
+      <w:tblGrid>
+        <w:gridCol w:w="3312"/>
+        <w:gridCol w:w="3312"/>
+        <w:gridCol w:w="3312"/>
+      </w:tblGrid>
+      <w:tr>
+        <w:trPr>
+          <w:tblHeader/>
+        </w:trPr>
+        <w:tc>
+          <w:tcPr>
+            <w:tcW w:type="dxa" w:w="2232"/>
+            <w:shd w:fill="17365D"/>
+            <w:vAlign w:val="center"/>
+          </w:tcPr>
+          <w:p>
+            <w:r>
+              <w:rPr>
+                <w:b/>
+                <w:color w:val="FFFFFF"/>
+              </w:rPr>
+              <w:t>ID range</w:t>
+            </w:r>
+          </w:p>
+        </w:tc>
+        <w:tc>
+          <w:tcPr>
+            <w:tcW w:type="dxa" w:w="3672"/>
+            <w:shd w:fill="17365D"/>
+            <w:vAlign w:val="center"/>
+          </w:tcPr>
+          <w:p>
+            <w:r>
+              <w:rPr>
+                <w:b/>
+                <w:color w:val="FFFFFF"/>
+              </w:rPr>
+              <w:t>Coverage</w:t>
+            </w:r>
+          </w:p>
+        </w:tc>
+        <w:tc>
+          <w:tcPr>
+            <w:tcW w:type="dxa" w:w="3960"/>
+            <w:shd w:fill="17365D"/>
+            <w:vAlign w:val="center"/>
+          </w:tcPr>
+          <w:p>
+            <w:r>
+              <w:rPr>
+                <w:b/>
+                <w:color w:val="FFFFFF"/>
+              </w:rPr>
+              <w:t>Objective</w:t>
+            </w:r>
+          </w:p>
+        </w:tc>
+      </w:tr>
+      <w:tr>
+        <w:tc>
+          <w:tcPr>
+            <w:tcW w:type="dxa" w:w="2232"/>
+            <w:vAlign w:val="center"/>
+          </w:tcPr>
+          <w:p>
+            <w:r>
+              <w:t>ADAS-T-069 to 074</w:t>
+            </w:r>
+          </w:p>
+        </w:tc>
+        <w:tc>
+          <w:tcPr>
+            <w:tcW w:type="dxa" w:w="3672"/>
+            <w:vAlign w:val="center"/>
+          </w:tcPr>
+          <w:p>
+            <w:r>
+              <w:t>Contracts and correlation</w:t>
+            </w:r>
+          </w:p>
+        </w:tc>
+        <w:tc>
+          <w:tcPr>
+            <w:tcW w:type="dxa" w:w="3960"/>
+            <w:vAlign w:val="center"/>
+          </w:tcPr>
+          <w:p>
+            <w:r>
+              <w:t>Validate bounded cross-platform evidence</w:t>
+            </w:r>
+          </w:p>
+        </w:tc>
+      </w:tr>
+      <w:tr>
+        <w:tc>
+          <w:tcPr>
+            <w:tcW w:type="dxa" w:w="2232"/>
+            <w:shd w:fill="EAF0F7"/>
+            <w:vAlign w:val="center"/>
+          </w:tcPr>
+          <w:p>
+            <w:r>
+              <w:t>ADAS-T-075 to 080</w:t>
+            </w:r>
+          </w:p>
+        </w:tc>
+        <w:tc>
+          <w:tcPr>
+            <w:tcW w:type="dxa" w:w="3672"/>
+            <w:shd w:fill="EAF0F7"/>
+            <w:vAlign w:val="center"/>
+          </w:tcPr>
+          <w:p>
+            <w:r>
+              <w:t>Replay, access, and live stream</w:t>
+            </w:r>
+          </w:p>
+        </w:tc>
+        <w:tc>
+          <w:tcPr>
+            <w:tcW w:type="dxa" w:w="3960"/>
+            <w:shd w:fill="EAF0F7"/>
+            <w:vAlign w:val="center"/>
+          </w:tcPr>
+          <w:p>
+            <w:r>
+              <w:t>Validate safety and observability</w:t>
+            </w:r>
+          </w:p>
+        </w:tc>
+      </w:tr>
+      <w:tr>
+        <w:tc>
+          <w:tcPr>
+            <w:tcW w:type="dxa" w:w="2232"/>
+            <w:vAlign w:val="center"/>
+          </w:tcPr>
+          <w:p>
+            <w:r>
+              <w:t>ADAS-T-081</w:t>
+            </w:r>
+          </w:p>
+        </w:tc>
+        <w:tc>
+          <w:tcPr>
+            <w:tcW w:type="dxa" w:w="3672"/>
+            <w:vAlign w:val="center"/>
+          </w:tcPr>
+          <w:p>
+            <w:r>
+              <w:t>Migration</w:t>
+            </w:r>
+          </w:p>
+        </w:tc>
+        <w:tc>
+          <w:tcPr>
+            <w:tcW w:type="dxa" w:w="3960"/>
+            <w:vAlign w:val="center"/>
+          </w:tcPr>
+          <w:p>
+            <w:r>
+              <w:t>Validate the evidence persistence schema</w:t>
+            </w:r>
+          </w:p>
+        </w:tc>
+      </w:tr>
+    </w:tbl>
+    <w:p/>
+    <w:p>
+      <w:pPr>
+        <w:pStyle w:val="Heading1"/>
+      </w:pPr>
+      <w:r>
+        <w:t>22 Baseline Outcome and Next Development</w:t>
+      </w:r>
+    </w:p>
+    <w:p>
+      <w:r>
+        <w:t>Volume VII now provides a complete deterministic ADAS engineering baseline from world truth through cross-platform evidence. The next increment is Volume VIII-1: reusable test definitions, test cases, and suite composition.</w:t>
+      </w:r>
+    </w:p>
+    <w:p>
+      <w:pPr>
+        <w:pStyle w:val="Heading1"/>
+      </w:pPr>
+      <w:r>
+        <w:t>23 Study Exercises</w:t>
       </w:r>
     </w:p>
     <w:p>
@@ -4644,14 +5091,6 @@
         <w:pStyle w:val="ListBullet"/>
       </w:pPr>
       <w:r>
-        <w:t>Submit one duplicate and one misclassified prediction and calculate the F1 score.</w:t>
-      </w:r>
-    </w:p>
-    <w:p>
-      <w:pPr>
-        <w:pStyle w:val="ListBullet"/>
-      </w:pPr>
-      <w:r>
         <w:t>Compare braking decisions at TTC values above and below the emergency threshold.</w:t>
       </w:r>
     </w:p>
@@ -4660,7 +5099,7 @@
         <w:pStyle w:val="ListBullet"/>
       </w:pPr>
       <w:r>
-        <w:t>Drop the lead-vehicle prediction, compare fingerprints, and explain why these scenarios are not official certification evidence.</w:t>
+        <w:t>Correlate one scenario with gateway and CarSystemUI evidence, then explain which referential checks prevent cross-vehicle contamination.</w:t>
       </w:r>
     </w:p>
     <w:sectPr>

</xml_diff>